<commit_message>
Make non-coder workshop fully offline
</commit_message>
<xml_diff>
--- a/guides/Attendee Guide - 10 min talk 50 min handson.docx
+++ b/guides/Attendee Guide - 10 min talk 50 min handson.docx
@@ -2,7 +2,7 @@
 <file path=word/document.xml><?xml version="1.0" encoding="utf-8"?>
 <w:document xmlns:w="http://schemas.openxmlformats.org/wordprocessingml/2006/main" xmlns:m="http://schemas.openxmlformats.org/officeDocument/2006/math" xmlns:r="http://schemas.openxmlformats.org/officeDocument/2006/relationships" xmlns:o="urn:schemas-microsoft-com:office:office" xmlns:v="urn:schemas-microsoft-com:vml" xmlns:w10="urn:schemas-microsoft-com:office:word" xmlns:a="http://schemas.openxmlformats.org/drawingml/2006/main" xmlns:pic="http://schemas.openxmlformats.org/drawingml/2006/picture" xmlns:wp="http://schemas.openxmlformats.org/drawingml/2006/wordprocessingDrawing">
   <w:body>
-    <w:bookmarkStart w:id="20" w:name="github-copilot-for-non-coders"/>
+    <w:bookmarkStart w:id="26" w:name="github-copilot-for-non-coders"/>
     <w:p>
       <w:pPr>
         <w:pStyle w:val="Heading1"/>
@@ -11,13 +11,13 @@
         <w:t xml:space="preserve">GitHub Copilot for Non-Coders</w:t>
       </w:r>
     </w:p>
-    <w:bookmarkStart w:id="9" w:name="X0fddb632cd678308ce1c0a5f2b4479770fd58a6"/>
+    <w:bookmarkStart w:id="9" w:name="X60b4453f91226ad123f63dfb77b442365920e08"/>
     <w:p>
       <w:pPr>
         <w:pStyle w:val="Heading2"/>
       </w:pPr>
       <w:r>
-        <w:t xml:space="preserve">Attendee Guide — 10-minute intro + 50-minute hands-on</w:t>
+        <w:t xml:space="preserve">Shared facilitator and attendee guide - 10-minute intro + 50-minute follow-along</w:t>
       </w:r>
     </w:p>
     <w:p>
@@ -25,65 +25,65 @@
         <w:pStyle w:val="FirstParagraph"/>
       </w:pPr>
       <w:r>
-        <w:t xml:space="preserve">Your quick reference for the hands-on. Find your track, run the loop, keep the</w:t>
-      </w:r>
-      <w:r>
-        <w:t xml:space="preserve"> </w:t>
-      </w:r>
-      <w:r>
-        <w:t xml:space="preserve">result honest — and tear it down when you’re done. You describe the outcome in</w:t>
-      </w:r>
-      <w:r>
-        <w:t xml:space="preserve"> </w:t>
-      </w:r>
-      <w:r>
-        <w:t xml:space="preserve">plain English; Copilot drafts it, runs it, and deploys it;</w:t>
-      </w:r>
-      <w:r>
-        <w:t xml:space="preserve"> </w:t>
-      </w:r>
-      <w:r>
-        <w:rPr>
-          <w:b/>
-          <w:bCs/>
-        </w:rPr>
-        <w:t xml:space="preserve">you stay in control</w:t>
-      </w:r>
-      <w:r>
-        <w:rPr>
-          <w:b/>
-          <w:bCs/>
-        </w:rPr>
-        <w:t xml:space="preserve"> </w:t>
-      </w:r>
-      <w:r>
-        <w:rPr>
-          <w:b/>
-          <w:bCs/>
-        </w:rPr>
-        <w:t xml:space="preserve">and approve each step.</w:t>
-      </w:r>
-      <w:r>
-        <w:t xml:space="preserve"> </w:t>
-      </w:r>
-      <w:r>
-        <w:t xml:space="preserve">You never copy-paste PowerShell or Python — it’s all a</w:t>
-      </w:r>
-      <w:r>
-        <w:t xml:space="preserve"> </w:t>
-      </w:r>
-      <w:r>
-        <w:t xml:space="preserve">conversation.</w:t>
+        <w:t xml:space="preserve">The facilitator and attendees use this same guide. During the hands-on, the</w:t>
+      </w:r>
+      <w:r>
+        <w:t xml:space="preserve"> </w:t>
+      </w:r>
+      <w:r>
+        <w:t xml:space="preserve">facilitator performs each prompt while attendees enter the same prompt and wait</w:t>
+      </w:r>
+      <w:r>
+        <w:t xml:space="preserve"> </w:t>
+      </w:r>
+      <w:r>
+        <w:t xml:space="preserve">at each checkpoint. No Azure subscription, cloud deployment, upload, cost, or</w:t>
+      </w:r>
+      <w:r>
+        <w:t xml:space="preserve"> </w:t>
+      </w:r>
+      <w:r>
+        <w:t xml:space="preserve">teardown is part of this workshop.</w:t>
       </w:r>
     </w:p>
     <w:bookmarkEnd w:id="9"/>
-    <w:bookmarkStart w:id="10" w:name="the-loop-every-track-every-time"/>
+    <w:bookmarkStart w:id="10" w:name="outcome"/>
     <w:p>
       <w:pPr>
         <w:pStyle w:val="Heading2"/>
       </w:pPr>
       <w:r>
-        <w:t xml:space="preserve">The loop — every track, every time</w:t>
+        <w:t xml:space="preserve">Outcome</w:t>
+      </w:r>
+    </w:p>
+    <w:p>
+      <w:pPr>
+        <w:pStyle w:val="FirstParagraph"/>
+      </w:pPr>
+      <w:r>
+        <w:t xml:space="preserve">Together, the group turns three messy CSV exports into a clean dataset, answers</w:t>
+      </w:r>
+      <w:r>
+        <w:t xml:space="preserve"> </w:t>
+      </w:r>
+      <w:r>
+        <w:t xml:space="preserve">business questions, validates the numbers, and creates a local handoff package.</w:t>
+      </w:r>
+      <w:r>
+        <w:t xml:space="preserve"> </w:t>
+      </w:r>
+      <w:r>
+        <w:t xml:space="preserve">No coding experience is required.</w:t>
+      </w:r>
+    </w:p>
+    <w:bookmarkEnd w:id="10"/>
+    <w:bookmarkStart w:id="12" w:name="before-the-session"/>
+    <w:p>
+      <w:pPr>
+        <w:pStyle w:val="Heading2"/>
+      </w:pPr>
+      <w:r>
+        <w:t xml:space="preserve">Before the session</w:t>
       </w:r>
     </w:p>
     <w:p>
@@ -95,17 +95,7 @@
         </w:numPr>
       </w:pPr>
       <w:r>
-        <w:rPr>
-          <w:b/>
-          <w:bCs/>
-        </w:rPr>
-        <w:t xml:space="preserve">Prompt:</w:t>
-      </w:r>
-      <w:r>
-        <w:t xml:space="preserve"> </w:t>
-      </w:r>
-      <w:r>
-        <w:t xml:space="preserve">describe the result you want in plain English.</w:t>
+        <w:t xml:space="preserve">Confirm every participant has a GitHub account with Copilot access.</w:t>
       </w:r>
     </w:p>
     <w:p>
@@ -117,17 +107,7 @@
         </w:numPr>
       </w:pPr>
       <w:r>
-        <w:rPr>
-          <w:b/>
-          <w:bCs/>
-        </w:rPr>
-        <w:t xml:space="preserve">Suggestion:</w:t>
-      </w:r>
-      <w:r>
-        <w:t xml:space="preserve"> </w:t>
-      </w:r>
-      <w:r>
-        <w:t xml:space="preserve">read what Copilot proposes.</w:t>
+        <w:t xml:space="preserve">Use GitHub Codespaces, or the GitHub Copilot app with Git and Python 3.</w:t>
       </w:r>
     </w:p>
     <w:p>
@@ -139,17 +119,21 @@
         </w:numPr>
       </w:pPr>
       <w:r>
-        <w:rPr>
-          <w:b/>
-          <w:bCs/>
-        </w:rPr>
-        <w:t xml:space="preserve">Run:</w:t>
-      </w:r>
-      <w:r>
-        <w:t xml:space="preserve"> </w:t>
-      </w:r>
-      <w:r>
-        <w:t xml:space="preserve">Copilot runs it — you approve each step (preview infrastructure first).</w:t>
+        <w:t xml:space="preserve">Open</w:t>
+      </w:r>
+      <w:r>
+        <w:t xml:space="preserve"> </w:t>
+      </w:r>
+      <w:hyperlink r:id="rId11">
+        <w:r>
+          <w:rPr>
+            <w:rStyle w:val="Hyperlink"/>
+          </w:rPr>
+          <w:t xml:space="preserve">https://github.com/marinfrankovic/copilot-workshop-samples</w:t>
+        </w:r>
+      </w:hyperlink>
+      <w:r>
+        <w:t xml:space="preserve">.</w:t>
       </w:r>
     </w:p>
     <w:p>
@@ -161,17 +145,22 @@
         </w:numPr>
       </w:pPr>
       <w:r>
-        <w:rPr>
-          <w:b/>
-          <w:bCs/>
-        </w:rPr>
-        <w:t xml:space="preserve">Refine:</w:t>
-      </w:r>
-      <w:r>
-        <w:t xml:space="preserve"> </w:t>
-      </w:r>
-      <w:r>
-        <w:t xml:space="preserve">ask for one fix or improvement at a time.</w:t>
+        <w:t xml:space="preserve">Open</w:t>
+      </w:r>
+      <w:r>
+        <w:t xml:space="preserve"> </w:t>
+      </w:r>
+      <w:r>
+        <w:rPr>
+          <w:rStyle w:val="VerbatimChar"/>
+        </w:rPr>
+        <w:t xml:space="preserve">labs/data-engineer/LAB.md</w:t>
+      </w:r>
+      <w:r>
+        <w:t xml:space="preserve"> </w:t>
+      </w:r>
+      <w:r>
+        <w:t xml:space="preserve">but do not begin until the facilitator does.</w:t>
       </w:r>
     </w:p>
     <w:p>
@@ -183,27 +172,29 @@
         </w:numPr>
       </w:pPr>
       <w:r>
-        <w:rPr>
-          <w:b/>
-          <w:bCs/>
-        </w:rPr>
-        <w:t xml:space="preserve">Sanity-check:</w:t>
-      </w:r>
-      <w:r>
-        <w:t xml:space="preserve"> </w:t>
-      </w:r>
-      <w:r>
-        <w:t xml:space="preserve">verify the output — counts, totals, security, cost.</w:t>
-      </w:r>
-    </w:p>
-    <w:bookmarkEnd w:id="10"/>
-    <w:bookmarkStart w:id="11" w:name="pick-your-track"/>
+        <w:t xml:space="preserve">The facilitator should open the same repository and use a clean workspace.</w:t>
+      </w:r>
+    </w:p>
+    <w:p>
+      <w:pPr>
+        <w:pStyle w:val="Compact"/>
+        <w:numPr>
+          <w:ilvl w:val="0"/>
+          <w:numId w:val="1001"/>
+        </w:numPr>
+      </w:pPr>
+      <w:r>
+        <w:t xml:space="preserve">Do not use real customer data, secrets, or confidential information.</w:t>
+      </w:r>
+    </w:p>
+    <w:bookmarkEnd w:id="12"/>
+    <w:bookmarkStart w:id="13" w:name="run-of-show"/>
     <w:p>
       <w:pPr>
         <w:pStyle w:val="Heading2"/>
       </w:pPr>
       <w:r>
-        <w:t xml:space="preserve">Pick your track</w:t>
+        <w:t xml:space="preserve">Run of show</w:t>
       </w:r>
     </w:p>
     <w:tbl>
@@ -228,7 +219,7 @@
               <w:pStyle w:val="Compact"/>
             </w:pPr>
             <w:r>
-              <w:t xml:space="preserve">Persona</w:t>
+              <w:t xml:space="preserve">Time</w:t>
             </w:r>
           </w:p>
         </w:tc>
@@ -239,7 +230,7 @@
               <w:pStyle w:val="Compact"/>
             </w:pPr>
             <w:r>
-              <w:t xml:space="preserve">What you’ll do in 50 minutes</w:t>
+              <w:t xml:space="preserve">Shared activity</w:t>
             </w:r>
           </w:p>
         </w:tc>
@@ -252,11 +243,7 @@
               <w:pStyle w:val="Compact"/>
             </w:pPr>
             <w:r>
-              <w:rPr>
-                <w:b/>
-                <w:bCs/>
-              </w:rPr>
-              <w:t xml:space="preserve">Systems Engineer</w:t>
+              <w:t xml:space="preserve">0-10</w:t>
             </w:r>
           </w:p>
         </w:tc>
@@ -267,7 +254,7 @@
               <w:pStyle w:val="Compact"/>
             </w:pPr>
             <w:r>
-              <w:t xml:space="preserve">Turn a plain-English brief into Bicep, then deploy a real Azure environment — a resource group with a network, an NSG, a Linux VM, and private storage — fix a failure, and tear it down.</w:t>
+              <w:t xml:space="preserve">Facilitator gives the existing short introduction. Attendees open the repository and lab.</w:t>
             </w:r>
           </w:p>
         </w:tc>
@@ -280,11 +267,7 @@
               <w:pStyle w:val="Compact"/>
             </w:pPr>
             <w:r>
-              <w:rPr>
-                <w:b/>
-                <w:bCs/>
-              </w:rPr>
-              <w:t xml:space="preserve">Data Engineer</w:t>
+              <w:t xml:space="preserve">10-17</w:t>
             </w:r>
           </w:p>
         </w:tc>
@@ -295,20 +278,140 @@
               <w:pStyle w:val="Compact"/>
             </w:pPr>
             <w:r>
-              <w:t xml:space="preserve">Clean and merge three messy CSV exports into one queryable table, run live SQL, then ship the clean file to an Azure storage account — and tear it down.</w:t>
+              <w:t xml:space="preserve">Everyone inspects the three source files with the same prompt.</w:t>
+            </w:r>
+          </w:p>
+        </w:tc>
+      </w:tr>
+      <w:tr>
+        <w:tc>
+          <w:tcPr/>
+          <w:p>
+            <w:pPr>
+              <w:pStyle w:val="Compact"/>
+            </w:pPr>
+            <w:r>
+              <w:t xml:space="preserve">17-27</w:t>
+            </w:r>
+          </w:p>
+        </w:tc>
+        <w:tc>
+          <w:tcPr/>
+          <w:p>
+            <w:pPr>
+              <w:pStyle w:val="Compact"/>
+            </w:pPr>
+            <w:r>
+              <w:t xml:space="preserve">Everyone creates and runs the cleaning script.</w:t>
+            </w:r>
+          </w:p>
+        </w:tc>
+      </w:tr>
+      <w:tr>
+        <w:tc>
+          <w:tcPr/>
+          <w:p>
+            <w:pPr>
+              <w:pStyle w:val="Compact"/>
+            </w:pPr>
+            <w:r>
+              <w:t xml:space="preserve">27-37</w:t>
+            </w:r>
+          </w:p>
+        </w:tc>
+        <w:tc>
+          <w:tcPr/>
+          <w:p>
+            <w:pPr>
+              <w:pStyle w:val="Compact"/>
+            </w:pPr>
+            <w:r>
+              <w:t xml:space="preserve">Everyone runs the business analysis.</w:t>
+            </w:r>
+          </w:p>
+        </w:tc>
+      </w:tr>
+      <w:tr>
+        <w:tc>
+          <w:tcPr/>
+          <w:p>
+            <w:pPr>
+              <w:pStyle w:val="Compact"/>
+            </w:pPr>
+            <w:r>
+              <w:t xml:space="preserve">37-47</w:t>
+            </w:r>
+          </w:p>
+        </w:tc>
+        <w:tc>
+          <w:tcPr/>
+          <w:p>
+            <w:pPr>
+              <w:pStyle w:val="Compact"/>
+            </w:pPr>
+            <w:r>
+              <w:t xml:space="preserve">Everyone validates row counts, totals, dates, duplicates, and missing values.</w:t>
+            </w:r>
+          </w:p>
+        </w:tc>
+      </w:tr>
+      <w:tr>
+        <w:tc>
+          <w:tcPr/>
+          <w:p>
+            <w:pPr>
+              <w:pStyle w:val="Compact"/>
+            </w:pPr>
+            <w:r>
+              <w:t xml:space="preserve">47-54</w:t>
+            </w:r>
+          </w:p>
+        </w:tc>
+        <w:tc>
+          <w:tcPr/>
+          <w:p>
+            <w:pPr>
+              <w:pStyle w:val="Compact"/>
+            </w:pPr>
+            <w:r>
+              <w:t xml:space="preserve">Everyone improves the manager handoff with evidence-based findings.</w:t>
+            </w:r>
+          </w:p>
+        </w:tc>
+      </w:tr>
+      <w:tr>
+        <w:tc>
+          <w:tcPr/>
+          <w:p>
+            <w:pPr>
+              <w:pStyle w:val="Compact"/>
+            </w:pPr>
+            <w:r>
+              <w:t xml:space="preserve">54-60</w:t>
+            </w:r>
+          </w:p>
+        </w:tc>
+        <w:tc>
+          <w:tcPr/>
+          <w:p>
+            <w:pPr>
+              <w:pStyle w:val="Compact"/>
+            </w:pPr>
+            <w:r>
+              <w:t xml:space="preserve">Everyone creates and inspects the local handoff package.</w:t>
             </w:r>
           </w:p>
         </w:tc>
       </w:tr>
     </w:tbl>
-    <w:bookmarkEnd w:id="11"/>
-    <w:bookmarkStart w:id="15" w:name="X472c8fee53d62935a2d373be852b4a78756a66c"/>
+    <w:bookmarkEnd w:id="13"/>
+    <w:bookmarkStart w:id="14" w:name="the-loop"/>
     <w:p>
       <w:pPr>
         <w:pStyle w:val="Heading2"/>
       </w:pPr>
       <w:r>
-        <w:t xml:space="preserve">Get set up — your facilitator picks the way</w:t>
+        <w:t xml:space="preserve">The loop</w:t>
       </w:r>
     </w:p>
     <w:p>
@@ -316,111 +419,7 @@
         <w:pStyle w:val="FirstParagraph"/>
       </w:pPr>
       <w:r>
-        <w:t xml:space="preserve">Everything you need is provided. Your facilitator gives you</w:t>
-      </w:r>
-      <w:r>
-        <w:t xml:space="preserve"> </w:t>
-      </w:r>
-      <w:r>
-        <w:rPr>
-          <w:b/>
-          <w:bCs/>
-        </w:rPr>
-        <w:t xml:space="preserve">GitHub Copilot</w:t>
-      </w:r>
-      <w:r>
-        <w:rPr>
-          <w:b/>
-          <w:bCs/>
-        </w:rPr>
-        <w:t xml:space="preserve"> </w:t>
-      </w:r>
-      <w:r>
-        <w:rPr>
-          <w:b/>
-          <w:bCs/>
-        </w:rPr>
-        <w:t xml:space="preserve">access</w:t>
-      </w:r>
-      <w:r>
-        <w:t xml:space="preserve"> </w:t>
-      </w:r>
-      <w:r>
-        <w:t xml:space="preserve">(if you don’t already have it) and an</w:t>
-      </w:r>
-      <w:r>
-        <w:t xml:space="preserve"> </w:t>
-      </w:r>
-      <w:r>
-        <w:rPr>
-          <w:b/>
-          <w:bCs/>
-        </w:rPr>
-        <w:t xml:space="preserve">Azure subscription</w:t>
-      </w:r>
-      <w:r>
-        <w:t xml:space="preserve"> </w:t>
-      </w:r>
-      <w:r>
-        <w:t xml:space="preserve">— they</w:t>
-      </w:r>
-      <w:r>
-        <w:t xml:space="preserve"> </w:t>
-      </w:r>
-      <w:r>
-        <w:t xml:space="preserve">invite you with</w:t>
-      </w:r>
-      <w:r>
-        <w:t xml:space="preserve"> </w:t>
-      </w:r>
-      <w:r>
-        <w:rPr>
-          <w:b/>
-          <w:bCs/>
-        </w:rPr>
-        <w:t xml:space="preserve">Contributor</w:t>
-      </w:r>
-      <w:r>
-        <w:t xml:space="preserve"> </w:t>
-      </w:r>
-      <w:r>
-        <w:t xml:space="preserve">access and give you a</w:t>
-      </w:r>
-      <w:r>
-        <w:t xml:space="preserve"> </w:t>
-      </w:r>
-      <w:r>
-        <w:rPr>
-          <w:b/>
-          <w:bCs/>
-        </w:rPr>
-        <w:t xml:space="preserve">subscription ID</w:t>
-      </w:r>
-      <w:r>
-        <w:t xml:space="preserve">. Accept</w:t>
-      </w:r>
-      <w:r>
-        <w:t xml:space="preserve"> </w:t>
-      </w:r>
-      <w:r>
-        <w:t xml:space="preserve">the email invite before you start.</w:t>
-      </w:r>
-    </w:p>
-    <w:p>
-      <w:pPr>
-        <w:pStyle w:val="BodyText"/>
-      </w:pPr>
-      <w:r>
-        <w:rPr/>
-      </w:r>
-    </w:p>
-    <w:bookmarkStart w:id="12" w:name="X1a852f919a097a5e08252d6fe40c4f02b9accc1"/>
-    <w:p>
-      <w:pPr>
-        <w:pStyle w:val="Heading3"/>
-      </w:pPr>
-      <w:r>
-        <w:t xml:space="preserve">Option A — GitHub Codespaces (nothing to install)</w:t>
+        <w:t xml:space="preserve">Repeat this rhythm for every step:</w:t>
       </w:r>
     </w:p>
     <w:p>
@@ -432,28 +431,17 @@
         </w:numPr>
       </w:pPr>
       <w:r>
-        <w:t xml:space="preserve">Go to</w:t>
-      </w:r>
-      <w:r>
-        <w:t xml:space="preserve"> </w:t>
-      </w:r>
-      <w:r>
-        <w:rPr>
-          <w:rStyle w:val="VerbatimChar"/>
-        </w:rPr>
-        <w:t xml:space="preserve">github.com/marinfrankovic/copilot-workshop-samples</w:t>
-      </w:r>
-      <w:r>
-        <w:t xml:space="preserve"> </w:t>
-      </w:r>
-      <w:r>
-        <w:t xml:space="preserve">and sign in with the</w:t>
-      </w:r>
-      <w:r>
-        <w:t xml:space="preserve"> </w:t>
-      </w:r>
-      <w:r>
-        <w:t xml:space="preserve">GitHub account your facilitator gave Copilot access to.</w:t>
+        <w:rPr>
+          <w:b/>
+          <w:bCs/>
+        </w:rPr>
+        <w:t xml:space="preserve">Prompt:</w:t>
+      </w:r>
+      <w:r>
+        <w:t xml:space="preserve"> </w:t>
+      </w:r>
+      <w:r>
+        <w:t xml:space="preserve">enter the quoted prompt in Copilot.</w:t>
       </w:r>
     </w:p>
     <w:p>
@@ -465,8 +453,17 @@
         </w:numPr>
       </w:pPr>
       <w:r>
-        <w:rPr/>
-        <w:t>Click Code ▸ Codespaces ▸ Create codespace on main. A full editor opens in your browser — the tools (Copilot CLI, Azure CLI, Bicep, and Python) are already installed.</w:t>
+        <w:rPr>
+          <w:b/>
+          <w:bCs/>
+        </w:rPr>
+        <w:t xml:space="preserve">Suggestion:</w:t>
+      </w:r>
+      <w:r>
+        <w:t xml:space="preserve"> </w:t>
+      </w:r>
+      <w:r>
+        <w:t xml:space="preserve">read what Copilot proposes.</w:t>
       </w:r>
     </w:p>
     <w:p>
@@ -478,53 +475,220 @@
         </w:numPr>
       </w:pPr>
       <w:r>
-        <w:rPr/>
-        <w:t>Open Terminal &gt; New Terminal and run `copilot`. Trust the workshop folder when asked. If prompted, enter `/login` and complete the GitHub sign-in flow.</w:t>
-      </w:r>
-    </w:p>
-    <w:bookmarkEnd w:id="12"/>
-    <w:bookmarkStart w:id="13" w:name="option-b-github-copilot-app-desktop"/>
-    <w:bookmarkEnd w:id="13"/>
-    <w:bookmarkStart w:id="14" w:name="sign-into-azure-just-ask-copilot"/>
+        <w:rPr>
+          <w:b/>
+          <w:bCs/>
+        </w:rPr>
+        <w:t xml:space="preserve">Run:</w:t>
+      </w:r>
+      <w:r>
+        <w:t xml:space="preserve"> </w:t>
+      </w:r>
+      <w:r>
+        <w:t xml:space="preserve">approve only actions you understand.</w:t>
+      </w:r>
+    </w:p>
+    <w:p>
+      <w:pPr>
+        <w:pStyle w:val="Compact"/>
+        <w:numPr>
+          <w:ilvl w:val="0"/>
+          <w:numId w:val="1002"/>
+        </w:numPr>
+      </w:pPr>
+      <w:r>
+        <w:rPr>
+          <w:b/>
+          <w:bCs/>
+        </w:rPr>
+        <w:t xml:space="preserve">Refine:</w:t>
+      </w:r>
+      <w:r>
+        <w:t xml:space="preserve"> </w:t>
+      </w:r>
+      <w:r>
+        <w:t xml:space="preserve">ask for one change at a time.</w:t>
+      </w:r>
+    </w:p>
+    <w:p>
+      <w:pPr>
+        <w:pStyle w:val="Compact"/>
+        <w:numPr>
+          <w:ilvl w:val="0"/>
+          <w:numId w:val="1002"/>
+        </w:numPr>
+      </w:pPr>
+      <w:r>
+        <w:rPr>
+          <w:b/>
+          <w:bCs/>
+        </w:rPr>
+        <w:t xml:space="preserve">Sanity-check:</w:t>
+      </w:r>
+      <w:r>
+        <w:t xml:space="preserve"> </w:t>
+      </w:r>
+      <w:r>
+        <w:t xml:space="preserve">verify the files and numbers.</w:t>
+      </w:r>
+    </w:p>
+    <w:p>
+      <w:pPr>
+        <w:pStyle w:val="FirstParagraph"/>
+      </w:pPr>
+      <w:r>
+        <w:t xml:space="preserve">The facilitator reads each prompt aloud, enters it, and pauses. Attendees enter</w:t>
+      </w:r>
+      <w:r>
+        <w:t xml:space="preserve"> </w:t>
+      </w:r>
+      <w:r>
+        <w:t xml:space="preserve">the same prompt and do not move ahead until the facilitator reaches the checkpoint.</w:t>
+      </w:r>
+    </w:p>
+    <w:bookmarkEnd w:id="14"/>
+    <w:bookmarkStart w:id="17" w:name="setup-checkpoint"/>
+    <w:p>
+      <w:pPr>
+        <w:pStyle w:val="Heading2"/>
+      </w:pPr>
+      <w:r>
+        <w:t xml:space="preserve">Setup checkpoint</w:t>
+      </w:r>
+    </w:p>
+    <w:bookmarkStart w:id="15" w:name="github-codespaces"/>
     <w:p>
       <w:pPr>
         <w:pStyle w:val="Heading3"/>
       </w:pPr>
       <w:r>
-        <w:t xml:space="preserve">Sign into Azure — just ask Copilot</w:t>
-      </w:r>
-    </w:p>
-    <w:p>
-      <w:pPr>
-        <w:pStyle w:val="FirstParagraph"/>
-      </w:pPr>
-      <w:r>
-        <w:rPr/>
-        <w:t>az login --use-device-code</w:t>
-        <w:br/>
-        <w:t>az account set --subscription "PASTE-YOUR-SUBSCRIPTION-ID-HERE"</w:t>
-        <w:br/>
-        <w:t>az account show --output table</w:t>
-      </w:r>
-    </w:p>
-    <w:bookmarkEnd w:id="14"/>
+        <w:t xml:space="preserve">GitHub Codespaces</w:t>
+      </w:r>
+    </w:p>
+    <w:p>
+      <w:pPr>
+        <w:pStyle w:val="Compact"/>
+        <w:numPr>
+          <w:ilvl w:val="0"/>
+          <w:numId w:val="1003"/>
+        </w:numPr>
+      </w:pPr>
+      <w:r>
+        <w:t xml:space="preserve">Select</w:t>
+      </w:r>
+      <w:r>
+        <w:t xml:space="preserve"> </w:t>
+      </w:r>
+      <w:r>
+        <w:rPr>
+          <w:b/>
+          <w:bCs/>
+        </w:rPr>
+        <w:t xml:space="preserve">Code &gt; Codespaces &gt; Create codespace on main</w:t>
+      </w:r>
+      <w:r>
+        <w:t xml:space="preserve">.</w:t>
+      </w:r>
+    </w:p>
+    <w:p>
+      <w:pPr>
+        <w:pStyle w:val="Compact"/>
+        <w:numPr>
+          <w:ilvl w:val="0"/>
+          <w:numId w:val="1003"/>
+        </w:numPr>
+      </w:pPr>
+      <w:r>
+        <w:t xml:space="preserve">Open</w:t>
+      </w:r>
+      <w:r>
+        <w:t xml:space="preserve"> </w:t>
+      </w:r>
+      <w:r>
+        <w:rPr>
+          <w:b/>
+          <w:bCs/>
+        </w:rPr>
+        <w:t xml:space="preserve">Terminal &gt; New Terminal</w:t>
+      </w:r>
+      <w:r>
+        <w:t xml:space="preserve"> </w:t>
+      </w:r>
+      <w:r>
+        <w:t xml:space="preserve">and run</w:t>
+      </w:r>
+      <w:r>
+        <w:t xml:space="preserve"> </w:t>
+      </w:r>
+      <w:r>
+        <w:rPr>
+          <w:rStyle w:val="VerbatimChar"/>
+        </w:rPr>
+        <w:t xml:space="preserve">copilot</w:t>
+      </w:r>
+      <w:r>
+        <w:t xml:space="preserve">.</w:t>
+      </w:r>
+    </w:p>
+    <w:p>
+      <w:pPr>
+        <w:pStyle w:val="Compact"/>
+        <w:numPr>
+          <w:ilvl w:val="0"/>
+          <w:numId w:val="1003"/>
+        </w:numPr>
+      </w:pPr>
+      <w:r>
+        <w:t xml:space="preserve">Trust the folder and complete</w:t>
+      </w:r>
+      <w:r>
+        <w:t xml:space="preserve"> </w:t>
+      </w:r>
+      <w:r>
+        <w:rPr>
+          <w:rStyle w:val="VerbatimChar"/>
+        </w:rPr>
+        <w:t xml:space="preserve">/login</w:t>
+      </w:r>
+      <w:r>
+        <w:t xml:space="preserve"> </w:t>
+      </w:r>
+      <w:r>
+        <w:t xml:space="preserve">if prompted.</w:t>
+      </w:r>
+    </w:p>
+    <w:p>
+      <w:pPr>
+        <w:pStyle w:val="Compact"/>
+        <w:numPr>
+          <w:ilvl w:val="0"/>
+          <w:numId w:val="1003"/>
+        </w:numPr>
+      </w:pPr>
+      <w:r>
+        <w:t xml:space="preserve">Open</w:t>
+      </w:r>
+      <w:r>
+        <w:t xml:space="preserve"> </w:t>
+      </w:r>
+      <w:r>
+        <w:rPr>
+          <w:rStyle w:val="VerbatimChar"/>
+        </w:rPr>
+        <w:t xml:space="preserve">labs/data-engineer</w:t>
+      </w:r>
+      <w:r>
+        <w:t xml:space="preserve">.</w:t>
+      </w:r>
+    </w:p>
     <w:bookmarkEnd w:id="15"/>
-    <w:bookmarkStart w:id="16" w:name="how-the-labs-work-you-talk-copilot-does"/>
-    <w:p>
-      <w:pPr>
-        <w:pStyle w:val="Heading2"/>
-      </w:pPr>
-      <w:r>
-        <w:t xml:space="preserve">How the labs work — you talk, Copilot does</w:t>
-      </w:r>
-    </w:p>
-    <w:p>
-      <w:pPr>
-        <w:pStyle w:val="FirstParagraph"/>
-      </w:pPr>
-      <w:r>
-        <w:rPr/>
-        <w:t>Both tracks are a conversation with Copilot in the terminal. You describe what you want in plain English; Copilot writes the files, runs the commands, deploys, and fixes errors — pausing for you to approve each step. You never type or paste PowerShell or Python. Open your track’s LAB.md (on GitHub, or just ask Copilot to show it) and follow it top to bottom.</w:t>
+    <w:bookmarkStart w:id="16" w:name="github-copilot-app"/>
+    <w:p>
+      <w:pPr>
+        <w:pStyle w:val="Heading3"/>
+      </w:pPr>
+      <w:r>
+        <w:t xml:space="preserve">GitHub Copilot app</w:t>
       </w:r>
     </w:p>
     <w:p>
@@ -536,17 +700,7 @@
         </w:numPr>
       </w:pPr>
       <w:r>
-        <w:rPr>
-          <w:b/>
-          <w:bCs/>
-        </w:rPr>
-        <w:t xml:space="preserve">Systems Engineer</w:t>
-      </w:r>
-      <w:r>
-        <w:t xml:space="preserve"> </w:t>
-      </w:r>
-      <w:r>
-        <w:t xml:space="preserve">→</w:t>
+        <w:t xml:space="preserve">Add</w:t>
       </w:r>
       <w:r>
         <w:t xml:space="preserve"> </w:t>
@@ -555,7 +709,13 @@
         <w:rPr>
           <w:rStyle w:val="VerbatimChar"/>
         </w:rPr>
-        <w:t xml:space="preserve">labs/systems-engineer/LAB.md</w:t>
+        <w:t xml:space="preserve">https://github.com/marinfrankovic/copilot-workshop-samples.git</w:t>
+      </w:r>
+      <w:r>
+        <w:t xml:space="preserve"> </w:t>
+      </w:r>
+      <w:r>
+        <w:t xml:space="preserve">as a project.</w:t>
       </w:r>
     </w:p>
     <w:p>
@@ -567,17 +727,49 @@
         </w:numPr>
       </w:pPr>
       <w:r>
+        <w:t xml:space="preserve">Start an Interactive session.</w:t>
+      </w:r>
+    </w:p>
+    <w:p>
+      <w:pPr>
+        <w:pStyle w:val="Compact"/>
+        <w:numPr>
+          <w:ilvl w:val="0"/>
+          <w:numId w:val="1004"/>
+        </w:numPr>
+      </w:pPr>
+      <w:r>
+        <w:t xml:space="preserve">Ask Copilot to show</w:t>
+      </w:r>
+      <w:r>
+        <w:t xml:space="preserve"> </w:t>
+      </w:r>
+      <w:r>
+        <w:rPr>
+          <w:rStyle w:val="VerbatimChar"/>
+        </w:rPr>
+        <w:t xml:space="preserve">labs/data-engineer/LAB.md</w:t>
+      </w:r>
+      <w:r>
+        <w:t xml:space="preserve">.</w:t>
+      </w:r>
+    </w:p>
+    <w:p>
+      <w:pPr>
+        <w:pStyle w:val="FirstParagraph"/>
+      </w:pPr>
+      <w:r>
         <w:rPr>
           <w:b/>
           <w:bCs/>
         </w:rPr>
-        <w:t xml:space="preserve">Data Engineer</w:t>
-      </w:r>
-      <w:r>
-        <w:t xml:space="preserve"> </w:t>
-      </w:r>
-      <w:r>
-        <w:t xml:space="preserve">→</w:t>
+        <w:t xml:space="preserve">Checkpoint:</w:t>
+      </w:r>
+      <w:r>
+        <w:t xml:space="preserve"> </w:t>
+      </w:r>
+      <w:r>
+        <w:t xml:space="preserve">everyone can see</w:t>
       </w:r>
       <w:r>
         <w:t xml:space="preserve"> </w:t>
@@ -586,7 +778,45 @@
         <w:rPr>
           <w:rStyle w:val="VerbatimChar"/>
         </w:rPr>
-        <w:t xml:space="preserve">labs/data-engineer/LAB.md</w:t>
+        <w:t xml:space="preserve">sales_january.csv</w:t>
+      </w:r>
+      <w:r>
+        <w:t xml:space="preserve">,</w:t>
+      </w:r>
+      <w:r>
+        <w:t xml:space="preserve"> </w:t>
+      </w:r>
+      <w:r>
+        <w:rPr>
+          <w:rStyle w:val="VerbatimChar"/>
+        </w:rPr>
+        <w:t xml:space="preserve">sales_february.csv</w:t>
+      </w:r>
+      <w:r>
+        <w:t xml:space="preserve">, and</w:t>
+      </w:r>
+      <w:r>
+        <w:t xml:space="preserve"> </w:t>
+      </w:r>
+      <w:r>
+        <w:rPr>
+          <w:rStyle w:val="VerbatimChar"/>
+        </w:rPr>
+        <w:t xml:space="preserve">product_prices.csv</w:t>
+      </w:r>
+      <w:r>
+        <w:t xml:space="preserve">.</w:t>
+      </w:r>
+    </w:p>
+    <w:bookmarkEnd w:id="16"/>
+    <w:bookmarkEnd w:id="17"/>
+    <w:bookmarkStart w:id="18" w:name="inspect-the-source-files"/>
+    <w:p>
+      <w:pPr>
+        <w:pStyle w:val="Heading2"/>
+      </w:pPr>
+      <w:r>
+        <w:t xml:space="preserve">1. Inspect the source files</w:t>
       </w:r>
     </w:p>
     <w:p>
@@ -594,42 +824,635 @@
         <w:pStyle w:val="FirstParagraph"/>
       </w:pPr>
       <w:r>
-        <w:t xml:space="preserve">You only have</w:t>
-      </w:r>
-      <w:r>
-        <w:t xml:space="preserve"> </w:t>
-      </w:r>
+        <w:t xml:space="preserve">Everyone enters:</w:t>
+      </w:r>
+    </w:p>
+    <w:p>
+      <w:pPr>
+        <w:pStyle w:val="BlockText"/>
+      </w:pPr>
+      <w:r>
+        <w:t xml:space="preserve">Read the three CSV files in this folder. Do not change anything yet. In plain</w:t>
+      </w:r>
+      <w:r>
+        <w:t xml:space="preserve"> </w:t>
+      </w:r>
+      <w:r>
+        <w:t xml:space="preserve">English, list the inconsistencies that must be fixed before the sales files can</w:t>
+      </w:r>
+      <w:r>
+        <w:t xml:space="preserve"> </w:t>
+      </w:r>
+      <w:r>
+        <w:t xml:space="preserve">be combined, including column names, date formats, money values, spaces, and</w:t>
+      </w:r>
+      <w:r>
+        <w:t xml:space="preserve"> </w:t>
+      </w:r>
+      <w:r>
+        <w:t xml:space="preserve">capitalisation. Then propose a short plan.</w:t>
+      </w:r>
+    </w:p>
+    <w:p>
+      <w:pPr>
+        <w:pStyle w:val="FirstParagraph"/>
+      </w:pPr>
       <w:r>
         <w:rPr>
           <w:b/>
           <w:bCs/>
         </w:rPr>
-        <w:t xml:space="preserve">Contributor</w:t>
-      </w:r>
-      <w:r>
-        <w:t xml:space="preserve"> </w:t>
-      </w:r>
-      <w:r>
-        <w:t xml:space="preserve">access — that’s all you need. If Copilot ever adds a</w:t>
-      </w:r>
-      <w:r>
-        <w:t xml:space="preserve"> </w:t>
-      </w:r>
-      <w:r>
-        <w:t xml:space="preserve">“role assignment”</w:t>
-      </w:r>
-      <w:r>
-        <w:t xml:space="preserve">, ask it to remove it.</w:t>
-      </w:r>
-    </w:p>
-    <w:bookmarkEnd w:id="16"/>
-    <w:bookmarkStart w:id="17" w:name="useful-prompt-starters-any-track"/>
+        <w:t xml:space="preserve">Checkpoint:</w:t>
+      </w:r>
+      <w:r>
+        <w:t xml:space="preserve"> </w:t>
+      </w:r>
+      <w:r>
+        <w:t xml:space="preserve">compare the lists. Resolve differences before continuing.</w:t>
+      </w:r>
+    </w:p>
+    <w:bookmarkEnd w:id="18"/>
+    <w:bookmarkStart w:id="19" w:name="clean-and-combine-the-data"/>
     <w:p>
       <w:pPr>
         <w:pStyle w:val="Heading2"/>
       </w:pPr>
       <w:r>
-        <w:t xml:space="preserve">Useful prompt starters (any track)</w:t>
+        <w:t xml:space="preserve">2. Clean and combine the data</w:t>
+      </w:r>
+    </w:p>
+    <w:p>
+      <w:pPr>
+        <w:pStyle w:val="FirstParagraph"/>
+      </w:pPr>
+      <w:r>
+        <w:t xml:space="preserve">Everyone enters:</w:t>
+      </w:r>
+    </w:p>
+    <w:p>
+      <w:pPr>
+        <w:pStyle w:val="BlockText"/>
+      </w:pPr>
+      <w:r>
+        <w:t xml:space="preserve">Create a Python script named</w:t>
+      </w:r>
+      <w:r>
+        <w:t xml:space="preserve"> </w:t>
+      </w:r>
+      <w:r>
+        <w:rPr>
+          <w:rStyle w:val="VerbatimChar"/>
+        </w:rPr>
+        <w:t xml:space="preserve">clean_sales.py</w:t>
+      </w:r>
+      <w:r>
+        <w:t xml:space="preserve"> </w:t>
+      </w:r>
+      <w:r>
+        <w:t xml:space="preserve">that combines the January and</w:t>
+      </w:r>
+      <w:r>
+        <w:t xml:space="preserve"> </w:t>
+      </w:r>
+      <w:r>
+        <w:t xml:space="preserve">February sales files, fixes every issue in the plan, joins the product list,</w:t>
+      </w:r>
+      <w:r>
+        <w:t xml:space="preserve"> </w:t>
+      </w:r>
+      <w:r>
+        <w:t xml:space="preserve">and writes a new file named</w:t>
+      </w:r>
+      <w:r>
+        <w:t xml:space="preserve"> </w:t>
+      </w:r>
+      <w:r>
+        <w:rPr>
+          <w:rStyle w:val="VerbatimChar"/>
+        </w:rPr>
+        <w:t xml:space="preserve">sales_clean.csv</w:t>
+      </w:r>
+      <w:r>
+        <w:t xml:space="preserve">. Never modify the three source</w:t>
+      </w:r>
+      <w:r>
+        <w:t xml:space="preserve"> </w:t>
+      </w:r>
+      <w:r>
+        <w:t xml:space="preserve">CSV files. Explain the script in five bullets, then run it.</w:t>
+      </w:r>
+    </w:p>
+    <w:p>
+      <w:pPr>
+        <w:pStyle w:val="FirstParagraph"/>
+      </w:pPr>
+      <w:r>
+        <w:t xml:space="preserve">Read the explanation before approving the run.</w:t>
+      </w:r>
+    </w:p>
+    <w:p>
+      <w:pPr>
+        <w:pStyle w:val="BodyText"/>
+      </w:pPr>
+      <w:r>
+        <w:rPr>
+          <w:b/>
+          <w:bCs/>
+        </w:rPr>
+        <w:t xml:space="preserve">Checkpoint:</w:t>
+      </w:r>
+      <w:r>
+        <w:t xml:space="preserve"> </w:t>
+      </w:r>
+      <w:r>
+        <w:t xml:space="preserve">open</w:t>
+      </w:r>
+      <w:r>
+        <w:t xml:space="preserve"> </w:t>
+      </w:r>
+      <w:r>
+        <w:rPr>
+          <w:rStyle w:val="VerbatimChar"/>
+        </w:rPr>
+        <w:t xml:space="preserve">sales_clean.csv</w:t>
+      </w:r>
+      <w:r>
+        <w:t xml:space="preserve"> </w:t>
+      </w:r>
+      <w:r>
+        <w:t xml:space="preserve">and confirm it contains both months.</w:t>
+      </w:r>
+    </w:p>
+    <w:p>
+      <w:pPr>
+        <w:pStyle w:val="BodyText"/>
+      </w:pPr>
+      <w:r>
+        <w:t xml:space="preserve">If anyone gets an error, everyone practises the same recovery prompt:</w:t>
+      </w:r>
+    </w:p>
+    <w:p>
+      <w:pPr>
+        <w:pStyle w:val="BlockText"/>
+      </w:pPr>
+      <w:r>
+        <w:t xml:space="preserve">Explain the error in plain English. Make only the smallest necessary fix, then</w:t>
+      </w:r>
+      <w:r>
+        <w:t xml:space="preserve"> </w:t>
+      </w:r>
+      <w:r>
+        <w:t xml:space="preserve">run the script again.</w:t>
+      </w:r>
+    </w:p>
+    <w:bookmarkEnd w:id="19"/>
+    <w:bookmarkStart w:id="20" w:name="answer-business-questions"/>
+    <w:p>
+      <w:pPr>
+        <w:pStyle w:val="Heading2"/>
+      </w:pPr>
+      <w:r>
+        <w:t xml:space="preserve">3. Answer business questions</w:t>
+      </w:r>
+    </w:p>
+    <w:p>
+      <w:pPr>
+        <w:pStyle w:val="FirstParagraph"/>
+      </w:pPr>
+      <w:r>
+        <w:t xml:space="preserve">Everyone enters:</w:t>
+      </w:r>
+    </w:p>
+    <w:p>
+      <w:pPr>
+        <w:pStyle w:val="BlockText"/>
+      </w:pPr>
+      <w:r>
+        <w:t xml:space="preserve">Using</w:t>
+      </w:r>
+      <w:r>
+        <w:t xml:space="preserve"> </w:t>
+      </w:r>
+      <w:r>
+        <w:rPr>
+          <w:rStyle w:val="VerbatimChar"/>
+        </w:rPr>
+        <w:t xml:space="preserve">sales_clean.csv</w:t>
+      </w:r>
+      <w:r>
+        <w:t xml:space="preserve">, calculate total revenue by region and by month, the</w:t>
+      </w:r>
+      <w:r>
+        <w:t xml:space="preserve"> </w:t>
+      </w:r>
+      <w:r>
+        <w:t xml:space="preserve">top-selling product by revenue, and the five largest discounts from list</w:t>
+      </w:r>
+      <w:r>
+        <w:t xml:space="preserve"> </w:t>
+      </w:r>
+      <w:r>
+        <w:t xml:space="preserve">price. Run the analysis and save the results as</w:t>
+      </w:r>
+      <w:r>
+        <w:t xml:space="preserve"> </w:t>
+      </w:r>
+      <w:r>
+        <w:rPr>
+          <w:rStyle w:val="VerbatimChar"/>
+        </w:rPr>
+        <w:t xml:space="preserve">analysis.md</w:t>
+      </w:r>
+      <w:r>
+        <w:t xml:space="preserve"> </w:t>
+      </w:r>
+      <w:r>
+        <w:t xml:space="preserve">with clear tables.</w:t>
+      </w:r>
+    </w:p>
+    <w:p>
+      <w:pPr>
+        <w:pStyle w:val="FirstParagraph"/>
+      </w:pPr>
+      <w:r>
+        <w:rPr>
+          <w:b/>
+          <w:bCs/>
+        </w:rPr>
+        <w:t xml:space="preserve">Checkpoint:</w:t>
+      </w:r>
+      <w:r>
+        <w:t xml:space="preserve"> </w:t>
+      </w:r>
+      <w:r>
+        <w:t xml:space="preserve">Copilot must run the analysis and write actual results, not only</w:t>
+      </w:r>
+      <w:r>
+        <w:t xml:space="preserve"> </w:t>
+      </w:r>
+      <w:r>
+        <w:t xml:space="preserve">describe code.</w:t>
+      </w:r>
+    </w:p>
+    <w:bookmarkEnd w:id="20"/>
+    <w:bookmarkStart w:id="21" w:name="validate-the-result"/>
+    <w:p>
+      <w:pPr>
+        <w:pStyle w:val="Heading2"/>
+      </w:pPr>
+      <w:r>
+        <w:t xml:space="preserve">4. Validate the result</w:t>
+      </w:r>
+    </w:p>
+    <w:p>
+      <w:pPr>
+        <w:pStyle w:val="FirstParagraph"/>
+      </w:pPr>
+      <w:r>
+        <w:t xml:space="preserve">Everyone enters:</w:t>
+      </w:r>
+    </w:p>
+    <w:p>
+      <w:pPr>
+        <w:pStyle w:val="BlockText"/>
+      </w:pPr>
+      <w:r>
+        <w:t xml:space="preserve">Validate the cleaned data. Report the source row count, cleaned row count,</w:t>
+      </w:r>
+      <w:r>
+        <w:t xml:space="preserve"> </w:t>
+      </w:r>
+      <w:r>
+        <w:t xml:space="preserve">date range, total units, total revenue, duplicate count, missing-value count,</w:t>
+      </w:r>
+      <w:r>
+        <w:t xml:space="preserve"> </w:t>
+      </w:r>
+      <w:r>
+        <w:t xml:space="preserve">and three sample rows. Recalculate totals independently from the cleaned CSV.</w:t>
+      </w:r>
+      <w:r>
+        <w:t xml:space="preserve"> </w:t>
+      </w:r>
+      <w:r>
+        <w:t xml:space="preserve">Save the evidence as</w:t>
+      </w:r>
+      <w:r>
+        <w:t xml:space="preserve"> </w:t>
+      </w:r>
+      <w:r>
+        <w:rPr>
+          <w:rStyle w:val="VerbatimChar"/>
+        </w:rPr>
+        <w:t xml:space="preserve">data-quality-report.md</w:t>
+      </w:r>
+      <w:r>
+        <w:t xml:space="preserve">. Flag any mismatch instead of</w:t>
+      </w:r>
+      <w:r>
+        <w:t xml:space="preserve"> </w:t>
+      </w:r>
+      <w:r>
+        <w:t xml:space="preserve">hiding or guessing it.</w:t>
+      </w:r>
+    </w:p>
+    <w:p>
+      <w:pPr>
+        <w:pStyle w:val="FirstParagraph"/>
+      </w:pPr>
+      <w:r>
+        <w:rPr>
+          <w:b/>
+          <w:bCs/>
+        </w:rPr>
+        <w:t xml:space="preserve">Checkpoint:</w:t>
+      </w:r>
+      <w:r>
+        <w:t xml:space="preserve"> </w:t>
+      </w:r>
+      <w:r>
+        <w:t xml:space="preserve">compare row counts and totals with the facilitator. If a result</w:t>
+      </w:r>
+      <w:r>
+        <w:t xml:space="preserve"> </w:t>
+      </w:r>
+      <w:r>
+        <w:t xml:space="preserve">differs, ask Copilot to identify the first differing row or assumption.</w:t>
+      </w:r>
+    </w:p>
+    <w:bookmarkEnd w:id="21"/>
+    <w:bookmarkStart w:id="22" w:name="improve-the-handoff"/>
+    <w:p>
+      <w:pPr>
+        <w:pStyle w:val="Heading2"/>
+      </w:pPr>
+      <w:r>
+        <w:t xml:space="preserve">5. Improve the handoff</w:t>
+      </w:r>
+    </w:p>
+    <w:p>
+      <w:pPr>
+        <w:pStyle w:val="FirstParagraph"/>
+      </w:pPr>
+      <w:r>
+        <w:t xml:space="preserve">Everyone enters:</w:t>
+      </w:r>
+    </w:p>
+    <w:p>
+      <w:pPr>
+        <w:pStyle w:val="BlockText"/>
+      </w:pPr>
+      <w:r>
+        <w:t xml:space="preserve">Review</w:t>
+      </w:r>
+      <w:r>
+        <w:t xml:space="preserve"> </w:t>
+      </w:r>
+      <w:r>
+        <w:rPr>
+          <w:rStyle w:val="VerbatimChar"/>
+        </w:rPr>
+        <w:t xml:space="preserve">analysis.md</w:t>
+      </w:r>
+      <w:r>
+        <w:t xml:space="preserve"> </w:t>
+      </w:r>
+      <w:r>
+        <w:t xml:space="preserve">and</w:t>
+      </w:r>
+      <w:r>
+        <w:t xml:space="preserve"> </w:t>
+      </w:r>
+      <w:r>
+        <w:rPr>
+          <w:rStyle w:val="VerbatimChar"/>
+        </w:rPr>
+        <w:t xml:space="preserve">data-quality-report.md</w:t>
+      </w:r>
+      <w:r>
+        <w:t xml:space="preserve"> </w:t>
+      </w:r>
+      <w:r>
+        <w:t xml:space="preserve">for a non-technical manager.</w:t>
+      </w:r>
+      <w:r>
+        <w:t xml:space="preserve"> </w:t>
+      </w:r>
+      <w:r>
+        <w:t xml:space="preserve">Add a short executive summary to</w:t>
+      </w:r>
+      <w:r>
+        <w:t xml:space="preserve"> </w:t>
+      </w:r>
+      <w:r>
+        <w:rPr>
+          <w:rStyle w:val="VerbatimChar"/>
+        </w:rPr>
+        <w:t xml:space="preserve">analysis.md</w:t>
+      </w:r>
+      <w:r>
+        <w:t xml:space="preserve"> </w:t>
+      </w:r>
+      <w:r>
+        <w:t xml:space="preserve">with three findings and one</w:t>
+      </w:r>
+      <w:r>
+        <w:t xml:space="preserve"> </w:t>
+      </w:r>
+      <w:r>
+        <w:t xml:space="preserve">limitation. Use only facts calculated from the files; do not invent figures.</w:t>
+      </w:r>
+    </w:p>
+    <w:p>
+      <w:pPr>
+        <w:pStyle w:val="FirstParagraph"/>
+      </w:pPr>
+      <w:r>
+        <w:rPr>
+          <w:b/>
+          <w:bCs/>
+        </w:rPr>
+        <w:t xml:space="preserve">Checkpoint:</w:t>
+      </w:r>
+      <w:r>
+        <w:t xml:space="preserve"> </w:t>
+      </w:r>
+      <w:r>
+        <w:t xml:space="preserve">ask which file and calculation supports each claim.</w:t>
+      </w:r>
+    </w:p>
+    <w:bookmarkEnd w:id="22"/>
+    <w:bookmarkStart w:id="23" w:name="create-and-inspect-the-local-package"/>
+    <w:p>
+      <w:pPr>
+        <w:pStyle w:val="Heading2"/>
+      </w:pPr>
+      <w:r>
+        <w:t xml:space="preserve">6. Create and inspect the local package</w:t>
+      </w:r>
+    </w:p>
+    <w:p>
+      <w:pPr>
+        <w:pStyle w:val="FirstParagraph"/>
+      </w:pPr>
+      <w:r>
+        <w:t xml:space="preserve">Everyone enters:</w:t>
+      </w:r>
+    </w:p>
+    <w:p>
+      <w:pPr>
+        <w:pStyle w:val="BlockText"/>
+      </w:pPr>
+      <w:r>
+        <w:t xml:space="preserve">Create a local folder named</w:t>
+      </w:r>
+      <w:r>
+        <w:t xml:space="preserve"> </w:t>
+      </w:r>
+      <w:r>
+        <w:rPr>
+          <w:rStyle w:val="VerbatimChar"/>
+        </w:rPr>
+        <w:t xml:space="preserve">handoff</w:t>
+      </w:r>
+      <w:r>
+        <w:t xml:space="preserve"> </w:t>
+      </w:r>
+      <w:r>
+        <w:t xml:space="preserve">containing copies of</w:t>
+      </w:r>
+      <w:r>
+        <w:t xml:space="preserve"> </w:t>
+      </w:r>
+      <w:r>
+        <w:rPr>
+          <w:rStyle w:val="VerbatimChar"/>
+        </w:rPr>
+        <w:t xml:space="preserve">sales_clean.csv</w:t>
+      </w:r>
+      <w:r>
+        <w:t xml:space="preserve">,</w:t>
+      </w:r>
+      <w:r>
+        <w:t xml:space="preserve"> </w:t>
+      </w:r>
+      <w:r>
+        <w:rPr>
+          <w:rStyle w:val="VerbatimChar"/>
+        </w:rPr>
+        <w:t xml:space="preserve">analysis.md</w:t>
+      </w:r>
+      <w:r>
+        <w:t xml:space="preserve">, and</w:t>
+      </w:r>
+      <w:r>
+        <w:t xml:space="preserve"> </w:t>
+      </w:r>
+      <w:r>
+        <w:rPr>
+          <w:rStyle w:val="VerbatimChar"/>
+        </w:rPr>
+        <w:t xml:space="preserve">data-quality-report.md</w:t>
+      </w:r>
+      <w:r>
+        <w:t xml:space="preserve">. Add a</w:t>
+      </w:r>
+      <w:r>
+        <w:t xml:space="preserve"> </w:t>
+      </w:r>
+      <w:r>
+        <w:rPr>
+          <w:rStyle w:val="VerbatimChar"/>
+        </w:rPr>
+        <w:t xml:space="preserve">README.md</w:t>
+      </w:r>
+      <w:r>
+        <w:t xml:space="preserve"> </w:t>
+      </w:r>
+      <w:r>
+        <w:t xml:space="preserve">that explains</w:t>
+      </w:r>
+      <w:r>
+        <w:t xml:space="preserve"> </w:t>
+      </w:r>
+      <w:r>
+        <w:t xml:space="preserve">what each file contains and how to rerun</w:t>
+      </w:r>
+      <w:r>
+        <w:t xml:space="preserve"> </w:t>
+      </w:r>
+      <w:r>
+        <w:rPr>
+          <w:rStyle w:val="VerbatimChar"/>
+        </w:rPr>
+        <w:t xml:space="preserve">clean_sales.py</w:t>
+      </w:r>
+      <w:r>
+        <w:t xml:space="preserve">. Create</w:t>
+      </w:r>
+      <w:r>
+        <w:t xml:space="preserve"> </w:t>
+      </w:r>
+      <w:r>
+        <w:rPr>
+          <w:rStyle w:val="VerbatimChar"/>
+        </w:rPr>
+        <w:t xml:space="preserve">sales-handoff.zip</w:t>
+      </w:r>
+      <w:r>
+        <w:t xml:space="preserve"> </w:t>
+      </w:r>
+      <w:r>
+        <w:t xml:space="preserve">from that folder. Do not upload or send anything.</w:t>
+      </w:r>
+    </w:p>
+    <w:p>
+      <w:pPr>
+        <w:pStyle w:val="FirstParagraph"/>
+      </w:pPr>
+      <w:r>
+        <w:rPr>
+          <w:b/>
+          <w:bCs/>
+        </w:rPr>
+        <w:t xml:space="preserve">Final checkpoint:</w:t>
+      </w:r>
+      <w:r>
+        <w:t xml:space="preserve"> </w:t>
+      </w:r>
+      <w:r>
+        <w:t xml:space="preserve">the</w:t>
+      </w:r>
+      <w:r>
+        <w:t xml:space="preserve"> </w:t>
+      </w:r>
+      <w:r>
+        <w:rPr>
+          <w:rStyle w:val="VerbatimChar"/>
+        </w:rPr>
+        <w:t xml:space="preserve">handoff</w:t>
+      </w:r>
+      <w:r>
+        <w:t xml:space="preserve"> </w:t>
+      </w:r>
+      <w:r>
+        <w:t xml:space="preserve">folder contains exactly four files and the ZIP</w:t>
+      </w:r>
+      <w:r>
+        <w:t xml:space="preserve"> </w:t>
+      </w:r>
+      <w:r>
+        <w:t xml:space="preserve">exists. All outputs remain local. There is no cloud teardown.</w:t>
+      </w:r>
+    </w:p>
+    <w:bookmarkEnd w:id="23"/>
+    <w:bookmarkStart w:id="24" w:name="safety-rules"/>
+    <w:p>
+      <w:pPr>
+        <w:pStyle w:val="Heading2"/>
+      </w:pPr>
+      <w:r>
+        <w:t xml:space="preserve">Safety rules</w:t>
       </w:r>
     </w:p>
     <w:p>
@@ -641,7 +1464,7 @@
         </w:numPr>
       </w:pPr>
       <w:r>
-        <w:t xml:space="preserve">“Explain this for someone new to code.”</w:t>
+        <w:t xml:space="preserve">Read every proposed action before approving it.</w:t>
       </w:r>
     </w:p>
     <w:p>
@@ -653,7 +1476,7 @@
         </w:numPr>
       </w:pPr>
       <w:r>
-        <w:t xml:space="preserve">“Before you run or deploy this, tell me exactly what it creates, reads, or writes.”</w:t>
+        <w:t xml:space="preserve">Keep the three source CSV files unchanged.</w:t>
       </w:r>
     </w:p>
     <w:p>
@@ -665,7 +1488,7 @@
         </w:numPr>
       </w:pPr>
       <w:r>
-        <w:t xml:space="preserve">“What could go wrong, cost money, or be insecure here? Rank the risks.”</w:t>
+        <w:t xml:space="preserve">Never paste secrets, real customer data, or confidential information into Copilot.</w:t>
       </w:r>
     </w:p>
     <w:p>
@@ -677,7 +1500,7 @@
         </w:numPr>
       </w:pPr>
       <w:r>
-        <w:t xml:space="preserve">“Make this safer: least-privilege, new output files, originals untouched.”</w:t>
+        <w:t xml:space="preserve">Require evidence for totals and claims. Copilot drafts; people decide.</w:t>
       </w:r>
     </w:p>
     <w:p>
@@ -689,87 +1512,17 @@
         </w:numPr>
       </w:pPr>
       <w:r>
-        <w:t xml:space="preserve">“Summarise what you just produced in five bullets before I accept it.”</w:t>
-      </w:r>
-    </w:p>
-    <w:bookmarkEnd w:id="17"/>
-    <w:bookmarkStart w:id="18" w:name="responsible-use"/>
+        <w:t xml:space="preserve">Keep all outputs local during the workshop.</w:t>
+      </w:r>
+    </w:p>
+    <w:bookmarkEnd w:id="24"/>
+    <w:bookmarkStart w:id="25" w:name="wrap-up"/>
     <w:p>
       <w:pPr>
         <w:pStyle w:val="Heading2"/>
       </w:pPr>
       <w:r>
-        <w:t xml:space="preserve">Responsible use</w:t>
-      </w:r>
-    </w:p>
-    <w:p>
-      <w:pPr>
-        <w:pStyle w:val="Compact"/>
-        <w:numPr>
-          <w:ilvl w:val="0"/>
-          <w:numId w:val="1006"/>
-        </w:numPr>
-      </w:pPr>
-      <w:r>
-        <w:t xml:space="preserve">You own the result, not Copilot.</w:t>
-      </w:r>
-    </w:p>
-    <w:p>
-      <w:pPr>
-        <w:pStyle w:val="Compact"/>
-        <w:numPr>
-          <w:ilvl w:val="0"/>
-          <w:numId w:val="1006"/>
-        </w:numPr>
-      </w:pPr>
-      <w:r>
-        <w:t xml:space="preserve">Don’t paste secrets or sensitive data into prompts. (Your subscription ID is fine.)</w:t>
-      </w:r>
-    </w:p>
-    <w:p>
-      <w:pPr>
-        <w:pStyle w:val="Compact"/>
-        <w:numPr>
-          <w:ilvl w:val="0"/>
-          <w:numId w:val="1006"/>
-        </w:numPr>
-      </w:pPr>
-      <w:r>
-        <w:t xml:space="preserve">Preview infrastructure before you deploy (what-if); work on copies of data.</w:t>
-      </w:r>
-    </w:p>
-    <w:p>
-      <w:pPr>
-        <w:pStyle w:val="Compact"/>
-        <w:numPr>
-          <w:ilvl w:val="0"/>
-          <w:numId w:val="1006"/>
-        </w:numPr>
-      </w:pPr>
-      <w:r>
-        <w:t xml:space="preserve">Sanity-check the output every time — numbers, security, and cost.</w:t>
-      </w:r>
-    </w:p>
-    <w:p>
-      <w:pPr>
-        <w:pStyle w:val="Compact"/>
-        <w:numPr>
-          <w:ilvl w:val="0"/>
-          <w:numId w:val="1006"/>
-        </w:numPr>
-      </w:pPr>
-      <w:r>
-        <w:t xml:space="preserve">Tear down your resource group at the end so nothing keeps running.</w:t>
-      </w:r>
-    </w:p>
-    <w:bookmarkEnd w:id="18"/>
-    <w:bookmarkStart w:id="19" w:name="take-it-home"/>
-    <w:p>
-      <w:pPr>
-        <w:pStyle w:val="Heading2"/>
-      </w:pPr>
-      <w:r>
-        <w:t xml:space="preserve">Take it home</w:t>
+        <w:t xml:space="preserve">Wrap-up</w:t>
       </w:r>
     </w:p>
     <w:p>
@@ -777,65 +1530,23 @@
         <w:pStyle w:val="FirstParagraph"/>
       </w:pPr>
       <w:r>
-        <w:t xml:space="preserve">Pick one small, real task from your role this week and run the same loop:</w:t>
-      </w:r>
-      <w:r>
-        <w:t xml:space="preserve"> </w:t>
-      </w:r>
-      <w:r>
-        <w:t xml:space="preserve">describe, generate, preview, refine, sanity-check.</w:t>
-      </w:r>
-      <w:r>
-        <w:t xml:space="preserve"> </w:t>
-      </w:r>
-      <w:r>
-        <w:t xml:space="preserve">Repo:</w:t>
-      </w:r>
-      <w:r>
-        <w:t xml:space="preserve"> </w:t>
-      </w:r>
-      <w:r>
-        <w:rPr>
-          <w:rStyle w:val="VerbatimChar"/>
-        </w:rPr>
-        <w:t xml:space="preserve">github.com/marinfrankovic/copilot-workshop-samples</w:t>
-      </w:r>
-    </w:p>
-    <w:bookmarkEnd w:id="19"/>
-    <w:bookmarkEnd w:id="20"/>
-    <w:p>
-      <w:pPr>
-        <w:pStyle w:val="Heading2"/>
-      </w:pPr>
-      <w:r>
-        <w:t>Option B - GitHub Copilot app for Windows</w:t>
-      </w:r>
-    </w:p>
-    <w:p>
-      <w:r>
-        <w:t>Use this alternative if you prefer the GitHub Copilot app rather than a Codespace.</w:t>
-      </w:r>
-    </w:p>
-    <w:p>
-      <w:r>
-        <w:t>1. Download the GitHub Copilot app for Windows (x64) from gh.io/copilot-app-win64, then install Git and Azure CLI. Data-track attendees also install Python.</w:t>
-      </w:r>
-    </w:p>
-    <w:p>
-      <w:r>
-        <w:t>2. Open the app, sign in with the GitHub account that has Copilot access, then add https://github.com/marinfrankovic/copilot-workshop-samples.git as a project using Add project from &gt; Repository URL.</w:t>
-      </w:r>
-    </w:p>
-    <w:p>
-      <w:r>
-        <w:t>3. Start an Interactive session on the workshop project. Ask Copilot to sign you into Azure, switch to your assigned subscription, and show the selected account.</w:t>
-      </w:r>
-    </w:p>
-    <w:p>
-      <w:r>
-        <w:t>In the labs, enter each quoted prompt in your Interactive session. Read and approve each proposed action before Copilot runs it.</w:t>
-      </w:r>
-    </w:p>
+        <w:t xml:space="preserve">The skill is not memorising Python. It is describing an outcome, reviewing the</w:t>
+      </w:r>
+      <w:r>
+        <w:t xml:space="preserve"> </w:t>
+      </w:r>
+      <w:r>
+        <w:t xml:space="preserve">proposal, running it deliberately, refining one issue at a time, and checking the</w:t>
+      </w:r>
+      <w:r>
+        <w:t xml:space="preserve"> </w:t>
+      </w:r>
+      <w:r>
+        <w:t xml:space="preserve">evidence before using the result.</w:t>
+      </w:r>
+    </w:p>
+    <w:bookmarkEnd w:id="25"/>
+    <w:bookmarkEnd w:id="26"/>
     <w:sectPr>
       <w:footnotePr>
         <w:numRestart w:val="eachSect"/>
@@ -1201,12 +1912,36 @@
     </w:lvlOverride>
   </w:num>
   <w:num w:numId="1004">
-    <w:abstractNumId w:val="991"/>
+    <w:abstractNumId w:val="99411"/>
+    <w:lvlOverride w:ilvl="0">
+      <w:startOverride w:val="1"/>
+    </w:lvlOverride>
+    <w:lvlOverride w:ilvl="1">
+      <w:startOverride w:val="1"/>
+    </w:lvlOverride>
+    <w:lvlOverride w:ilvl="2">
+      <w:startOverride w:val="1"/>
+    </w:lvlOverride>
+    <w:lvlOverride w:ilvl="3">
+      <w:startOverride w:val="1"/>
+    </w:lvlOverride>
+    <w:lvlOverride w:ilvl="4">
+      <w:startOverride w:val="1"/>
+    </w:lvlOverride>
+    <w:lvlOverride w:ilvl="5">
+      <w:startOverride w:val="1"/>
+    </w:lvlOverride>
+    <w:lvlOverride w:ilvl="6">
+      <w:startOverride w:val="1"/>
+    </w:lvlOverride>
+    <w:lvlOverride w:ilvl="7">
+      <w:startOverride w:val="1"/>
+    </w:lvlOverride>
+    <w:lvlOverride w:ilvl="8">
+      <w:startOverride w:val="1"/>
+    </w:lvlOverride>
   </w:num>
   <w:num w:numId="1005">
-    <w:abstractNumId w:val="991"/>
-  </w:num>
-  <w:num w:numId="1006">
     <w:abstractNumId w:val="991"/>
   </w:num>
 </w:numbering>
@@ -1868,7 +2603,7 @@
       <w:color w:themeColor="accent1" w:themeShade="BF" w:val="365F91"/>
     </w:rPr>
   </w:style>
-  <w:style w:type="paragraph" w:customStyle="1" w:styleId="SourceCode">
+  <w:style w:customStyle="1" w:styleId="SourceCode" w:type="paragraph">
     <w:name w:val="Source Code"/>
     <w:basedOn w:val="Normal"/>
     <w:link w:val="VerbatimChar"/>
@@ -1876,7 +2611,7 @@
       <w:wordWrap w:val="off"/>
     </w:pPr>
   </w:style>
-  <w:style w:type="character" w:customStyle="1" w:styleId="KeywordTok">
+  <w:style w:customStyle="1" w:styleId="KeywordTok" w:type="character">
     <w:name w:val="KeywordTok"/>
     <w:basedOn w:val="VerbatimChar"/>
     <w:rPr>
@@ -1884,77 +2619,77 @@
       <w:color w:val="007020"/>
     </w:rPr>
   </w:style>
-  <w:style w:type="character" w:customStyle="1" w:styleId="DataTypeTok">
+  <w:style w:customStyle="1" w:styleId="DataTypeTok" w:type="character">
     <w:name w:val="DataTypeTok"/>
     <w:basedOn w:val="VerbatimChar"/>
     <w:rPr>
       <w:color w:val="902000"/>
     </w:rPr>
   </w:style>
-  <w:style w:type="character" w:customStyle="1" w:styleId="DecValTok">
+  <w:style w:customStyle="1" w:styleId="DecValTok" w:type="character">
     <w:name w:val="DecValTok"/>
     <w:basedOn w:val="VerbatimChar"/>
     <w:rPr>
       <w:color w:val="40a070"/>
     </w:rPr>
   </w:style>
-  <w:style w:type="character" w:customStyle="1" w:styleId="BaseNTok">
+  <w:style w:customStyle="1" w:styleId="BaseNTok" w:type="character">
     <w:name w:val="BaseNTok"/>
     <w:basedOn w:val="VerbatimChar"/>
     <w:rPr>
       <w:color w:val="40a070"/>
     </w:rPr>
   </w:style>
-  <w:style w:type="character" w:customStyle="1" w:styleId="FloatTok">
+  <w:style w:customStyle="1" w:styleId="FloatTok" w:type="character">
     <w:name w:val="FloatTok"/>
     <w:basedOn w:val="VerbatimChar"/>
     <w:rPr>
       <w:color w:val="40a070"/>
     </w:rPr>
   </w:style>
-  <w:style w:type="character" w:customStyle="1" w:styleId="ConstantTok">
+  <w:style w:customStyle="1" w:styleId="ConstantTok" w:type="character">
     <w:name w:val="ConstantTok"/>
     <w:basedOn w:val="VerbatimChar"/>
     <w:rPr>
       <w:color w:val="880000"/>
     </w:rPr>
   </w:style>
-  <w:style w:type="character" w:customStyle="1" w:styleId="CharTok">
+  <w:style w:customStyle="1" w:styleId="CharTok" w:type="character">
     <w:name w:val="CharTok"/>
     <w:basedOn w:val="VerbatimChar"/>
     <w:rPr>
       <w:color w:val="4070a0"/>
     </w:rPr>
   </w:style>
-  <w:style w:type="character" w:customStyle="1" w:styleId="SpecialCharTok">
+  <w:style w:customStyle="1" w:styleId="SpecialCharTok" w:type="character">
     <w:name w:val="SpecialCharTok"/>
     <w:basedOn w:val="VerbatimChar"/>
     <w:rPr>
       <w:color w:val="4070a0"/>
     </w:rPr>
   </w:style>
-  <w:style w:type="character" w:customStyle="1" w:styleId="StringTok">
+  <w:style w:customStyle="1" w:styleId="StringTok" w:type="character">
     <w:name w:val="StringTok"/>
     <w:basedOn w:val="VerbatimChar"/>
     <w:rPr>
       <w:color w:val="4070a0"/>
     </w:rPr>
   </w:style>
-  <w:style w:type="character" w:customStyle="1" w:styleId="VerbatimStringTok">
+  <w:style w:customStyle="1" w:styleId="VerbatimStringTok" w:type="character">
     <w:name w:val="VerbatimStringTok"/>
     <w:basedOn w:val="VerbatimChar"/>
     <w:rPr>
       <w:color w:val="4070a0"/>
     </w:rPr>
   </w:style>
-  <w:style w:type="character" w:customStyle="1" w:styleId="SpecialStringTok">
+  <w:style w:customStyle="1" w:styleId="SpecialStringTok" w:type="character">
     <w:name w:val="SpecialStringTok"/>
     <w:basedOn w:val="VerbatimChar"/>
     <w:rPr>
       <w:color w:val="bb6688"/>
     </w:rPr>
   </w:style>
-  <w:style w:type="character" w:customStyle="1" w:styleId="ImportTok">
+  <w:style w:customStyle="1" w:styleId="ImportTok" w:type="character">
     <w:name w:val="ImportTok"/>
     <w:basedOn w:val="VerbatimChar"/>
     <w:rPr>
@@ -1962,7 +2697,7 @@
       <w:color w:val="008000"/>
     </w:rPr>
   </w:style>
-  <w:style w:type="character" w:customStyle="1" w:styleId="CommentTok">
+  <w:style w:customStyle="1" w:styleId="CommentTok" w:type="character">
     <w:name w:val="CommentTok"/>
     <w:basedOn w:val="VerbatimChar"/>
     <w:rPr>
@@ -1970,7 +2705,7 @@
       <w:color w:val="60a0b0"/>
     </w:rPr>
   </w:style>
-  <w:style w:type="character" w:customStyle="1" w:styleId="DocumentationTok">
+  <w:style w:customStyle="1" w:styleId="DocumentationTok" w:type="character">
     <w:name w:val="DocumentationTok"/>
     <w:basedOn w:val="VerbatimChar"/>
     <w:rPr>
@@ -1978,7 +2713,7 @@
       <w:color w:val="ba2121"/>
     </w:rPr>
   </w:style>
-  <w:style w:type="character" w:customStyle="1" w:styleId="AnnotationTok">
+  <w:style w:customStyle="1" w:styleId="AnnotationTok" w:type="character">
     <w:name w:val="AnnotationTok"/>
     <w:basedOn w:val="VerbatimChar"/>
     <w:rPr>
@@ -1987,7 +2722,7 @@
       <w:color w:val="60a0b0"/>
     </w:rPr>
   </w:style>
-  <w:style w:type="character" w:customStyle="1" w:styleId="CommentVarTok">
+  <w:style w:customStyle="1" w:styleId="CommentVarTok" w:type="character">
     <w:name w:val="CommentVarTok"/>
     <w:basedOn w:val="VerbatimChar"/>
     <w:rPr>
@@ -1996,28 +2731,28 @@
       <w:color w:val="60a0b0"/>
     </w:rPr>
   </w:style>
-  <w:style w:type="character" w:customStyle="1" w:styleId="OtherTok">
+  <w:style w:customStyle="1" w:styleId="OtherTok" w:type="character">
     <w:name w:val="OtherTok"/>
     <w:basedOn w:val="VerbatimChar"/>
     <w:rPr>
       <w:color w:val="007020"/>
     </w:rPr>
   </w:style>
-  <w:style w:type="character" w:customStyle="1" w:styleId="FunctionTok">
+  <w:style w:customStyle="1" w:styleId="FunctionTok" w:type="character">
     <w:name w:val="FunctionTok"/>
     <w:basedOn w:val="VerbatimChar"/>
     <w:rPr>
       <w:color w:val="06287e"/>
     </w:rPr>
   </w:style>
-  <w:style w:type="character" w:customStyle="1" w:styleId="VariableTok">
+  <w:style w:customStyle="1" w:styleId="VariableTok" w:type="character">
     <w:name w:val="VariableTok"/>
     <w:basedOn w:val="VerbatimChar"/>
     <w:rPr>
       <w:color w:val="19177c"/>
     </w:rPr>
   </w:style>
-  <w:style w:type="character" w:customStyle="1" w:styleId="ControlFlowTok">
+  <w:style w:customStyle="1" w:styleId="ControlFlowTok" w:type="character">
     <w:name w:val="ControlFlowTok"/>
     <w:basedOn w:val="VerbatimChar"/>
     <w:rPr>
@@ -2025,45 +2760,45 @@
       <w:color w:val="007020"/>
     </w:rPr>
   </w:style>
-  <w:style w:type="character" w:customStyle="1" w:styleId="OperatorTok">
+  <w:style w:customStyle="1" w:styleId="OperatorTok" w:type="character">
     <w:name w:val="OperatorTok"/>
     <w:basedOn w:val="VerbatimChar"/>
     <w:rPr>
       <w:color w:val="666666"/>
     </w:rPr>
   </w:style>
-  <w:style w:type="character" w:customStyle="1" w:styleId="BuiltInTok">
+  <w:style w:customStyle="1" w:styleId="BuiltInTok" w:type="character">
     <w:name w:val="BuiltInTok"/>
     <w:basedOn w:val="VerbatimChar"/>
     <w:rPr>
       <w:color w:val="008000"/>
     </w:rPr>
   </w:style>
-  <w:style w:type="character" w:customStyle="1" w:styleId="ExtensionTok">
+  <w:style w:customStyle="1" w:styleId="ExtensionTok" w:type="character">
     <w:name w:val="ExtensionTok"/>
     <w:basedOn w:val="VerbatimChar"/>
     <w:rPr/>
   </w:style>
-  <w:style w:type="character" w:customStyle="1" w:styleId="PreprocessorTok">
+  <w:style w:customStyle="1" w:styleId="PreprocessorTok" w:type="character">
     <w:name w:val="PreprocessorTok"/>
     <w:basedOn w:val="VerbatimChar"/>
     <w:rPr>
       <w:color w:val="bc7a00"/>
     </w:rPr>
   </w:style>
-  <w:style w:type="character" w:customStyle="1" w:styleId="AttributeTok">
+  <w:style w:customStyle="1" w:styleId="AttributeTok" w:type="character">
     <w:name w:val="AttributeTok"/>
     <w:basedOn w:val="VerbatimChar"/>
     <w:rPr>
       <w:color w:val="7d9029"/>
     </w:rPr>
   </w:style>
-  <w:style w:type="character" w:customStyle="1" w:styleId="RegionMarkerTok">
+  <w:style w:customStyle="1" w:styleId="RegionMarkerTok" w:type="character">
     <w:name w:val="RegionMarkerTok"/>
     <w:basedOn w:val="VerbatimChar"/>
     <w:rPr/>
   </w:style>
-  <w:style w:type="character" w:customStyle="1" w:styleId="InformationTok">
+  <w:style w:customStyle="1" w:styleId="InformationTok" w:type="character">
     <w:name w:val="InformationTok"/>
     <w:basedOn w:val="VerbatimChar"/>
     <w:rPr>
@@ -2072,7 +2807,7 @@
       <w:color w:val="60a0b0"/>
     </w:rPr>
   </w:style>
-  <w:style w:type="character" w:customStyle="1" w:styleId="WarningTok">
+  <w:style w:customStyle="1" w:styleId="WarningTok" w:type="character">
     <w:name w:val="WarningTok"/>
     <w:basedOn w:val="VerbatimChar"/>
     <w:rPr>
@@ -2081,7 +2816,7 @@
       <w:color w:val="60a0b0"/>
     </w:rPr>
   </w:style>
-  <w:style w:type="character" w:customStyle="1" w:styleId="AlertTok">
+  <w:style w:customStyle="1" w:styleId="AlertTok" w:type="character">
     <w:name w:val="AlertTok"/>
     <w:basedOn w:val="VerbatimChar"/>
     <w:rPr>
@@ -2089,7 +2824,7 @@
       <w:color w:val="ff0000"/>
     </w:rPr>
   </w:style>
-  <w:style w:type="character" w:customStyle="1" w:styleId="ErrorTok">
+  <w:style w:customStyle="1" w:styleId="ErrorTok" w:type="character">
     <w:name w:val="ErrorTok"/>
     <w:basedOn w:val="VerbatimChar"/>
     <w:rPr>
@@ -2097,7 +2832,7 @@
       <w:color w:val="ff0000"/>
     </w:rPr>
   </w:style>
-  <w:style w:type="character" w:customStyle="1" w:styleId="NormalTok">
+  <w:style w:customStyle="1" w:styleId="NormalTok" w:type="character">
     <w:name w:val="NormalTok"/>
     <w:basedOn w:val="VerbatimChar"/>
     <w:rPr/>

</xml_diff>

<commit_message>
Restore offline sysadmin workshop track
</commit_message>
<xml_diff>
--- a/guides/Attendee Guide - 10 min talk 50 min handson.docx
+++ b/guides/Attendee Guide - 10 min talk 50 min handson.docx
@@ -2,7 +2,7 @@
 <file path=word/document.xml><?xml version="1.0" encoding="utf-8"?>
 <w:document xmlns:w="http://schemas.openxmlformats.org/wordprocessingml/2006/main" xmlns:m="http://schemas.openxmlformats.org/officeDocument/2006/math" xmlns:r="http://schemas.openxmlformats.org/officeDocument/2006/relationships" xmlns:o="urn:schemas-microsoft-com:office:office" xmlns:v="urn:schemas-microsoft-com:vml" xmlns:w10="urn:schemas-microsoft-com:office:word" xmlns:a="http://schemas.openxmlformats.org/drawingml/2006/main" xmlns:pic="http://schemas.openxmlformats.org/drawingml/2006/picture" xmlns:wp="http://schemas.openxmlformats.org/drawingml/2006/wordprocessingDrawing">
   <w:body>
-    <w:bookmarkStart w:id="26" w:name="github-copilot-for-non-coders"/>
+    <w:bookmarkStart w:id="17" w:name="github-copilot-for-non-coders"/>
     <w:p>
       <w:pPr>
         <w:pStyle w:val="Heading1"/>
@@ -11,13 +11,13 @@
         <w:t xml:space="preserve">GitHub Copilot for Non-Coders</w:t>
       </w:r>
     </w:p>
-    <w:bookmarkStart w:id="9" w:name="X60b4453f91226ad123f63dfb77b442365920e08"/>
+    <w:bookmarkStart w:id="9" w:name="Xc3628f91abdfcfe19d922949dec9f9a8ca9120d"/>
     <w:p>
       <w:pPr>
         <w:pStyle w:val="Heading2"/>
       </w:pPr>
       <w:r>
-        <w:t xml:space="preserve">Shared facilitator and attendee guide - 10-minute intro + 50-minute follow-along</w:t>
+        <w:t xml:space="preserve">Shared facilitator and attendee guide - 10-minute intro + 50-minute hands-on</w:t>
       </w:r>
     </w:p>
     <w:p>
@@ -25,65 +25,7 @@
         <w:pStyle w:val="FirstParagraph"/>
       </w:pPr>
       <w:r>
-        <w:t xml:space="preserve">The facilitator and attendees use this same guide. During the hands-on, the</w:t>
-      </w:r>
-      <w:r>
-        <w:t xml:space="preserve"> </w:t>
-      </w:r>
-      <w:r>
-        <w:t xml:space="preserve">facilitator performs each prompt while attendees enter the same prompt and wait</w:t>
-      </w:r>
-      <w:r>
-        <w:t xml:space="preserve"> </w:t>
-      </w:r>
-      <w:r>
-        <w:t xml:space="preserve">at each checkpoint. No Azure subscription, cloud deployment, upload, cost, or</w:t>
-      </w:r>
-      <w:r>
-        <w:t xml:space="preserve"> </w:t>
-      </w:r>
-      <w:r>
-        <w:t xml:space="preserve">teardown is part of this workshop.</w:t>
-      </w:r>
-    </w:p>
-    <w:bookmarkEnd w:id="9"/>
-    <w:bookmarkStart w:id="10" w:name="outcome"/>
-    <w:p>
-      <w:pPr>
-        <w:pStyle w:val="Heading2"/>
-      </w:pPr>
-      <w:r>
-        <w:t xml:space="preserve">Outcome</w:t>
-      </w:r>
-    </w:p>
-    <w:p>
-      <w:pPr>
-        <w:pStyle w:val="FirstParagraph"/>
-      </w:pPr>
-      <w:r>
-        <w:t xml:space="preserve">Together, the group turns three messy CSV exports into a clean dataset, answers</w:t>
-      </w:r>
-      <w:r>
-        <w:t xml:space="preserve"> </w:t>
-      </w:r>
-      <w:r>
-        <w:t xml:space="preserve">business questions, validates the numbers, and creates a local handoff package.</w:t>
-      </w:r>
-      <w:r>
-        <w:t xml:space="preserve"> </w:t>
-      </w:r>
-      <w:r>
-        <w:t xml:space="preserve">No coding experience is required.</w:t>
-      </w:r>
-    </w:p>
-    <w:bookmarkEnd w:id="10"/>
-    <w:bookmarkStart w:id="12" w:name="before-the-session"/>
-    <w:p>
-      <w:pPr>
-        <w:pStyle w:val="Heading2"/>
-      </w:pPr>
-      <w:r>
-        <w:t xml:space="preserve">Before the session</w:t>
+        <w:t xml:space="preserve">The workshop has two separate role-based tracks:</w:t>
       </w:r>
     </w:p>
     <w:p>
@@ -95,7 +37,23 @@
         </w:numPr>
       </w:pPr>
       <w:r>
-        <w:t xml:space="preserve">Confirm every participant has a GitHub account with Copilot access.</w:t>
+        <w:rPr>
+          <w:b/>
+          <w:bCs/>
+        </w:rPr>
+        <w:t xml:space="preserve">Systems Administrator:</w:t>
+      </w:r>
+      <w:r>
+        <w:t xml:space="preserve"> </w:t>
+      </w:r>
+      <w:r>
+        <w:t xml:space="preserve">audit local server inventory and service exports,</w:t>
+      </w:r>
+      <w:r>
+        <w:t xml:space="preserve"> </w:t>
+      </w:r>
+      <w:r>
+        <w:t xml:space="preserve">prioritise remediation, validate the findings, and package a local handoff.</w:t>
       </w:r>
     </w:p>
     <w:p>
@@ -107,7 +65,73 @@
         </w:numPr>
       </w:pPr>
       <w:r>
-        <w:t xml:space="preserve">Use GitHub Codespaces, or the GitHub Copilot app with Git and Python 3.</w:t>
+        <w:rPr>
+          <w:b/>
+          <w:bCs/>
+        </w:rPr>
+        <w:t xml:space="preserve">Data Engineer:</w:t>
+      </w:r>
+      <w:r>
+        <w:t xml:space="preserve"> </w:t>
+      </w:r>
+      <w:r>
+        <w:t xml:space="preserve">clean local sales exports, answer business questions,</w:t>
+      </w:r>
+      <w:r>
+        <w:t xml:space="preserve"> </w:t>
+      </w:r>
+      <w:r>
+        <w:t xml:space="preserve">validate the numbers, and package a local handoff.</w:t>
+      </w:r>
+    </w:p>
+    <w:p>
+      <w:pPr>
+        <w:pStyle w:val="FirstParagraph"/>
+      </w:pPr>
+      <w:r>
+        <w:t xml:space="preserve">Before the session, the facilitator selects the track for that delivery. The</w:t>
+      </w:r>
+      <w:r>
+        <w:t xml:space="preserve"> </w:t>
+      </w:r>
+      <w:r>
+        <w:t xml:space="preserve">facilitator and attendees then use the same track instructions, enter the same</w:t>
+      </w:r>
+      <w:r>
+        <w:t xml:space="preserve"> </w:t>
+      </w:r>
+      <w:r>
+        <w:t xml:space="preserve">prompts, and pause at the same checkpoints. Do not combine or switch tracks</w:t>
+      </w:r>
+      <w:r>
+        <w:t xml:space="preserve"> </w:t>
+      </w:r>
+      <w:r>
+        <w:t xml:space="preserve">during the 50-minute lab.</w:t>
+      </w:r>
+    </w:p>
+    <w:p>
+      <w:pPr>
+        <w:pStyle w:val="BodyText"/>
+      </w:pPr>
+      <w:r>
+        <w:t xml:space="preserve">No Azure subscription, cloud deployment, remote connection, upload, cost, or</w:t>
+      </w:r>
+      <w:r>
+        <w:t xml:space="preserve"> </w:t>
+      </w:r>
+      <w:r>
+        <w:t xml:space="preserve">teardown is required for either track.</w:t>
+      </w:r>
+    </w:p>
+    <w:bookmarkEnd w:id="9"/>
+    <w:bookmarkStart w:id="11" w:name="before-the-session"/>
+    <w:p>
+      <w:pPr>
+        <w:pStyle w:val="Heading2"/>
+      </w:pPr>
+      <w:r>
+        <w:t xml:space="preserve">Before the session</w:t>
       </w:r>
     </w:p>
     <w:p>
@@ -115,16 +139,40 @@
         <w:pStyle w:val="Compact"/>
         <w:numPr>
           <w:ilvl w:val="0"/>
-          <w:numId w:val="1001"/>
+          <w:numId w:val="1002"/>
         </w:numPr>
       </w:pPr>
       <w:r>
+        <w:t xml:space="preserve">Confirm everyone has a GitHub account with Copilot access.</w:t>
+      </w:r>
+    </w:p>
+    <w:p>
+      <w:pPr>
+        <w:pStyle w:val="Compact"/>
+        <w:numPr>
+          <w:ilvl w:val="0"/>
+          <w:numId w:val="1002"/>
+        </w:numPr>
+      </w:pPr>
+      <w:r>
+        <w:t xml:space="preserve">Use GitHub Codespaces, or the GitHub Copilot app with Git and Python 3.</w:t>
+      </w:r>
+    </w:p>
+    <w:p>
+      <w:pPr>
+        <w:pStyle w:val="Compact"/>
+        <w:numPr>
+          <w:ilvl w:val="0"/>
+          <w:numId w:val="1002"/>
+        </w:numPr>
+      </w:pPr>
+      <w:r>
         <w:t xml:space="preserve">Open</w:t>
       </w:r>
       <w:r>
         <w:t xml:space="preserve"> </w:t>
       </w:r>
-      <w:hyperlink r:id="rId11">
+      <w:hyperlink r:id="rId10">
         <w:r>
           <w:rPr>
             <w:rStyle w:val="Hyperlink"/>
@@ -141,11 +189,26 @@
         <w:pStyle w:val="Compact"/>
         <w:numPr>
           <w:ilvl w:val="0"/>
-          <w:numId w:val="1001"/>
+          <w:numId w:val="1002"/>
         </w:numPr>
       </w:pPr>
       <w:r>
-        <w:t xml:space="preserve">Open</w:t>
+        <w:t xml:space="preserve">Select either</w:t>
+      </w:r>
+      <w:r>
+        <w:t xml:space="preserve"> </w:t>
+      </w:r>
+      <w:r>
+        <w:rPr>
+          <w:rStyle w:val="VerbatimChar"/>
+        </w:rPr>
+        <w:t xml:space="preserve">labs/systems-engineer/LAB.md</w:t>
+      </w:r>
+      <w:r>
+        <w:t xml:space="preserve"> </w:t>
+      </w:r>
+      <w:r>
+        <w:t xml:space="preserve">or</w:t>
       </w:r>
       <w:r>
         <w:t xml:space="preserve"> </w:t>
@@ -160,7 +223,7 @@
         <w:t xml:space="preserve"> </w:t>
       </w:r>
       <w:r>
-        <w:t xml:space="preserve">but do not begin until the facilitator does.</w:t>
+        <w:t xml:space="preserve">for the delivery.</w:t>
       </w:r>
     </w:p>
     <w:p>
@@ -168,11 +231,11 @@
         <w:pStyle w:val="Compact"/>
         <w:numPr>
           <w:ilvl w:val="0"/>
-          <w:numId w:val="1001"/>
+          <w:numId w:val="1002"/>
         </w:numPr>
       </w:pPr>
       <w:r>
-        <w:t xml:space="preserve">The facilitator should open the same repository and use a clean workspace.</w:t>
+        <w:t xml:space="preserve">The facilitator opens the same lab in a clean workspace.</w:t>
       </w:r>
     </w:p>
     <w:p>
@@ -180,15 +243,15 @@
         <w:pStyle w:val="Compact"/>
         <w:numPr>
           <w:ilvl w:val="0"/>
-          <w:numId w:val="1001"/>
+          <w:numId w:val="1002"/>
         </w:numPr>
       </w:pPr>
       <w:r>
-        <w:t xml:space="preserve">Do not use real customer data, secrets, or confidential information.</w:t>
-      </w:r>
-    </w:p>
-    <w:bookmarkEnd w:id="12"/>
-    <w:bookmarkStart w:id="13" w:name="run-of-show"/>
+        <w:t xml:space="preserve">Use only the fictitious source data included in the selected lab.</w:t>
+      </w:r>
+    </w:p>
+    <w:bookmarkEnd w:id="11"/>
+    <w:bookmarkStart w:id="12" w:name="run-of-show"/>
     <w:p>
       <w:pPr>
         <w:pStyle w:val="Heading2"/>
@@ -254,7 +317,7 @@
               <w:pStyle w:val="Compact"/>
             </w:pPr>
             <w:r>
-              <w:t xml:space="preserve">Facilitator gives the existing short introduction. Attendees open the repository and lab.</w:t>
+              <w:t xml:space="preserve">Facilitator gives the existing short introduction. Attendees open the repository and selected lab.</w:t>
             </w:r>
           </w:p>
         </w:tc>
@@ -278,7 +341,7 @@
               <w:pStyle w:val="Compact"/>
             </w:pPr>
             <w:r>
-              <w:t xml:space="preserve">Everyone inspects the three source files with the same prompt.</w:t>
+              <w:t xml:space="preserve">Everyone inspects the selected track’s source files and agrees on a plan.</w:t>
             </w:r>
           </w:p>
         </w:tc>
@@ -291,7 +354,7 @@
               <w:pStyle w:val="Compact"/>
             </w:pPr>
             <w:r>
-              <w:t xml:space="preserve">17-27</w:t>
+              <w:t xml:space="preserve">17-28</w:t>
             </w:r>
           </w:p>
         </w:tc>
@@ -302,7 +365,7 @@
               <w:pStyle w:val="Compact"/>
             </w:pPr>
             <w:r>
-              <w:t xml:space="preserve">Everyone creates and runs the cleaning script.</w:t>
+              <w:t xml:space="preserve">Everyone creates and runs the local processing or audit script.</w:t>
             </w:r>
           </w:p>
         </w:tc>
@@ -315,7 +378,7 @@
               <w:pStyle w:val="Compact"/>
             </w:pPr>
             <w:r>
-              <w:t xml:space="preserve">27-37</w:t>
+              <w:t xml:space="preserve">28-38</w:t>
             </w:r>
           </w:p>
         </w:tc>
@@ -326,7 +389,7 @@
               <w:pStyle w:val="Compact"/>
             </w:pPr>
             <w:r>
-              <w:t xml:space="preserve">Everyone runs the business analysis.</w:t>
+              <w:t xml:space="preserve">Everyone produces role-specific analysis or remediation output.</w:t>
             </w:r>
           </w:p>
         </w:tc>
@@ -339,7 +402,7 @@
               <w:pStyle w:val="Compact"/>
             </w:pPr>
             <w:r>
-              <w:t xml:space="preserve">37-47</w:t>
+              <w:t xml:space="preserve">38-47</w:t>
             </w:r>
           </w:p>
         </w:tc>
@@ -350,7 +413,7 @@
               <w:pStyle w:val="Compact"/>
             </w:pPr>
             <w:r>
-              <w:t xml:space="preserve">Everyone validates row counts, totals, dates, duplicates, and missing values.</w:t>
+              <w:t xml:space="preserve">Everyone troubleshoots or validates the output against source evidence.</w:t>
             </w:r>
           </w:p>
         </w:tc>
@@ -363,7 +426,7 @@
               <w:pStyle w:val="Compact"/>
             </w:pPr>
             <w:r>
-              <w:t xml:space="preserve">47-54</w:t>
+              <w:t xml:space="preserve">47-60</w:t>
             </w:r>
           </w:p>
         </w:tc>
@@ -374,38 +437,14 @@
               <w:pStyle w:val="Compact"/>
             </w:pPr>
             <w:r>
-              <w:t xml:space="preserve">Everyone improves the manager handoff with evidence-based findings.</w:t>
-            </w:r>
-          </w:p>
-        </w:tc>
-      </w:tr>
-      <w:tr>
-        <w:tc>
-          <w:tcPr/>
-          <w:p>
-            <w:pPr>
-              <w:pStyle w:val="Compact"/>
-            </w:pPr>
-            <w:r>
-              <w:t xml:space="preserve">54-60</w:t>
-            </w:r>
-          </w:p>
-        </w:tc>
-        <w:tc>
-          <w:tcPr/>
-          <w:p>
-            <w:pPr>
-              <w:pStyle w:val="Compact"/>
-            </w:pPr>
-            <w:r>
-              <w:t xml:space="preserve">Everyone creates and inspects the local handoff package.</w:t>
+              <w:t xml:space="preserve">Everyone completes validation and creates the local handoff package.</w:t>
             </w:r>
           </w:p>
         </w:tc>
       </w:tr>
     </w:tbl>
-    <w:bookmarkEnd w:id="13"/>
-    <w:bookmarkStart w:id="14" w:name="the-loop"/>
+    <w:bookmarkEnd w:id="12"/>
+    <w:bookmarkStart w:id="13" w:name="the-loop"/>
     <w:p>
       <w:pPr>
         <w:pStyle w:val="Heading2"/>
@@ -420,149 +459,6 @@
       </w:pPr>
       <w:r>
         <w:t xml:space="preserve">Repeat this rhythm for every step:</w:t>
-      </w:r>
-    </w:p>
-    <w:p>
-      <w:pPr>
-        <w:pStyle w:val="Compact"/>
-        <w:numPr>
-          <w:ilvl w:val="0"/>
-          <w:numId w:val="1002"/>
-        </w:numPr>
-      </w:pPr>
-      <w:r>
-        <w:rPr>
-          <w:b/>
-          <w:bCs/>
-        </w:rPr>
-        <w:t xml:space="preserve">Prompt:</w:t>
-      </w:r>
-      <w:r>
-        <w:t xml:space="preserve"> </w:t>
-      </w:r>
-      <w:r>
-        <w:t xml:space="preserve">enter the quoted prompt in Copilot.</w:t>
-      </w:r>
-    </w:p>
-    <w:p>
-      <w:pPr>
-        <w:pStyle w:val="Compact"/>
-        <w:numPr>
-          <w:ilvl w:val="0"/>
-          <w:numId w:val="1002"/>
-        </w:numPr>
-      </w:pPr>
-      <w:r>
-        <w:rPr>
-          <w:b/>
-          <w:bCs/>
-        </w:rPr>
-        <w:t xml:space="preserve">Suggestion:</w:t>
-      </w:r>
-      <w:r>
-        <w:t xml:space="preserve"> </w:t>
-      </w:r>
-      <w:r>
-        <w:t xml:space="preserve">read what Copilot proposes.</w:t>
-      </w:r>
-    </w:p>
-    <w:p>
-      <w:pPr>
-        <w:pStyle w:val="Compact"/>
-        <w:numPr>
-          <w:ilvl w:val="0"/>
-          <w:numId w:val="1002"/>
-        </w:numPr>
-      </w:pPr>
-      <w:r>
-        <w:rPr>
-          <w:b/>
-          <w:bCs/>
-        </w:rPr>
-        <w:t xml:space="preserve">Run:</w:t>
-      </w:r>
-      <w:r>
-        <w:t xml:space="preserve"> </w:t>
-      </w:r>
-      <w:r>
-        <w:t xml:space="preserve">approve only actions you understand.</w:t>
-      </w:r>
-    </w:p>
-    <w:p>
-      <w:pPr>
-        <w:pStyle w:val="Compact"/>
-        <w:numPr>
-          <w:ilvl w:val="0"/>
-          <w:numId w:val="1002"/>
-        </w:numPr>
-      </w:pPr>
-      <w:r>
-        <w:rPr>
-          <w:b/>
-          <w:bCs/>
-        </w:rPr>
-        <w:t xml:space="preserve">Refine:</w:t>
-      </w:r>
-      <w:r>
-        <w:t xml:space="preserve"> </w:t>
-      </w:r>
-      <w:r>
-        <w:t xml:space="preserve">ask for one change at a time.</w:t>
-      </w:r>
-    </w:p>
-    <w:p>
-      <w:pPr>
-        <w:pStyle w:val="Compact"/>
-        <w:numPr>
-          <w:ilvl w:val="0"/>
-          <w:numId w:val="1002"/>
-        </w:numPr>
-      </w:pPr>
-      <w:r>
-        <w:rPr>
-          <w:b/>
-          <w:bCs/>
-        </w:rPr>
-        <w:t xml:space="preserve">Sanity-check:</w:t>
-      </w:r>
-      <w:r>
-        <w:t xml:space="preserve"> </w:t>
-      </w:r>
-      <w:r>
-        <w:t xml:space="preserve">verify the files and numbers.</w:t>
-      </w:r>
-    </w:p>
-    <w:p>
-      <w:pPr>
-        <w:pStyle w:val="FirstParagraph"/>
-      </w:pPr>
-      <w:r>
-        <w:t xml:space="preserve">The facilitator reads each prompt aloud, enters it, and pauses. Attendees enter</w:t>
-      </w:r>
-      <w:r>
-        <w:t xml:space="preserve"> </w:t>
-      </w:r>
-      <w:r>
-        <w:t xml:space="preserve">the same prompt and do not move ahead until the facilitator reaches the checkpoint.</w:t>
-      </w:r>
-    </w:p>
-    <w:bookmarkEnd w:id="14"/>
-    <w:bookmarkStart w:id="17" w:name="setup-checkpoint"/>
-    <w:p>
-      <w:pPr>
-        <w:pStyle w:val="Heading2"/>
-      </w:pPr>
-      <w:r>
-        <w:t xml:space="preserve">Setup checkpoint</w:t>
-      </w:r>
-    </w:p>
-    <w:bookmarkStart w:id="15" w:name="github-codespaces"/>
-    <w:p>
-      <w:pPr>
-        <w:pStyle w:val="Heading3"/>
-      </w:pPr>
-      <w:r>
-        <w:t xml:space="preserve">GitHub Codespaces</w:t>
       </w:r>
     </w:p>
     <w:p>
@@ -574,20 +470,17 @@
         </w:numPr>
       </w:pPr>
       <w:r>
-        <w:t xml:space="preserve">Select</w:t>
-      </w:r>
-      <w:r>
-        <w:t xml:space="preserve"> </w:t>
-      </w:r>
-      <w:r>
         <w:rPr>
           <w:b/>
           <w:bCs/>
         </w:rPr>
-        <w:t xml:space="preserve">Code &gt; Codespaces &gt; Create codespace on main</w:t>
-      </w:r>
-      <w:r>
-        <w:t xml:space="preserve">.</w:t>
+        <w:t xml:space="preserve">Prompt:</w:t>
+      </w:r>
+      <w:r>
+        <w:t xml:space="preserve"> </w:t>
+      </w:r>
+      <w:r>
+        <w:t xml:space="preserve">enter the quoted prompt in Copilot.</w:t>
       </w:r>
     </w:p>
     <w:p>
@@ -599,35 +492,17 @@
         </w:numPr>
       </w:pPr>
       <w:r>
-        <w:t xml:space="preserve">Open</w:t>
-      </w:r>
-      <w:r>
-        <w:t xml:space="preserve"> </w:t>
-      </w:r>
-      <w:r>
         <w:rPr>
           <w:b/>
           <w:bCs/>
         </w:rPr>
-        <w:t xml:space="preserve">Terminal &gt; New Terminal</w:t>
-      </w:r>
-      <w:r>
-        <w:t xml:space="preserve"> </w:t>
-      </w:r>
-      <w:r>
-        <w:t xml:space="preserve">and run</w:t>
-      </w:r>
-      <w:r>
-        <w:t xml:space="preserve"> </w:t>
-      </w:r>
-      <w:r>
-        <w:rPr>
-          <w:rStyle w:val="VerbatimChar"/>
-        </w:rPr>
-        <w:t xml:space="preserve">copilot</w:t>
-      </w:r>
-      <w:r>
-        <w:t xml:space="preserve">.</w:t>
+        <w:t xml:space="preserve">Suggestion:</w:t>
+      </w:r>
+      <w:r>
+        <w:t xml:space="preserve"> </w:t>
+      </w:r>
+      <w:r>
+        <w:t xml:space="preserve">read what Copilot proposes.</w:t>
       </w:r>
     </w:p>
     <w:p>
@@ -639,22 +514,17 @@
         </w:numPr>
       </w:pPr>
       <w:r>
-        <w:t xml:space="preserve">Trust the folder and complete</w:t>
-      </w:r>
-      <w:r>
-        <w:t xml:space="preserve"> </w:t>
-      </w:r>
-      <w:r>
-        <w:rPr>
-          <w:rStyle w:val="VerbatimChar"/>
-        </w:rPr>
-        <w:t xml:space="preserve">/login</w:t>
-      </w:r>
-      <w:r>
-        <w:t xml:space="preserve"> </w:t>
-      </w:r>
-      <w:r>
-        <w:t xml:space="preserve">if prompted.</w:t>
+        <w:rPr>
+          <w:b/>
+          <w:bCs/>
+        </w:rPr>
+        <w:t xml:space="preserve">Run:</w:t>
+      </w:r>
+      <w:r>
+        <w:t xml:space="preserve"> </w:t>
+      </w:r>
+      <w:r>
+        <w:t xml:space="preserve">approve only actions you understand.</w:t>
       </w:r>
     </w:p>
     <w:p>
@@ -666,29 +536,72 @@
         </w:numPr>
       </w:pPr>
       <w:r>
-        <w:t xml:space="preserve">Open</w:t>
-      </w:r>
-      <w:r>
-        <w:t xml:space="preserve"> </w:t>
-      </w:r>
-      <w:r>
-        <w:rPr>
-          <w:rStyle w:val="VerbatimChar"/>
-        </w:rPr>
-        <w:t xml:space="preserve">labs/data-engineer</w:t>
-      </w:r>
-      <w:r>
-        <w:t xml:space="preserve">.</w:t>
-      </w:r>
-    </w:p>
-    <w:bookmarkEnd w:id="15"/>
-    <w:bookmarkStart w:id="16" w:name="github-copilot-app"/>
+        <w:rPr>
+          <w:b/>
+          <w:bCs/>
+        </w:rPr>
+        <w:t xml:space="preserve">Refine:</w:t>
+      </w:r>
+      <w:r>
+        <w:t xml:space="preserve"> </w:t>
+      </w:r>
+      <w:r>
+        <w:t xml:space="preserve">ask for one change at a time.</w:t>
+      </w:r>
+    </w:p>
+    <w:p>
+      <w:pPr>
+        <w:pStyle w:val="Compact"/>
+        <w:numPr>
+          <w:ilvl w:val="0"/>
+          <w:numId w:val="1003"/>
+        </w:numPr>
+      </w:pPr>
+      <w:r>
+        <w:rPr>
+          <w:b/>
+          <w:bCs/>
+        </w:rPr>
+        <w:t xml:space="preserve">Sanity-check:</w:t>
+      </w:r>
+      <w:r>
+        <w:t xml:space="preserve"> </w:t>
+      </w:r>
+      <w:r>
+        <w:t xml:space="preserve">verify the files and evidence.</w:t>
+      </w:r>
+    </w:p>
+    <w:p>
+      <w:pPr>
+        <w:pStyle w:val="FirstParagraph"/>
+      </w:pPr>
+      <w:r>
+        <w:t xml:space="preserve">The facilitator reads each prompt aloud, enters it, and pauses. Attendees enter</w:t>
+      </w:r>
+      <w:r>
+        <w:t xml:space="preserve"> </w:t>
+      </w:r>
+      <w:r>
+        <w:t xml:space="preserve">the same prompt and do not move ahead until the facilitator reaches the checkpoint.</w:t>
+      </w:r>
+    </w:p>
+    <w:bookmarkEnd w:id="13"/>
+    <w:bookmarkStart w:id="16" w:name="setup-checkpoint"/>
+    <w:p>
+      <w:pPr>
+        <w:pStyle w:val="Heading2"/>
+      </w:pPr>
+      <w:r>
+        <w:t xml:space="preserve">Setup checkpoint</w:t>
+      </w:r>
+    </w:p>
+    <w:bookmarkStart w:id="14" w:name="github-codespaces"/>
     <w:p>
       <w:pPr>
         <w:pStyle w:val="Heading3"/>
       </w:pPr>
       <w:r>
-        <w:t xml:space="preserve">GitHub Copilot app</w:t>
+        <w:t xml:space="preserve">GitHub Codespaces</w:t>
       </w:r>
     </w:p>
     <w:p>
@@ -700,22 +613,20 @@
         </w:numPr>
       </w:pPr>
       <w:r>
-        <w:t xml:space="preserve">Add</w:t>
-      </w:r>
-      <w:r>
-        <w:t xml:space="preserve"> </w:t>
-      </w:r>
-      <w:r>
-        <w:rPr>
-          <w:rStyle w:val="VerbatimChar"/>
-        </w:rPr>
-        <w:t xml:space="preserve">https://github.com/marinfrankovic/copilot-workshop-samples.git</w:t>
-      </w:r>
-      <w:r>
-        <w:t xml:space="preserve"> </w:t>
-      </w:r>
-      <w:r>
-        <w:t xml:space="preserve">as a project.</w:t>
+        <w:t xml:space="preserve">Select</w:t>
+      </w:r>
+      <w:r>
+        <w:t xml:space="preserve"> </w:t>
+      </w:r>
+      <w:r>
+        <w:rPr>
+          <w:b/>
+          <w:bCs/>
+        </w:rPr>
+        <w:t xml:space="preserve">Code &gt; Codespaces &gt; Create codespace on main</w:t>
+      </w:r>
+      <w:r>
+        <w:t xml:space="preserve">.</w:t>
       </w:r>
     </w:p>
     <w:p>
@@ -727,7 +638,35 @@
         </w:numPr>
       </w:pPr>
       <w:r>
-        <w:t xml:space="preserve">Start an Interactive session.</w:t>
+        <w:t xml:space="preserve">Open</w:t>
+      </w:r>
+      <w:r>
+        <w:t xml:space="preserve"> </w:t>
+      </w:r>
+      <w:r>
+        <w:rPr>
+          <w:b/>
+          <w:bCs/>
+        </w:rPr>
+        <w:t xml:space="preserve">Terminal &gt; New Terminal</w:t>
+      </w:r>
+      <w:r>
+        <w:t xml:space="preserve"> </w:t>
+      </w:r>
+      <w:r>
+        <w:t xml:space="preserve">and run</w:t>
+      </w:r>
+      <w:r>
+        <w:t xml:space="preserve"> </w:t>
+      </w:r>
+      <w:r>
+        <w:rPr>
+          <w:rStyle w:val="VerbatimChar"/>
+        </w:rPr>
+        <w:t xml:space="preserve">copilot</w:t>
+      </w:r>
+      <w:r>
+        <w:t xml:space="preserve">.</w:t>
       </w:r>
     </w:p>
     <w:p>
@@ -739,720 +678,44 @@
         </w:numPr>
       </w:pPr>
       <w:r>
-        <w:t xml:space="preserve">Ask Copilot to show</w:t>
-      </w:r>
-      <w:r>
-        <w:t xml:space="preserve"> </w:t>
-      </w:r>
-      <w:r>
-        <w:rPr>
-          <w:rStyle w:val="VerbatimChar"/>
-        </w:rPr>
-        <w:t xml:space="preserve">labs/data-engineer/LAB.md</w:t>
-      </w:r>
-      <w:r>
-        <w:t xml:space="preserve">.</w:t>
-      </w:r>
-    </w:p>
-    <w:p>
-      <w:pPr>
-        <w:pStyle w:val="FirstParagraph"/>
-      </w:pPr>
-      <w:r>
-        <w:rPr>
-          <w:b/>
-          <w:bCs/>
-        </w:rPr>
-        <w:t xml:space="preserve">Checkpoint:</w:t>
-      </w:r>
-      <w:r>
-        <w:t xml:space="preserve"> </w:t>
-      </w:r>
-      <w:r>
-        <w:t xml:space="preserve">everyone can see</w:t>
-      </w:r>
-      <w:r>
-        <w:t xml:space="preserve"> </w:t>
-      </w:r>
-      <w:r>
-        <w:rPr>
-          <w:rStyle w:val="VerbatimChar"/>
-        </w:rPr>
-        <w:t xml:space="preserve">sales_january.csv</w:t>
-      </w:r>
-      <w:r>
-        <w:t xml:space="preserve">,</w:t>
-      </w:r>
-      <w:r>
-        <w:t xml:space="preserve"> </w:t>
-      </w:r>
-      <w:r>
-        <w:rPr>
-          <w:rStyle w:val="VerbatimChar"/>
-        </w:rPr>
-        <w:t xml:space="preserve">sales_february.csv</w:t>
-      </w:r>
-      <w:r>
-        <w:t xml:space="preserve">, and</w:t>
-      </w:r>
-      <w:r>
-        <w:t xml:space="preserve"> </w:t>
-      </w:r>
-      <w:r>
-        <w:rPr>
-          <w:rStyle w:val="VerbatimChar"/>
-        </w:rPr>
-        <w:t xml:space="preserve">product_prices.csv</w:t>
-      </w:r>
-      <w:r>
-        <w:t xml:space="preserve">.</w:t>
-      </w:r>
-    </w:p>
-    <w:bookmarkEnd w:id="16"/>
-    <w:bookmarkEnd w:id="17"/>
-    <w:bookmarkStart w:id="18" w:name="inspect-the-source-files"/>
-    <w:p>
-      <w:pPr>
-        <w:pStyle w:val="Heading2"/>
-      </w:pPr>
-      <w:r>
-        <w:t xml:space="preserve">1. Inspect the source files</w:t>
-      </w:r>
-    </w:p>
-    <w:p>
-      <w:pPr>
-        <w:pStyle w:val="FirstParagraph"/>
-      </w:pPr>
-      <w:r>
-        <w:t xml:space="preserve">Everyone enters:</w:t>
-      </w:r>
-    </w:p>
-    <w:p>
-      <w:pPr>
-        <w:pStyle w:val="BlockText"/>
-      </w:pPr>
-      <w:r>
-        <w:t xml:space="preserve">Read the three CSV files in this folder. Do not change anything yet. In plain</w:t>
-      </w:r>
-      <w:r>
-        <w:t xml:space="preserve"> </w:t>
-      </w:r>
-      <w:r>
-        <w:t xml:space="preserve">English, list the inconsistencies that must be fixed before the sales files can</w:t>
-      </w:r>
-      <w:r>
-        <w:t xml:space="preserve"> </w:t>
-      </w:r>
-      <w:r>
-        <w:t xml:space="preserve">be combined, including column names, date formats, money values, spaces, and</w:t>
-      </w:r>
-      <w:r>
-        <w:t xml:space="preserve"> </w:t>
-      </w:r>
-      <w:r>
-        <w:t xml:space="preserve">capitalisation. Then propose a short plan.</w:t>
-      </w:r>
-    </w:p>
-    <w:p>
-      <w:pPr>
-        <w:pStyle w:val="FirstParagraph"/>
-      </w:pPr>
-      <w:r>
-        <w:rPr>
-          <w:b/>
-          <w:bCs/>
-        </w:rPr>
-        <w:t xml:space="preserve">Checkpoint:</w:t>
-      </w:r>
-      <w:r>
-        <w:t xml:space="preserve"> </w:t>
-      </w:r>
-      <w:r>
-        <w:t xml:space="preserve">compare the lists. Resolve differences before continuing.</w:t>
-      </w:r>
-    </w:p>
-    <w:bookmarkEnd w:id="18"/>
-    <w:bookmarkStart w:id="19" w:name="clean-and-combine-the-data"/>
-    <w:p>
-      <w:pPr>
-        <w:pStyle w:val="Heading2"/>
-      </w:pPr>
-      <w:r>
-        <w:t xml:space="preserve">2. Clean and combine the data</w:t>
-      </w:r>
-    </w:p>
-    <w:p>
-      <w:pPr>
-        <w:pStyle w:val="FirstParagraph"/>
-      </w:pPr>
-      <w:r>
-        <w:t xml:space="preserve">Everyone enters:</w:t>
-      </w:r>
-    </w:p>
-    <w:p>
-      <w:pPr>
-        <w:pStyle w:val="BlockText"/>
-      </w:pPr>
-      <w:r>
-        <w:t xml:space="preserve">Create a Python script named</w:t>
-      </w:r>
-      <w:r>
-        <w:t xml:space="preserve"> </w:t>
-      </w:r>
-      <w:r>
-        <w:rPr>
-          <w:rStyle w:val="VerbatimChar"/>
-        </w:rPr>
-        <w:t xml:space="preserve">clean_sales.py</w:t>
-      </w:r>
-      <w:r>
-        <w:t xml:space="preserve"> </w:t>
-      </w:r>
-      <w:r>
-        <w:t xml:space="preserve">that combines the January and</w:t>
-      </w:r>
-      <w:r>
-        <w:t xml:space="preserve"> </w:t>
-      </w:r>
-      <w:r>
-        <w:t xml:space="preserve">February sales files, fixes every issue in the plan, joins the product list,</w:t>
-      </w:r>
-      <w:r>
-        <w:t xml:space="preserve"> </w:t>
-      </w:r>
-      <w:r>
-        <w:t xml:space="preserve">and writes a new file named</w:t>
-      </w:r>
-      <w:r>
-        <w:t xml:space="preserve"> </w:t>
-      </w:r>
-      <w:r>
-        <w:rPr>
-          <w:rStyle w:val="VerbatimChar"/>
-        </w:rPr>
-        <w:t xml:space="preserve">sales_clean.csv</w:t>
-      </w:r>
-      <w:r>
-        <w:t xml:space="preserve">. Never modify the three source</w:t>
-      </w:r>
-      <w:r>
-        <w:t xml:space="preserve"> </w:t>
-      </w:r>
-      <w:r>
-        <w:t xml:space="preserve">CSV files. Explain the script in five bullets, then run it.</w:t>
-      </w:r>
-    </w:p>
-    <w:p>
-      <w:pPr>
-        <w:pStyle w:val="FirstParagraph"/>
-      </w:pPr>
-      <w:r>
-        <w:t xml:space="preserve">Read the explanation before approving the run.</w:t>
-      </w:r>
-    </w:p>
-    <w:p>
-      <w:pPr>
-        <w:pStyle w:val="BodyText"/>
-      </w:pPr>
-      <w:r>
-        <w:rPr>
-          <w:b/>
-          <w:bCs/>
-        </w:rPr>
-        <w:t xml:space="preserve">Checkpoint:</w:t>
-      </w:r>
-      <w:r>
-        <w:t xml:space="preserve"> </w:t>
-      </w:r>
-      <w:r>
-        <w:t xml:space="preserve">open</w:t>
-      </w:r>
-      <w:r>
-        <w:t xml:space="preserve"> </w:t>
-      </w:r>
-      <w:r>
-        <w:rPr>
-          <w:rStyle w:val="VerbatimChar"/>
-        </w:rPr>
-        <w:t xml:space="preserve">sales_clean.csv</w:t>
-      </w:r>
-      <w:r>
-        <w:t xml:space="preserve"> </w:t>
-      </w:r>
-      <w:r>
-        <w:t xml:space="preserve">and confirm it contains both months.</w:t>
-      </w:r>
-    </w:p>
-    <w:p>
-      <w:pPr>
-        <w:pStyle w:val="BodyText"/>
-      </w:pPr>
-      <w:r>
-        <w:t xml:space="preserve">If anyone gets an error, everyone practises the same recovery prompt:</w:t>
-      </w:r>
-    </w:p>
-    <w:p>
-      <w:pPr>
-        <w:pStyle w:val="BlockText"/>
-      </w:pPr>
-      <w:r>
-        <w:t xml:space="preserve">Explain the error in plain English. Make only the smallest necessary fix, then</w:t>
-      </w:r>
-      <w:r>
-        <w:t xml:space="preserve"> </w:t>
-      </w:r>
-      <w:r>
-        <w:t xml:space="preserve">run the script again.</w:t>
-      </w:r>
-    </w:p>
-    <w:bookmarkEnd w:id="19"/>
-    <w:bookmarkStart w:id="20" w:name="answer-business-questions"/>
-    <w:p>
-      <w:pPr>
-        <w:pStyle w:val="Heading2"/>
-      </w:pPr>
-      <w:r>
-        <w:t xml:space="preserve">3. Answer business questions</w:t>
-      </w:r>
-    </w:p>
-    <w:p>
-      <w:pPr>
-        <w:pStyle w:val="FirstParagraph"/>
-      </w:pPr>
-      <w:r>
-        <w:t xml:space="preserve">Everyone enters:</w:t>
-      </w:r>
-    </w:p>
-    <w:p>
-      <w:pPr>
-        <w:pStyle w:val="BlockText"/>
-      </w:pPr>
-      <w:r>
-        <w:t xml:space="preserve">Using</w:t>
-      </w:r>
-      <w:r>
-        <w:t xml:space="preserve"> </w:t>
-      </w:r>
-      <w:r>
-        <w:rPr>
-          <w:rStyle w:val="VerbatimChar"/>
-        </w:rPr>
-        <w:t xml:space="preserve">sales_clean.csv</w:t>
-      </w:r>
-      <w:r>
-        <w:t xml:space="preserve">, calculate total revenue by region and by month, the</w:t>
-      </w:r>
-      <w:r>
-        <w:t xml:space="preserve"> </w:t>
-      </w:r>
-      <w:r>
-        <w:t xml:space="preserve">top-selling product by revenue, and the five largest discounts from list</w:t>
-      </w:r>
-      <w:r>
-        <w:t xml:space="preserve"> </w:t>
-      </w:r>
-      <w:r>
-        <w:t xml:space="preserve">price. Run the analysis and save the results as</w:t>
-      </w:r>
-      <w:r>
-        <w:t xml:space="preserve"> </w:t>
-      </w:r>
-      <w:r>
-        <w:rPr>
-          <w:rStyle w:val="VerbatimChar"/>
-        </w:rPr>
-        <w:t xml:space="preserve">analysis.md</w:t>
-      </w:r>
-      <w:r>
-        <w:t xml:space="preserve"> </w:t>
-      </w:r>
-      <w:r>
-        <w:t xml:space="preserve">with clear tables.</w:t>
-      </w:r>
-    </w:p>
-    <w:p>
-      <w:pPr>
-        <w:pStyle w:val="FirstParagraph"/>
-      </w:pPr>
-      <w:r>
-        <w:rPr>
-          <w:b/>
-          <w:bCs/>
-        </w:rPr>
-        <w:t xml:space="preserve">Checkpoint:</w:t>
-      </w:r>
-      <w:r>
-        <w:t xml:space="preserve"> </w:t>
-      </w:r>
-      <w:r>
-        <w:t xml:space="preserve">Copilot must run the analysis and write actual results, not only</w:t>
-      </w:r>
-      <w:r>
-        <w:t xml:space="preserve"> </w:t>
-      </w:r>
-      <w:r>
-        <w:t xml:space="preserve">describe code.</w:t>
-      </w:r>
-    </w:p>
-    <w:bookmarkEnd w:id="20"/>
-    <w:bookmarkStart w:id="21" w:name="validate-the-result"/>
-    <w:p>
-      <w:pPr>
-        <w:pStyle w:val="Heading2"/>
-      </w:pPr>
-      <w:r>
-        <w:t xml:space="preserve">4. Validate the result</w:t>
-      </w:r>
-    </w:p>
-    <w:p>
-      <w:pPr>
-        <w:pStyle w:val="FirstParagraph"/>
-      </w:pPr>
-      <w:r>
-        <w:t xml:space="preserve">Everyone enters:</w:t>
-      </w:r>
-    </w:p>
-    <w:p>
-      <w:pPr>
-        <w:pStyle w:val="BlockText"/>
-      </w:pPr>
-      <w:r>
-        <w:t xml:space="preserve">Validate the cleaned data. Report the source row count, cleaned row count,</w:t>
-      </w:r>
-      <w:r>
-        <w:t xml:space="preserve"> </w:t>
-      </w:r>
-      <w:r>
-        <w:t xml:space="preserve">date range, total units, total revenue, duplicate count, missing-value count,</w:t>
-      </w:r>
-      <w:r>
-        <w:t xml:space="preserve"> </w:t>
-      </w:r>
-      <w:r>
-        <w:t xml:space="preserve">and three sample rows. Recalculate totals independently from the cleaned CSV.</w:t>
-      </w:r>
-      <w:r>
-        <w:t xml:space="preserve"> </w:t>
-      </w:r>
-      <w:r>
-        <w:t xml:space="preserve">Save the evidence as</w:t>
-      </w:r>
-      <w:r>
-        <w:t xml:space="preserve"> </w:t>
-      </w:r>
-      <w:r>
-        <w:rPr>
-          <w:rStyle w:val="VerbatimChar"/>
-        </w:rPr>
-        <w:t xml:space="preserve">data-quality-report.md</w:t>
-      </w:r>
-      <w:r>
-        <w:t xml:space="preserve">. Flag any mismatch instead of</w:t>
-      </w:r>
-      <w:r>
-        <w:t xml:space="preserve"> </w:t>
-      </w:r>
-      <w:r>
-        <w:t xml:space="preserve">hiding or guessing it.</w:t>
-      </w:r>
-    </w:p>
-    <w:p>
-      <w:pPr>
-        <w:pStyle w:val="FirstParagraph"/>
-      </w:pPr>
-      <w:r>
-        <w:rPr>
-          <w:b/>
-          <w:bCs/>
-        </w:rPr>
-        <w:t xml:space="preserve">Checkpoint:</w:t>
-      </w:r>
-      <w:r>
-        <w:t xml:space="preserve"> </w:t>
-      </w:r>
-      <w:r>
-        <w:t xml:space="preserve">compare row counts and totals with the facilitator. If a result</w:t>
-      </w:r>
-      <w:r>
-        <w:t xml:space="preserve"> </w:t>
-      </w:r>
-      <w:r>
-        <w:t xml:space="preserve">differs, ask Copilot to identify the first differing row or assumption.</w:t>
-      </w:r>
-    </w:p>
-    <w:bookmarkEnd w:id="21"/>
-    <w:bookmarkStart w:id="22" w:name="improve-the-handoff"/>
-    <w:p>
-      <w:pPr>
-        <w:pStyle w:val="Heading2"/>
-      </w:pPr>
-      <w:r>
-        <w:t xml:space="preserve">5. Improve the handoff</w:t>
-      </w:r>
-    </w:p>
-    <w:p>
-      <w:pPr>
-        <w:pStyle w:val="FirstParagraph"/>
-      </w:pPr>
-      <w:r>
-        <w:t xml:space="preserve">Everyone enters:</w:t>
-      </w:r>
-    </w:p>
-    <w:p>
-      <w:pPr>
-        <w:pStyle w:val="BlockText"/>
-      </w:pPr>
-      <w:r>
-        <w:t xml:space="preserve">Review</w:t>
-      </w:r>
-      <w:r>
-        <w:t xml:space="preserve"> </w:t>
-      </w:r>
-      <w:r>
-        <w:rPr>
-          <w:rStyle w:val="VerbatimChar"/>
-        </w:rPr>
-        <w:t xml:space="preserve">analysis.md</w:t>
-      </w:r>
-      <w:r>
-        <w:t xml:space="preserve"> </w:t>
-      </w:r>
-      <w:r>
-        <w:t xml:space="preserve">and</w:t>
-      </w:r>
-      <w:r>
-        <w:t xml:space="preserve"> </w:t>
-      </w:r>
-      <w:r>
-        <w:rPr>
-          <w:rStyle w:val="VerbatimChar"/>
-        </w:rPr>
-        <w:t xml:space="preserve">data-quality-report.md</w:t>
-      </w:r>
-      <w:r>
-        <w:t xml:space="preserve"> </w:t>
-      </w:r>
-      <w:r>
-        <w:t xml:space="preserve">for a non-technical manager.</w:t>
-      </w:r>
-      <w:r>
-        <w:t xml:space="preserve"> </w:t>
-      </w:r>
-      <w:r>
-        <w:t xml:space="preserve">Add a short executive summary to</w:t>
-      </w:r>
-      <w:r>
-        <w:t xml:space="preserve"> </w:t>
-      </w:r>
-      <w:r>
-        <w:rPr>
-          <w:rStyle w:val="VerbatimChar"/>
-        </w:rPr>
-        <w:t xml:space="preserve">analysis.md</w:t>
-      </w:r>
-      <w:r>
-        <w:t xml:space="preserve"> </w:t>
-      </w:r>
-      <w:r>
-        <w:t xml:space="preserve">with three findings and one</w:t>
-      </w:r>
-      <w:r>
-        <w:t xml:space="preserve"> </w:t>
-      </w:r>
-      <w:r>
-        <w:t xml:space="preserve">limitation. Use only facts calculated from the files; do not invent figures.</w:t>
-      </w:r>
-    </w:p>
-    <w:p>
-      <w:pPr>
-        <w:pStyle w:val="FirstParagraph"/>
-      </w:pPr>
-      <w:r>
-        <w:rPr>
-          <w:b/>
-          <w:bCs/>
-        </w:rPr>
-        <w:t xml:space="preserve">Checkpoint:</w:t>
-      </w:r>
-      <w:r>
-        <w:t xml:space="preserve"> </w:t>
-      </w:r>
-      <w:r>
-        <w:t xml:space="preserve">ask which file and calculation supports each claim.</w:t>
-      </w:r>
-    </w:p>
-    <w:bookmarkEnd w:id="22"/>
-    <w:bookmarkStart w:id="23" w:name="create-and-inspect-the-local-package"/>
-    <w:p>
-      <w:pPr>
-        <w:pStyle w:val="Heading2"/>
-      </w:pPr>
-      <w:r>
-        <w:t xml:space="preserve">6. Create and inspect the local package</w:t>
-      </w:r>
-    </w:p>
-    <w:p>
-      <w:pPr>
-        <w:pStyle w:val="FirstParagraph"/>
-      </w:pPr>
-      <w:r>
-        <w:t xml:space="preserve">Everyone enters:</w:t>
-      </w:r>
-    </w:p>
-    <w:p>
-      <w:pPr>
-        <w:pStyle w:val="BlockText"/>
-      </w:pPr>
-      <w:r>
-        <w:t xml:space="preserve">Create a local folder named</w:t>
-      </w:r>
-      <w:r>
-        <w:t xml:space="preserve"> </w:t>
-      </w:r>
-      <w:r>
-        <w:rPr>
-          <w:rStyle w:val="VerbatimChar"/>
-        </w:rPr>
-        <w:t xml:space="preserve">handoff</w:t>
-      </w:r>
-      <w:r>
-        <w:t xml:space="preserve"> </w:t>
-      </w:r>
-      <w:r>
-        <w:t xml:space="preserve">containing copies of</w:t>
-      </w:r>
-      <w:r>
-        <w:t xml:space="preserve"> </w:t>
-      </w:r>
-      <w:r>
-        <w:rPr>
-          <w:rStyle w:val="VerbatimChar"/>
-        </w:rPr>
-        <w:t xml:space="preserve">sales_clean.csv</w:t>
-      </w:r>
-      <w:r>
-        <w:t xml:space="preserve">,</w:t>
-      </w:r>
-      <w:r>
-        <w:t xml:space="preserve"> </w:t>
-      </w:r>
-      <w:r>
-        <w:rPr>
-          <w:rStyle w:val="VerbatimChar"/>
-        </w:rPr>
-        <w:t xml:space="preserve">analysis.md</w:t>
-      </w:r>
-      <w:r>
-        <w:t xml:space="preserve">, and</w:t>
-      </w:r>
-      <w:r>
-        <w:t xml:space="preserve"> </w:t>
-      </w:r>
-      <w:r>
-        <w:rPr>
-          <w:rStyle w:val="VerbatimChar"/>
-        </w:rPr>
-        <w:t xml:space="preserve">data-quality-report.md</w:t>
-      </w:r>
-      <w:r>
-        <w:t xml:space="preserve">. Add a</w:t>
-      </w:r>
-      <w:r>
-        <w:t xml:space="preserve"> </w:t>
-      </w:r>
-      <w:r>
-        <w:rPr>
-          <w:rStyle w:val="VerbatimChar"/>
-        </w:rPr>
-        <w:t xml:space="preserve">README.md</w:t>
-      </w:r>
-      <w:r>
-        <w:t xml:space="preserve"> </w:t>
-      </w:r>
-      <w:r>
-        <w:t xml:space="preserve">that explains</w:t>
-      </w:r>
-      <w:r>
-        <w:t xml:space="preserve"> </w:t>
-      </w:r>
-      <w:r>
-        <w:t xml:space="preserve">what each file contains and how to rerun</w:t>
-      </w:r>
-      <w:r>
-        <w:t xml:space="preserve"> </w:t>
-      </w:r>
-      <w:r>
-        <w:rPr>
-          <w:rStyle w:val="VerbatimChar"/>
-        </w:rPr>
-        <w:t xml:space="preserve">clean_sales.py</w:t>
-      </w:r>
-      <w:r>
-        <w:t xml:space="preserve">. Create</w:t>
-      </w:r>
-      <w:r>
-        <w:t xml:space="preserve"> </w:t>
-      </w:r>
-      <w:r>
-        <w:rPr>
-          <w:rStyle w:val="VerbatimChar"/>
-        </w:rPr>
-        <w:t xml:space="preserve">sales-handoff.zip</w:t>
-      </w:r>
-      <w:r>
-        <w:t xml:space="preserve"> </w:t>
-      </w:r>
-      <w:r>
-        <w:t xml:space="preserve">from that folder. Do not upload or send anything.</w:t>
-      </w:r>
-    </w:p>
-    <w:p>
-      <w:pPr>
-        <w:pStyle w:val="FirstParagraph"/>
-      </w:pPr>
-      <w:r>
-        <w:rPr>
-          <w:b/>
-          <w:bCs/>
-        </w:rPr>
-        <w:t xml:space="preserve">Final checkpoint:</w:t>
-      </w:r>
-      <w:r>
-        <w:t xml:space="preserve"> </w:t>
-      </w:r>
-      <w:r>
-        <w:t xml:space="preserve">the</w:t>
-      </w:r>
-      <w:r>
-        <w:t xml:space="preserve"> </w:t>
-      </w:r>
-      <w:r>
-        <w:rPr>
-          <w:rStyle w:val="VerbatimChar"/>
-        </w:rPr>
-        <w:t xml:space="preserve">handoff</w:t>
-      </w:r>
-      <w:r>
-        <w:t xml:space="preserve"> </w:t>
-      </w:r>
-      <w:r>
-        <w:t xml:space="preserve">folder contains exactly four files and the ZIP</w:t>
-      </w:r>
-      <w:r>
-        <w:t xml:space="preserve"> </w:t>
-      </w:r>
-      <w:r>
-        <w:t xml:space="preserve">exists. All outputs remain local. There is no cloud teardown.</w:t>
-      </w:r>
-    </w:p>
-    <w:bookmarkEnd w:id="23"/>
-    <w:bookmarkStart w:id="24" w:name="safety-rules"/>
-    <w:p>
-      <w:pPr>
-        <w:pStyle w:val="Heading2"/>
-      </w:pPr>
-      <w:r>
-        <w:t xml:space="preserve">Safety rules</w:t>
+        <w:t xml:space="preserve">Trust the folder and complete</w:t>
+      </w:r>
+      <w:r>
+        <w:t xml:space="preserve"> </w:t>
+      </w:r>
+      <w:r>
+        <w:rPr>
+          <w:rStyle w:val="VerbatimChar"/>
+        </w:rPr>
+        <w:t xml:space="preserve">/login</w:t>
+      </w:r>
+      <w:r>
+        <w:t xml:space="preserve"> </w:t>
+      </w:r>
+      <w:r>
+        <w:t xml:space="preserve">if prompted.</w:t>
+      </w:r>
+    </w:p>
+    <w:p>
+      <w:pPr>
+        <w:pStyle w:val="Compact"/>
+        <w:numPr>
+          <w:ilvl w:val="0"/>
+          <w:numId w:val="1004"/>
+        </w:numPr>
+      </w:pPr>
+      <w:r>
+        <w:t xml:space="preserve">Open the selected track folder.</w:t>
+      </w:r>
+    </w:p>
+    <w:bookmarkEnd w:id="14"/>
+    <w:bookmarkStart w:id="15" w:name="github-copilot-app"/>
+    <w:p>
+      <w:pPr>
+        <w:pStyle w:val="Heading3"/>
+      </w:pPr>
+      <w:r>
+        <w:t xml:space="preserve">GitHub Copilot app</w:t>
       </w:r>
     </w:p>
     <w:p>
@@ -1464,7 +727,22 @@
         </w:numPr>
       </w:pPr>
       <w:r>
-        <w:t xml:space="preserve">Read every proposed action before approving it.</w:t>
+        <w:t xml:space="preserve">Add</w:t>
+      </w:r>
+      <w:r>
+        <w:t xml:space="preserve"> </w:t>
+      </w:r>
+      <w:r>
+        <w:rPr>
+          <w:rStyle w:val="VerbatimChar"/>
+        </w:rPr>
+        <w:t xml:space="preserve">https://github.com/marinfrankovic/copilot-workshop-samples.git</w:t>
+      </w:r>
+      <w:r>
+        <w:t xml:space="preserve"> </w:t>
+      </w:r>
+      <w:r>
+        <w:t xml:space="preserve">as a project.</w:t>
       </w:r>
     </w:p>
     <w:p>
@@ -1476,7 +754,7 @@
         </w:numPr>
       </w:pPr>
       <w:r>
-        <w:t xml:space="preserve">Keep the three source CSV files unchanged.</w:t>
+        <w:t xml:space="preserve">Start an Interactive session.</w:t>
       </w:r>
     </w:p>
     <w:p>
@@ -1488,7 +766,758 @@
         </w:numPr>
       </w:pPr>
       <w:r>
-        <w:t xml:space="preserve">Never paste secrets, real customer data, or confidential information into Copilot.</w:t>
+        <w:t xml:space="preserve">Ask Copilot to show the selected track’s</w:t>
+      </w:r>
+      <w:r>
+        <w:t xml:space="preserve"> </w:t>
+      </w:r>
+      <w:r>
+        <w:rPr>
+          <w:rStyle w:val="VerbatimChar"/>
+        </w:rPr>
+        <w:t xml:space="preserve">LAB.md</w:t>
+      </w:r>
+      <w:r>
+        <w:t xml:space="preserve">.</w:t>
+      </w:r>
+    </w:p>
+    <w:p>
+      <w:pPr>
+        <w:pStyle w:val="FirstParagraph"/>
+      </w:pPr>
+      <w:r>
+        <w:t xml:space="preserve">The following sections contain both complete tracks. Use only the track selected</w:t>
+      </w:r>
+      <w:r>
+        <w:t xml:space="preserve"> </w:t>
+      </w:r>
+      <w:r>
+        <w:t xml:space="preserve">for the delivery.</w:t>
+      </w:r>
+    </w:p>
+    <w:bookmarkEnd w:id="15"/>
+    <w:bookmarkEnd w:id="16"/>
+    <w:bookmarkEnd w:id="17"/>
+    <w:bookmarkStart w:id="27" w:name="Xca3ae7ecb4428bf077aff55b69c8b0f0aaeaf89"/>
+    <w:p>
+      <w:pPr>
+        <w:pStyle w:val="Heading1"/>
+      </w:pPr>
+      <w:r>
+        <w:t xml:space="preserve">Systems Administrator lab - audit a server fleet locally</w:t>
+      </w:r>
+    </w:p>
+    <w:p>
+      <w:pPr>
+        <w:pStyle w:val="FirstParagraph"/>
+      </w:pPr>
+      <w:r>
+        <w:t xml:space="preserve">This is a separate role-based track. Follow the facilitator through each step if</w:t>
+      </w:r>
+      <w:r>
+        <w:t xml:space="preserve"> </w:t>
+      </w:r>
+      <w:r>
+        <w:t xml:space="preserve">the Systems Administrator track is selected. No Azure subscription, remote</w:t>
+      </w:r>
+      <w:r>
+        <w:t xml:space="preserve"> </w:t>
+      </w:r>
+      <w:r>
+        <w:t xml:space="preserve">server connection, or coding experience is required.</w:t>
+      </w:r>
+    </w:p>
+    <w:p>
+      <w:pPr>
+        <w:pStyle w:val="BodyText"/>
+      </w:pPr>
+      <w:r>
+        <w:rPr>
+          <w:b/>
+          <w:bCs/>
+        </w:rPr>
+        <w:t xml:space="preserve">Time:</w:t>
+      </w:r>
+      <w:r>
+        <w:t xml:space="preserve"> </w:t>
+      </w:r>
+      <w:r>
+        <w:t xml:space="preserve">50 minutes</w:t>
+      </w:r>
+    </w:p>
+    <w:bookmarkStart w:id="18" w:name="the-loop-1"/>
+    <w:p>
+      <w:pPr>
+        <w:pStyle w:val="Heading2"/>
+      </w:pPr>
+      <w:r>
+        <w:t xml:space="preserve">The loop</w:t>
+      </w:r>
+    </w:p>
+    <w:p>
+      <w:pPr>
+        <w:pStyle w:val="FirstParagraph"/>
+      </w:pPr>
+      <w:r>
+        <w:t xml:space="preserve">For every step: prompt, read the suggestion, approve the run, refine one issue,</w:t>
+      </w:r>
+      <w:r>
+        <w:t xml:space="preserve"> </w:t>
+      </w:r>
+      <w:r>
+        <w:t xml:space="preserve">and sanity-check the result. The source files must remain unchanged.</w:t>
+      </w:r>
+    </w:p>
+    <w:bookmarkEnd w:id="18"/>
+    <w:bookmarkStart w:id="19" w:name="before-the-timer-starts"/>
+    <w:p>
+      <w:pPr>
+        <w:pStyle w:val="Heading2"/>
+      </w:pPr>
+      <w:r>
+        <w:t xml:space="preserve">Before the timer starts</w:t>
+      </w:r>
+    </w:p>
+    <w:p>
+      <w:pPr>
+        <w:pStyle w:val="FirstParagraph"/>
+      </w:pPr>
+      <w:r>
+        <w:t xml:space="preserve">Open</w:t>
+      </w:r>
+      <w:r>
+        <w:t xml:space="preserve"> </w:t>
+      </w:r>
+      <w:r>
+        <w:rPr>
+          <w:rStyle w:val="VerbatimChar"/>
+        </w:rPr>
+        <w:t xml:space="preserve">labs/systems-engineer</w:t>
+      </w:r>
+      <w:r>
+        <w:t xml:space="preserve"> </w:t>
+      </w:r>
+      <w:r>
+        <w:t xml:space="preserve">and confirm Copilot can see</w:t>
+      </w:r>
+      <w:r>
+        <w:t xml:space="preserve"> </w:t>
+      </w:r>
+      <w:r>
+        <w:rPr>
+          <w:rStyle w:val="VerbatimChar"/>
+        </w:rPr>
+        <w:t xml:space="preserve">operations-brief.md</w:t>
+      </w:r>
+      <w:r>
+        <w:t xml:space="preserve">,</w:t>
+      </w:r>
+      <w:r>
+        <w:t xml:space="preserve"> </w:t>
+      </w:r>
+      <w:r>
+        <w:rPr>
+          <w:rStyle w:val="VerbatimChar"/>
+        </w:rPr>
+        <w:t xml:space="preserve">server-inventory.csv</w:t>
+      </w:r>
+      <w:r>
+        <w:t xml:space="preserve">,</w:t>
+      </w:r>
+      <w:r>
+        <w:t xml:space="preserve"> </w:t>
+      </w:r>
+      <w:r>
+        <w:rPr>
+          <w:rStyle w:val="VerbatimChar"/>
+        </w:rPr>
+        <w:t xml:space="preserve">service-status.csv</w:t>
+      </w:r>
+      <w:r>
+        <w:t xml:space="preserve">, and</w:t>
+      </w:r>
+      <w:r>
+        <w:t xml:space="preserve"> </w:t>
+      </w:r>
+      <w:r>
+        <w:rPr>
+          <w:rStyle w:val="VerbatimChar"/>
+        </w:rPr>
+        <w:t xml:space="preserve">sample-error.txt</w:t>
+      </w:r>
+      <w:r>
+        <w:t xml:space="preserve">. Wait for the facilitator before continuing.</w:t>
+      </w:r>
+    </w:p>
+    <w:bookmarkEnd w:id="19"/>
+    <w:bookmarkStart w:id="20" w:name="Xb57a6f38e63681e9a96307e505cd1ac8b2d6a1d"/>
+    <w:p>
+      <w:pPr>
+        <w:pStyle w:val="Heading2"/>
+      </w:pPr>
+      <w:r>
+        <w:t xml:space="preserve">1. Understand the operational brief (minutes 0-7)</w:t>
+      </w:r>
+    </w:p>
+    <w:p>
+      <w:pPr>
+        <w:pStyle w:val="BlockText"/>
+      </w:pPr>
+      <w:r>
+        <w:t xml:space="preserve">Read</w:t>
+      </w:r>
+      <w:r>
+        <w:t xml:space="preserve"> </w:t>
+      </w:r>
+      <w:r>
+        <w:rPr>
+          <w:rStyle w:val="VerbatimChar"/>
+        </w:rPr>
+        <w:t xml:space="preserve">operations-brief.md</w:t>
+      </w:r>
+      <w:r>
+        <w:t xml:space="preserve">,</w:t>
+      </w:r>
+      <w:r>
+        <w:t xml:space="preserve"> </w:t>
+      </w:r>
+      <w:r>
+        <w:rPr>
+          <w:rStyle w:val="VerbatimChar"/>
+        </w:rPr>
+        <w:t xml:space="preserve">server-inventory.csv</w:t>
+      </w:r>
+      <w:r>
+        <w:t xml:space="preserve">, and</w:t>
+      </w:r>
+      <w:r>
+        <w:t xml:space="preserve"> </w:t>
+      </w:r>
+      <w:r>
+        <w:rPr>
+          <w:rStyle w:val="VerbatimChar"/>
+        </w:rPr>
+        <w:t xml:space="preserve">service-status.csv</w:t>
+      </w:r>
+      <w:r>
+        <w:t xml:space="preserve">.</w:t>
+      </w:r>
+      <w:r>
+        <w:t xml:space="preserve"> </w:t>
+      </w:r>
+      <w:r>
+        <w:t xml:space="preserve">Do not change anything yet. Explain the health rules, identify the available</w:t>
+      </w:r>
+      <w:r>
+        <w:t xml:space="preserve"> </w:t>
+      </w:r>
+      <w:r>
+        <w:t xml:space="preserve">evidence, and propose a short audit plan in plain English.</w:t>
+      </w:r>
+    </w:p>
+    <w:p>
+      <w:pPr>
+        <w:pStyle w:val="FirstParagraph"/>
+      </w:pPr>
+      <w:r>
+        <w:rPr>
+          <w:b/>
+          <w:bCs/>
+        </w:rPr>
+        <w:t xml:space="preserve">Checkpoint:</w:t>
+      </w:r>
+      <w:r>
+        <w:t xml:space="preserve"> </w:t>
+      </w:r>
+      <w:r>
+        <w:t xml:space="preserve">the plan covers patch age, disk space, backup, endpoint</w:t>
+      </w:r>
+      <w:r>
+        <w:t xml:space="preserve"> </w:t>
+      </w:r>
+      <w:r>
+        <w:t xml:space="preserve">protection, service status, and startup type.</w:t>
+      </w:r>
+    </w:p>
+    <w:bookmarkEnd w:id="20"/>
+    <w:bookmarkStart w:id="21" w:name="X649e85bcb7ffca1905b0950e2d23cd4db82f208"/>
+    <w:p>
+      <w:pPr>
+        <w:pStyle w:val="Heading2"/>
+      </w:pPr>
+      <w:r>
+        <w:t xml:space="preserve">2. Build and run the local audit (minutes 7-18)</w:t>
+      </w:r>
+    </w:p>
+    <w:p>
+      <w:pPr>
+        <w:pStyle w:val="BlockText"/>
+      </w:pPr>
+      <w:r>
+        <w:t xml:space="preserve">Create</w:t>
+      </w:r>
+      <w:r>
+        <w:t xml:space="preserve"> </w:t>
+      </w:r>
+      <w:r>
+        <w:rPr>
+          <w:rStyle w:val="VerbatimChar"/>
+        </w:rPr>
+        <w:t xml:space="preserve">audit_servers.py</w:t>
+      </w:r>
+      <w:r>
+        <w:t xml:space="preserve"> </w:t>
+      </w:r>
+      <w:r>
+        <w:t xml:space="preserve">to apply every rule in</w:t>
+      </w:r>
+      <w:r>
+        <w:t xml:space="preserve"> </w:t>
+      </w:r>
+      <w:r>
+        <w:rPr>
+          <w:rStyle w:val="VerbatimChar"/>
+        </w:rPr>
+        <w:t xml:space="preserve">operations-brief.md</w:t>
+      </w:r>
+      <w:r>
+        <w:t xml:space="preserve"> </w:t>
+      </w:r>
+      <w:r>
+        <w:t xml:space="preserve">to the</w:t>
+      </w:r>
+      <w:r>
+        <w:t xml:space="preserve"> </w:t>
+      </w:r>
+      <w:r>
+        <w:t xml:space="preserve">two CSV exports. Write one row per server to</w:t>
+      </w:r>
+      <w:r>
+        <w:t xml:space="preserve"> </w:t>
+      </w:r>
+      <w:r>
+        <w:rPr>
+          <w:rStyle w:val="VerbatimChar"/>
+        </w:rPr>
+        <w:t xml:space="preserve">server-health.csv</w:t>
+      </w:r>
+      <w:r>
+        <w:t xml:space="preserve">, including</w:t>
+      </w:r>
+      <w:r>
+        <w:t xml:space="preserve"> </w:t>
+      </w:r>
+      <w:r>
+        <w:t xml:space="preserve">hostname, role, environment, owner, risk level, failed-check count, and</w:t>
+      </w:r>
+      <w:r>
+        <w:t xml:space="preserve"> </w:t>
+      </w:r>
+      <w:r>
+        <w:t xml:space="preserve">findings. Keep the source files unchanged. Explain the script in five bullets,</w:t>
+      </w:r>
+      <w:r>
+        <w:t xml:space="preserve"> </w:t>
+      </w:r>
+      <w:r>
+        <w:t xml:space="preserve">then run it.</w:t>
+      </w:r>
+    </w:p>
+    <w:p>
+      <w:pPr>
+        <w:pStyle w:val="FirstParagraph"/>
+      </w:pPr>
+      <w:r>
+        <w:rPr>
+          <w:b/>
+          <w:bCs/>
+        </w:rPr>
+        <w:t xml:space="preserve">Checkpoint:</w:t>
+      </w:r>
+      <w:r>
+        <w:t xml:space="preserve"> </w:t>
+      </w:r>
+      <w:r>
+        <w:rPr>
+          <w:rStyle w:val="VerbatimChar"/>
+        </w:rPr>
+        <w:t xml:space="preserve">server-health.csv</w:t>
+      </w:r>
+      <w:r>
+        <w:t xml:space="preserve"> </w:t>
+      </w:r>
+      <w:r>
+        <w:t xml:space="preserve">contains ten servers and includes both</w:t>
+      </w:r>
+      <w:r>
+        <w:t xml:space="preserve"> </w:t>
+      </w:r>
+      <w:r>
+        <w:t xml:space="preserve">healthy and unhealthy results.</w:t>
+      </w:r>
+    </w:p>
+    <w:bookmarkEnd w:id="21"/>
+    <w:bookmarkStart w:id="22" w:name="Xa0c587441336e290cdf7d39dd297326185c2b7f"/>
+    <w:p>
+      <w:pPr>
+        <w:pStyle w:val="Heading2"/>
+      </w:pPr>
+      <w:r>
+        <w:t xml:space="preserve">3. Create the remediation plan (minutes 18-28)</w:t>
+      </w:r>
+    </w:p>
+    <w:p>
+      <w:pPr>
+        <w:pStyle w:val="BlockText"/>
+      </w:pPr>
+      <w:r>
+        <w:t xml:space="preserve">Using</w:t>
+      </w:r>
+      <w:r>
+        <w:t xml:space="preserve"> </w:t>
+      </w:r>
+      <w:r>
+        <w:rPr>
+          <w:rStyle w:val="VerbatimChar"/>
+        </w:rPr>
+        <w:t xml:space="preserve">server-health.csv</w:t>
+      </w:r>
+      <w:r>
+        <w:t xml:space="preserve">, create</w:t>
+      </w:r>
+      <w:r>
+        <w:t xml:space="preserve"> </w:t>
+      </w:r>
+      <w:r>
+        <w:rPr>
+          <w:rStyle w:val="VerbatimChar"/>
+        </w:rPr>
+        <w:t xml:space="preserve">remediation-plan.md</w:t>
+      </w:r>
+      <w:r>
+        <w:t xml:space="preserve">. Sort servers by risk</w:t>
+      </w:r>
+      <w:r>
+        <w:t xml:space="preserve"> </w:t>
+      </w:r>
+      <w:r>
+        <w:t xml:space="preserve">and hostname, explain the evidence for each finding, recommend the next action,</w:t>
+      </w:r>
+      <w:r>
+        <w:t xml:space="preserve"> </w:t>
+      </w:r>
+      <w:r>
+        <w:t xml:space="preserve">and include the owner and maintenance window. Do not claim that any action was</w:t>
+      </w:r>
+      <w:r>
+        <w:t xml:space="preserve"> </w:t>
+      </w:r>
+      <w:r>
+        <w:t xml:space="preserve">performed.</w:t>
+      </w:r>
+    </w:p>
+    <w:p>
+      <w:pPr>
+        <w:pStyle w:val="FirstParagraph"/>
+      </w:pPr>
+      <w:r>
+        <w:rPr>
+          <w:b/>
+          <w:bCs/>
+        </w:rPr>
+        <w:t xml:space="preserve">Checkpoint:</w:t>
+      </w:r>
+      <w:r>
+        <w:t xml:space="preserve"> </w:t>
+      </w:r>
+      <w:r>
+        <w:t xml:space="preserve">critical and high-risk servers appear before healthy servers.</w:t>
+      </w:r>
+    </w:p>
+    <w:bookmarkEnd w:id="22"/>
+    <w:bookmarkStart w:id="23" w:name="practise-troubleshooting-minutes-28-36"/>
+    <w:p>
+      <w:pPr>
+        <w:pStyle w:val="Heading2"/>
+      </w:pPr>
+      <w:r>
+        <w:t xml:space="preserve">4. Practise troubleshooting (minutes 28-36)</w:t>
+      </w:r>
+    </w:p>
+    <w:p>
+      <w:pPr>
+        <w:pStyle w:val="BlockText"/>
+      </w:pPr>
+      <w:r>
+        <w:t xml:space="preserve">Read</w:t>
+      </w:r>
+      <w:r>
+        <w:t xml:space="preserve"> </w:t>
+      </w:r>
+      <w:r>
+        <w:rPr>
+          <w:rStyle w:val="VerbatimChar"/>
+        </w:rPr>
+        <w:t xml:space="preserve">sample-error.txt</w:t>
+      </w:r>
+      <w:r>
+        <w:t xml:space="preserve">. Explain the failure in plain English, identify the</w:t>
+      </w:r>
+      <w:r>
+        <w:t xml:space="preserve"> </w:t>
+      </w:r>
+      <w:r>
+        <w:t xml:space="preserve">exact mismatch that caused it, and make only the smallest correction needed in</w:t>
+      </w:r>
+      <w:r>
+        <w:t xml:space="preserve"> </w:t>
+      </w:r>
+      <w:r>
+        <w:rPr>
+          <w:rStyle w:val="VerbatimChar"/>
+        </w:rPr>
+        <w:t xml:space="preserve">audit_servers.py</w:t>
+      </w:r>
+      <w:r>
+        <w:t xml:space="preserve">. Then rerun the audit.</w:t>
+      </w:r>
+    </w:p>
+    <w:p>
+      <w:pPr>
+        <w:pStyle w:val="FirstParagraph"/>
+      </w:pPr>
+      <w:r>
+        <w:rPr>
+          <w:b/>
+          <w:bCs/>
+        </w:rPr>
+        <w:t xml:space="preserve">Checkpoint:</w:t>
+      </w:r>
+      <w:r>
+        <w:t xml:space="preserve"> </w:t>
+      </w:r>
+      <w:r>
+        <w:t xml:space="preserve">Copilot changes the incorrect field name only; it does not rename</w:t>
+      </w:r>
+      <w:r>
+        <w:t xml:space="preserve"> </w:t>
+      </w:r>
+      <w:r>
+        <w:t xml:space="preserve">the source column or replace the whole script.</w:t>
+      </w:r>
+    </w:p>
+    <w:bookmarkEnd w:id="23"/>
+    <w:bookmarkStart w:id="24" w:name="validate-the-audit-minutes-36-44"/>
+    <w:p>
+      <w:pPr>
+        <w:pStyle w:val="Heading2"/>
+      </w:pPr>
+      <w:r>
+        <w:t xml:space="preserve">5. Validate the audit (minutes 36-44)</w:t>
+      </w:r>
+    </w:p>
+    <w:p>
+      <w:pPr>
+        <w:pStyle w:val="BlockText"/>
+      </w:pPr>
+      <w:r>
+        <w:t xml:space="preserve">Independently validate the audit output. Confirm every inventory server appears</w:t>
+      </w:r>
+      <w:r>
+        <w:t xml:space="preserve"> </w:t>
+      </w:r>
+      <w:r>
+        <w:t xml:space="preserve">exactly once, risk levels match the failed-check counts, findings match the</w:t>
+      </w:r>
+      <w:r>
+        <w:t xml:space="preserve"> </w:t>
+      </w:r>
+      <w:r>
+        <w:t xml:space="preserve">source values, and no source file changed. Save the evidence as</w:t>
+      </w:r>
+      <w:r>
+        <w:t xml:space="preserve"> </w:t>
+      </w:r>
+      <w:r>
+        <w:rPr>
+          <w:rStyle w:val="VerbatimChar"/>
+        </w:rPr>
+        <w:t xml:space="preserve">validation-report.md</w:t>
+      </w:r>
+      <w:r>
+        <w:t xml:space="preserve">. Flag mismatches instead of hiding them.</w:t>
+      </w:r>
+    </w:p>
+    <w:p>
+      <w:pPr>
+        <w:pStyle w:val="FirstParagraph"/>
+      </w:pPr>
+      <w:r>
+        <w:rPr>
+          <w:b/>
+          <w:bCs/>
+        </w:rPr>
+        <w:t xml:space="preserve">Checkpoint:</w:t>
+      </w:r>
+      <w:r>
+        <w:t xml:space="preserve"> </w:t>
+      </w:r>
+      <w:r>
+        <w:t xml:space="preserve">the report states the audit date, source and output row counts,</w:t>
+      </w:r>
+      <w:r>
+        <w:t xml:space="preserve"> </w:t>
+      </w:r>
+      <w:r>
+        <w:t xml:space="preserve">duplicate count, missing-server count, and any discrepancies.</w:t>
+      </w:r>
+    </w:p>
+    <w:bookmarkEnd w:id="24"/>
+    <w:bookmarkStart w:id="25" w:name="package-the-local-handoff-minutes-44-50"/>
+    <w:p>
+      <w:pPr>
+        <w:pStyle w:val="Heading2"/>
+      </w:pPr>
+      <w:r>
+        <w:t xml:space="preserve">6. Package the local handoff (minutes 44-50)</w:t>
+      </w:r>
+    </w:p>
+    <w:p>
+      <w:pPr>
+        <w:pStyle w:val="BlockText"/>
+      </w:pPr>
+      <w:r>
+        <w:t xml:space="preserve">Create</w:t>
+      </w:r>
+      <w:r>
+        <w:t xml:space="preserve"> </w:t>
+      </w:r>
+      <w:r>
+        <w:rPr>
+          <w:rStyle w:val="VerbatimChar"/>
+        </w:rPr>
+        <w:t xml:space="preserve">sysadmin-handoff</w:t>
+      </w:r>
+      <w:r>
+        <w:t xml:space="preserve"> </w:t>
+      </w:r>
+      <w:r>
+        <w:t xml:space="preserve">containing copies of</w:t>
+      </w:r>
+      <w:r>
+        <w:t xml:space="preserve"> </w:t>
+      </w:r>
+      <w:r>
+        <w:rPr>
+          <w:rStyle w:val="VerbatimChar"/>
+        </w:rPr>
+        <w:t xml:space="preserve">server-health.csv</w:t>
+      </w:r>
+      <w:r>
+        <w:t xml:space="preserve">,</w:t>
+      </w:r>
+      <w:r>
+        <w:t xml:space="preserve"> </w:t>
+      </w:r>
+      <w:r>
+        <w:rPr>
+          <w:rStyle w:val="VerbatimChar"/>
+        </w:rPr>
+        <w:t xml:space="preserve">remediation-plan.md</w:t>
+      </w:r>
+      <w:r>
+        <w:t xml:space="preserve">, and</w:t>
+      </w:r>
+      <w:r>
+        <w:t xml:space="preserve"> </w:t>
+      </w:r>
+      <w:r>
+        <w:rPr>
+          <w:rStyle w:val="VerbatimChar"/>
+        </w:rPr>
+        <w:t xml:space="preserve">validation-report.md</w:t>
+      </w:r>
+      <w:r>
+        <w:t xml:space="preserve">. Add a</w:t>
+      </w:r>
+      <w:r>
+        <w:t xml:space="preserve"> </w:t>
+      </w:r>
+      <w:r>
+        <w:rPr>
+          <w:rStyle w:val="VerbatimChar"/>
+        </w:rPr>
+        <w:t xml:space="preserve">README.md</w:t>
+      </w:r>
+      <w:r>
+        <w:t xml:space="preserve"> </w:t>
+      </w:r>
+      <w:r>
+        <w:t xml:space="preserve">explaining</w:t>
+      </w:r>
+      <w:r>
+        <w:t xml:space="preserve"> </w:t>
+      </w:r>
+      <w:r>
+        <w:t xml:space="preserve">the files, the health rules, and how to rerun</w:t>
+      </w:r>
+      <w:r>
+        <w:t xml:space="preserve"> </w:t>
+      </w:r>
+      <w:r>
+        <w:rPr>
+          <w:rStyle w:val="VerbatimChar"/>
+        </w:rPr>
+        <w:t xml:space="preserve">audit_servers.py</w:t>
+      </w:r>
+      <w:r>
+        <w:t xml:space="preserve">. Create</w:t>
+      </w:r>
+      <w:r>
+        <w:t xml:space="preserve"> </w:t>
+      </w:r>
+      <w:r>
+        <w:rPr>
+          <w:rStyle w:val="VerbatimChar"/>
+        </w:rPr>
+        <w:t xml:space="preserve">sysadmin-handoff.zip</w:t>
+      </w:r>
+      <w:r>
+        <w:t xml:space="preserve">. Do not connect to servers or upload anything.</w:t>
+      </w:r>
+    </w:p>
+    <w:p>
+      <w:pPr>
+        <w:pStyle w:val="FirstParagraph"/>
+      </w:pPr>
+      <w:r>
+        <w:rPr>
+          <w:b/>
+          <w:bCs/>
+        </w:rPr>
+        <w:t xml:space="preserve">Final checkpoint:</w:t>
+      </w:r>
+      <w:r>
+        <w:t xml:space="preserve"> </w:t>
+      </w:r>
+      <w:r>
+        <w:t xml:space="preserve">the handoff folder contains exactly four files and the ZIP</w:t>
+      </w:r>
+      <w:r>
+        <w:t xml:space="preserve"> </w:t>
+      </w:r>
+      <w:r>
+        <w:t xml:space="preserve">exists. All work remains local.</w:t>
+      </w:r>
+    </w:p>
+    <w:bookmarkEnd w:id="25"/>
+    <w:bookmarkStart w:id="26" w:name="safety-rules"/>
+    <w:p>
+      <w:pPr>
+        <w:pStyle w:val="Heading2"/>
+      </w:pPr>
+      <w:r>
+        <w:t xml:space="preserve">Safety rules</w:t>
       </w:r>
     </w:p>
     <w:p>
@@ -1496,11 +1525,11 @@
         <w:pStyle w:val="Compact"/>
         <w:numPr>
           <w:ilvl w:val="0"/>
-          <w:numId w:val="1005"/>
+          <w:numId w:val="1006"/>
         </w:numPr>
       </w:pPr>
       <w:r>
-        <w:t xml:space="preserve">Require evidence for totals and claims. Copilot drafts; people decide.</w:t>
+        <w:t xml:space="preserve">Read every proposed action before approval.</w:t>
       </w:r>
     </w:p>
     <w:p>
@@ -1508,21 +1537,105 @@
         <w:pStyle w:val="Compact"/>
         <w:numPr>
           <w:ilvl w:val="0"/>
-          <w:numId w:val="1005"/>
+          <w:numId w:val="1006"/>
         </w:numPr>
       </w:pPr>
       <w:r>
+        <w:t xml:space="preserve">Never modify source exports or claim a remediation was performed.</w:t>
+      </w:r>
+    </w:p>
+    <w:p>
+      <w:pPr>
+        <w:pStyle w:val="Compact"/>
+        <w:numPr>
+          <w:ilvl w:val="0"/>
+          <w:numId w:val="1006"/>
+        </w:numPr>
+      </w:pPr>
+      <w:r>
+        <w:t xml:space="preserve">Never use real credentials, secrets, or customer data.</w:t>
+      </w:r>
+    </w:p>
+    <w:p>
+      <w:pPr>
+        <w:pStyle w:val="Compact"/>
+        <w:numPr>
+          <w:ilvl w:val="0"/>
+          <w:numId w:val="1006"/>
+        </w:numPr>
+      </w:pPr>
+      <w:r>
+        <w:t xml:space="preserve">Require evidence for every risk and recommendation.</w:t>
+      </w:r>
+    </w:p>
+    <w:p>
+      <w:pPr>
+        <w:pStyle w:val="Compact"/>
+        <w:numPr>
+          <w:ilvl w:val="0"/>
+          <w:numId w:val="1006"/>
+        </w:numPr>
+      </w:pPr>
+      <w:r>
         <w:t xml:space="preserve">Keep all outputs local during the workshop.</w:t>
       </w:r>
     </w:p>
-    <w:bookmarkEnd w:id="24"/>
-    <w:bookmarkStart w:id="25" w:name="wrap-up"/>
+    <w:bookmarkEnd w:id="26"/>
+    <w:bookmarkEnd w:id="27"/>
+    <w:bookmarkStart w:id="38" w:name="X5a74dd0ea8ed42067cebf65c9af6600d4d78aa8"/>
+    <w:p>
+      <w:pPr>
+        <w:pStyle w:val="Heading1"/>
+      </w:pPr>
+      <w:r>
+        <w:t xml:space="preserve">Shared follow-along lab - clean, analyse, and package data locally</w:t>
+      </w:r>
+    </w:p>
+    <w:p>
+      <w:pPr>
+        <w:pStyle w:val="FirstParagraph"/>
+      </w:pPr>
+      <w:r>
+        <w:t xml:space="preserve">The facilitator and every attendee complete these steps together. Wait for the</w:t>
+      </w:r>
+      <w:r>
+        <w:t xml:space="preserve"> </w:t>
+      </w:r>
+      <w:r>
+        <w:t xml:space="preserve">facilitator before moving to the next step. You do not need coding experience or</w:t>
+      </w:r>
+      <w:r>
+        <w:t xml:space="preserve"> </w:t>
+      </w:r>
+      <w:r>
+        <w:t xml:space="preserve">an Azure subscription.</w:t>
+      </w:r>
+    </w:p>
+    <w:p>
+      <w:pPr>
+        <w:pStyle w:val="BodyText"/>
+      </w:pPr>
+      <w:r>
+        <w:rPr>
+          <w:b/>
+          <w:bCs/>
+        </w:rPr>
+        <w:t xml:space="preserve">Time:</w:t>
+      </w:r>
+      <w:r>
+        <w:t xml:space="preserve"> </w:t>
+      </w:r>
+      <w:r>
+        <w:t xml:space="preserve">50 minutes</w:t>
+      </w:r>
+    </w:p>
+    <w:bookmarkStart w:id="28" w:name="the-loop-2"/>
     <w:p>
       <w:pPr>
         <w:pStyle w:val="Heading2"/>
       </w:pPr>
       <w:r>
-        <w:t xml:space="preserve">Wrap-up</w:t>
+        <w:t xml:space="preserve">The loop</w:t>
       </w:r>
     </w:p>
     <w:p>
@@ -1530,23 +1643,892 @@
         <w:pStyle w:val="FirstParagraph"/>
       </w:pPr>
       <w:r>
-        <w:t xml:space="preserve">The skill is not memorising Python. It is describing an outcome, reviewing the</w:t>
-      </w:r>
-      <w:r>
-        <w:t xml:space="preserve"> </w:t>
-      </w:r>
-      <w:r>
-        <w:t xml:space="preserve">proposal, running it deliberately, refining one issue at a time, and checking the</w:t>
-      </w:r>
-      <w:r>
-        <w:t xml:space="preserve"> </w:t>
-      </w:r>
-      <w:r>
-        <w:t xml:space="preserve">evidence before using the result.</w:t>
-      </w:r>
-    </w:p>
-    <w:bookmarkEnd w:id="25"/>
-    <w:bookmarkEnd w:id="26"/>
+        <w:t xml:space="preserve">For every step:</w:t>
+      </w:r>
+    </w:p>
+    <w:p>
+      <w:pPr>
+        <w:pStyle w:val="Compact"/>
+        <w:numPr>
+          <w:ilvl w:val="0"/>
+          <w:numId w:val="1007"/>
+        </w:numPr>
+      </w:pPr>
+      <w:r>
+        <w:rPr>
+          <w:b/>
+          <w:bCs/>
+        </w:rPr>
+        <w:t xml:space="preserve">Prompt:</w:t>
+      </w:r>
+      <w:r>
+        <w:t xml:space="preserve"> </w:t>
+      </w:r>
+      <w:r>
+        <w:t xml:space="preserve">enter the facilitator’s quoted prompt in Copilot.</w:t>
+      </w:r>
+    </w:p>
+    <w:p>
+      <w:pPr>
+        <w:pStyle w:val="Compact"/>
+        <w:numPr>
+          <w:ilvl w:val="0"/>
+          <w:numId w:val="1007"/>
+        </w:numPr>
+      </w:pPr>
+      <w:r>
+        <w:rPr>
+          <w:b/>
+          <w:bCs/>
+        </w:rPr>
+        <w:t xml:space="preserve">Suggestion:</w:t>
+      </w:r>
+      <w:r>
+        <w:t xml:space="preserve"> </w:t>
+      </w:r>
+      <w:r>
+        <w:t xml:space="preserve">read what Copilot proposes.</w:t>
+      </w:r>
+    </w:p>
+    <w:p>
+      <w:pPr>
+        <w:pStyle w:val="Compact"/>
+        <w:numPr>
+          <w:ilvl w:val="0"/>
+          <w:numId w:val="1007"/>
+        </w:numPr>
+      </w:pPr>
+      <w:r>
+        <w:rPr>
+          <w:b/>
+          <w:bCs/>
+        </w:rPr>
+        <w:t xml:space="preserve">Run:</w:t>
+      </w:r>
+      <w:r>
+        <w:t xml:space="preserve"> </w:t>
+      </w:r>
+      <w:r>
+        <w:t xml:space="preserve">approve only the actions you understand.</w:t>
+      </w:r>
+    </w:p>
+    <w:p>
+      <w:pPr>
+        <w:pStyle w:val="Compact"/>
+        <w:numPr>
+          <w:ilvl w:val="0"/>
+          <w:numId w:val="1007"/>
+        </w:numPr>
+      </w:pPr>
+      <w:r>
+        <w:rPr>
+          <w:b/>
+          <w:bCs/>
+        </w:rPr>
+        <w:t xml:space="preserve">Refine:</w:t>
+      </w:r>
+      <w:r>
+        <w:t xml:space="preserve"> </w:t>
+      </w:r>
+      <w:r>
+        <w:t xml:space="preserve">ask for one change at a time.</w:t>
+      </w:r>
+    </w:p>
+    <w:p>
+      <w:pPr>
+        <w:pStyle w:val="Compact"/>
+        <w:numPr>
+          <w:ilvl w:val="0"/>
+          <w:numId w:val="1007"/>
+        </w:numPr>
+      </w:pPr>
+      <w:r>
+        <w:rPr>
+          <w:b/>
+          <w:bCs/>
+        </w:rPr>
+        <w:t xml:space="preserve">Sanity-check:</w:t>
+      </w:r>
+      <w:r>
+        <w:t xml:space="preserve"> </w:t>
+      </w:r>
+      <w:r>
+        <w:t xml:space="preserve">verify the files and numbers.</w:t>
+      </w:r>
+    </w:p>
+    <w:p>
+      <w:pPr>
+        <w:pStyle w:val="FirstParagraph"/>
+      </w:pPr>
+      <w:r>
+        <w:t xml:space="preserve">All work stays in this folder. The original CSV files must remain unchanged.</w:t>
+      </w:r>
+    </w:p>
+    <w:bookmarkEnd w:id="28"/>
+    <w:bookmarkStart w:id="29" w:name="before-the-timer-starts-1"/>
+    <w:p>
+      <w:pPr>
+        <w:pStyle w:val="Heading2"/>
+      </w:pPr>
+      <w:r>
+        <w:t xml:space="preserve">Before the timer starts</w:t>
+      </w:r>
+    </w:p>
+    <w:p>
+      <w:pPr>
+        <w:pStyle w:val="Compact"/>
+        <w:numPr>
+          <w:ilvl w:val="0"/>
+          <w:numId w:val="1008"/>
+        </w:numPr>
+      </w:pPr>
+      <w:r>
+        <w:t xml:space="preserve">Open this repository in GitHub Codespaces or the GitHub Copilot app.</w:t>
+      </w:r>
+    </w:p>
+    <w:p>
+      <w:pPr>
+        <w:pStyle w:val="Compact"/>
+        <w:numPr>
+          <w:ilvl w:val="0"/>
+          <w:numId w:val="1008"/>
+        </w:numPr>
+      </w:pPr>
+      <w:r>
+        <w:t xml:space="preserve">Open</w:t>
+      </w:r>
+      <w:r>
+        <w:t xml:space="preserve"> </w:t>
+      </w:r>
+      <w:r>
+        <w:rPr>
+          <w:rStyle w:val="VerbatimChar"/>
+        </w:rPr>
+        <w:t xml:space="preserve">labs/data-engineer</w:t>
+      </w:r>
+      <w:r>
+        <w:t xml:space="preserve"> </w:t>
+      </w:r>
+      <w:r>
+        <w:t xml:space="preserve">as your working folder.</w:t>
+      </w:r>
+    </w:p>
+    <w:p>
+      <w:pPr>
+        <w:pStyle w:val="Compact"/>
+        <w:numPr>
+          <w:ilvl w:val="0"/>
+          <w:numId w:val="1008"/>
+        </w:numPr>
+      </w:pPr>
+      <w:r>
+        <w:t xml:space="preserve">Start Copilot and confirm it can see</w:t>
+      </w:r>
+      <w:r>
+        <w:t xml:space="preserve"> </w:t>
+      </w:r>
+      <w:r>
+        <w:rPr>
+          <w:rStyle w:val="VerbatimChar"/>
+        </w:rPr>
+        <w:t xml:space="preserve">sales_january.csv</w:t>
+      </w:r>
+      <w:r>
+        <w:t xml:space="preserve">,</w:t>
+      </w:r>
+      <w:r>
+        <w:t xml:space="preserve"> </w:t>
+      </w:r>
+      <w:r>
+        <w:rPr>
+          <w:rStyle w:val="VerbatimChar"/>
+        </w:rPr>
+        <w:t xml:space="preserve">sales_february.csv</w:t>
+      </w:r>
+      <w:r>
+        <w:t xml:space="preserve">, and</w:t>
+      </w:r>
+      <w:r>
+        <w:t xml:space="preserve"> </w:t>
+      </w:r>
+      <w:r>
+        <w:rPr>
+          <w:rStyle w:val="VerbatimChar"/>
+        </w:rPr>
+        <w:t xml:space="preserve">product_prices.csv</w:t>
+      </w:r>
+      <w:r>
+        <w:t xml:space="preserve">.</w:t>
+      </w:r>
+    </w:p>
+    <w:p>
+      <w:pPr>
+        <w:pStyle w:val="Compact"/>
+        <w:numPr>
+          <w:ilvl w:val="0"/>
+          <w:numId w:val="1008"/>
+        </w:numPr>
+      </w:pPr>
+      <w:r>
+        <w:t xml:space="preserve">Do not create files yet. Wait for the facilitator.</w:t>
+      </w:r>
+    </w:p>
+    <w:bookmarkEnd w:id="29"/>
+    <w:bookmarkStart w:id="30" w:name="inspect-the-source-files-minutes-0-7"/>
+    <w:p>
+      <w:pPr>
+        <w:pStyle w:val="Heading2"/>
+      </w:pPr>
+      <w:r>
+        <w:t xml:space="preserve">1. Inspect the source files (minutes 0-7)</w:t>
+      </w:r>
+    </w:p>
+    <w:p>
+      <w:pPr>
+        <w:pStyle w:val="FirstParagraph"/>
+      </w:pPr>
+      <w:r>
+        <w:t xml:space="preserve">Enter this prompt exactly as the facilitator does:</w:t>
+      </w:r>
+    </w:p>
+    <w:p>
+      <w:pPr>
+        <w:pStyle w:val="BlockText"/>
+      </w:pPr>
+      <w:r>
+        <w:t xml:space="preserve">Read the three CSV files in this folder. Do not change anything yet. In plain</w:t>
+      </w:r>
+      <w:r>
+        <w:t xml:space="preserve"> </w:t>
+      </w:r>
+      <w:r>
+        <w:t xml:space="preserve">English, list the inconsistencies that must be fixed before the sales files can</w:t>
+      </w:r>
+      <w:r>
+        <w:t xml:space="preserve"> </w:t>
+      </w:r>
+      <w:r>
+        <w:t xml:space="preserve">be combined, including column names, date formats, money values, spaces, and</w:t>
+      </w:r>
+      <w:r>
+        <w:t xml:space="preserve"> </w:t>
+      </w:r>
+      <w:r>
+        <w:t xml:space="preserve">capitalisation. Then propose a short plan.</w:t>
+      </w:r>
+    </w:p>
+    <w:p>
+      <w:pPr>
+        <w:pStyle w:val="FirstParagraph"/>
+      </w:pPr>
+      <w:r>
+        <w:t xml:space="preserve">Compare Copilot’s list with the facilitator’s. Ask about any difference before</w:t>
+      </w:r>
+      <w:r>
+        <w:t xml:space="preserve"> </w:t>
+      </w:r>
+      <w:r>
+        <w:t xml:space="preserve">continuing.</w:t>
+      </w:r>
+    </w:p>
+    <w:bookmarkEnd w:id="30"/>
+    <w:bookmarkStart w:id="31" w:name="clean-and-combine-the-data-minutes-7-17"/>
+    <w:p>
+      <w:pPr>
+        <w:pStyle w:val="Heading2"/>
+      </w:pPr>
+      <w:r>
+        <w:t xml:space="preserve">2. Clean and combine the data (minutes 7-17)</w:t>
+      </w:r>
+    </w:p>
+    <w:p>
+      <w:pPr>
+        <w:pStyle w:val="BlockText"/>
+      </w:pPr>
+      <w:r>
+        <w:t xml:space="preserve">Create a Python script named</w:t>
+      </w:r>
+      <w:r>
+        <w:t xml:space="preserve"> </w:t>
+      </w:r>
+      <w:r>
+        <w:rPr>
+          <w:rStyle w:val="VerbatimChar"/>
+        </w:rPr>
+        <w:t xml:space="preserve">clean_sales.py</w:t>
+      </w:r>
+      <w:r>
+        <w:t xml:space="preserve"> </w:t>
+      </w:r>
+      <w:r>
+        <w:t xml:space="preserve">that combines the January and</w:t>
+      </w:r>
+      <w:r>
+        <w:t xml:space="preserve"> </w:t>
+      </w:r>
+      <w:r>
+        <w:t xml:space="preserve">February sales files, fixes every issue in the plan, joins the product list,</w:t>
+      </w:r>
+      <w:r>
+        <w:t xml:space="preserve"> </w:t>
+      </w:r>
+      <w:r>
+        <w:t xml:space="preserve">and writes a new file named</w:t>
+      </w:r>
+      <w:r>
+        <w:t xml:space="preserve"> </w:t>
+      </w:r>
+      <w:r>
+        <w:rPr>
+          <w:rStyle w:val="VerbatimChar"/>
+        </w:rPr>
+        <w:t xml:space="preserve">sales_clean.csv</w:t>
+      </w:r>
+      <w:r>
+        <w:t xml:space="preserve">. Never modify the three source</w:t>
+      </w:r>
+      <w:r>
+        <w:t xml:space="preserve"> </w:t>
+      </w:r>
+      <w:r>
+        <w:t xml:space="preserve">CSV files. Explain the script in five bullets, then run it.</w:t>
+      </w:r>
+    </w:p>
+    <w:p>
+      <w:pPr>
+        <w:pStyle w:val="FirstParagraph"/>
+      </w:pPr>
+      <w:r>
+        <w:t xml:space="preserve">Read the explanation and approve the file creation and run. Open</w:t>
+      </w:r>
+      <w:r>
+        <w:t xml:space="preserve"> </w:t>
+      </w:r>
+      <w:r>
+        <w:rPr>
+          <w:rStyle w:val="VerbatimChar"/>
+        </w:rPr>
+        <w:t xml:space="preserve">sales_clean.csv</w:t>
+      </w:r>
+      <w:r>
+        <w:t xml:space="preserve"> </w:t>
+      </w:r>
+      <w:r>
+        <w:t xml:space="preserve">and confirm that it contains rows from both months.</w:t>
+      </w:r>
+    </w:p>
+    <w:p>
+      <w:pPr>
+        <w:pStyle w:val="BodyText"/>
+      </w:pPr>
+      <w:r>
+        <w:t xml:space="preserve">If the action fails, use the same recovery prompt as the facilitator:</w:t>
+      </w:r>
+    </w:p>
+    <w:p>
+      <w:pPr>
+        <w:pStyle w:val="BlockText"/>
+      </w:pPr>
+      <w:r>
+        <w:t xml:space="preserve">Explain the error in plain English. Make only the smallest necessary fix, then</w:t>
+      </w:r>
+      <w:r>
+        <w:t xml:space="preserve"> </w:t>
+      </w:r>
+      <w:r>
+        <w:t xml:space="preserve">run the script again.</w:t>
+      </w:r>
+    </w:p>
+    <w:bookmarkEnd w:id="31"/>
+    <w:bookmarkStart w:id="32" w:name="answer-business-questions-minutes-17-27"/>
+    <w:p>
+      <w:pPr>
+        <w:pStyle w:val="Heading2"/>
+      </w:pPr>
+      <w:r>
+        <w:t xml:space="preserve">3. Answer business questions (minutes 17-27)</w:t>
+      </w:r>
+    </w:p>
+    <w:p>
+      <w:pPr>
+        <w:pStyle w:val="BlockText"/>
+      </w:pPr>
+      <w:r>
+        <w:t xml:space="preserve">Using</w:t>
+      </w:r>
+      <w:r>
+        <w:t xml:space="preserve"> </w:t>
+      </w:r>
+      <w:r>
+        <w:rPr>
+          <w:rStyle w:val="VerbatimChar"/>
+        </w:rPr>
+        <w:t xml:space="preserve">sales_clean.csv</w:t>
+      </w:r>
+      <w:r>
+        <w:t xml:space="preserve">, calculate total revenue by region and by month, the</w:t>
+      </w:r>
+      <w:r>
+        <w:t xml:space="preserve"> </w:t>
+      </w:r>
+      <w:r>
+        <w:t xml:space="preserve">top-selling product by revenue, and the five largest discounts from list</w:t>
+      </w:r>
+      <w:r>
+        <w:t xml:space="preserve"> </w:t>
+      </w:r>
+      <w:r>
+        <w:t xml:space="preserve">price. Run the analysis and save the results as</w:t>
+      </w:r>
+      <w:r>
+        <w:t xml:space="preserve"> </w:t>
+      </w:r>
+      <w:r>
+        <w:rPr>
+          <w:rStyle w:val="VerbatimChar"/>
+        </w:rPr>
+        <w:t xml:space="preserve">analysis.md</w:t>
+      </w:r>
+      <w:r>
+        <w:t xml:space="preserve"> </w:t>
+      </w:r>
+      <w:r>
+        <w:t xml:space="preserve">with clear tables.</w:t>
+      </w:r>
+    </w:p>
+    <w:p>
+      <w:pPr>
+        <w:pStyle w:val="FirstParagraph"/>
+      </w:pPr>
+      <w:r>
+        <w:t xml:space="preserve">Do not accept an answer that only describes code. Copilot must run the analysis</w:t>
+      </w:r>
+      <w:r>
+        <w:t xml:space="preserve"> </w:t>
+      </w:r>
+      <w:r>
+        <w:t xml:space="preserve">and write the actual results.</w:t>
+      </w:r>
+    </w:p>
+    <w:bookmarkEnd w:id="32"/>
+    <w:bookmarkStart w:id="33" w:name="validate-the-result-minutes-27-37"/>
+    <w:p>
+      <w:pPr>
+        <w:pStyle w:val="Heading2"/>
+      </w:pPr>
+      <w:r>
+        <w:t xml:space="preserve">4. Validate the result (minutes 27-37)</w:t>
+      </w:r>
+    </w:p>
+    <w:p>
+      <w:pPr>
+        <w:pStyle w:val="BlockText"/>
+      </w:pPr>
+      <w:r>
+        <w:t xml:space="preserve">Validate the cleaned data. Report the source row count, cleaned row count,</w:t>
+      </w:r>
+      <w:r>
+        <w:t xml:space="preserve"> </w:t>
+      </w:r>
+      <w:r>
+        <w:t xml:space="preserve">date range, total units, total revenue, duplicate count, missing-value count,</w:t>
+      </w:r>
+      <w:r>
+        <w:t xml:space="preserve"> </w:t>
+      </w:r>
+      <w:r>
+        <w:t xml:space="preserve">and three sample rows. Recalculate totals independently from the cleaned CSV.</w:t>
+      </w:r>
+      <w:r>
+        <w:t xml:space="preserve"> </w:t>
+      </w:r>
+      <w:r>
+        <w:t xml:space="preserve">Save the evidence as</w:t>
+      </w:r>
+      <w:r>
+        <w:t xml:space="preserve"> </w:t>
+      </w:r>
+      <w:r>
+        <w:rPr>
+          <w:rStyle w:val="VerbatimChar"/>
+        </w:rPr>
+        <w:t xml:space="preserve">data-quality-report.md</w:t>
+      </w:r>
+      <w:r>
+        <w:t xml:space="preserve">. Flag any mismatch instead of</w:t>
+      </w:r>
+      <w:r>
+        <w:t xml:space="preserve"> </w:t>
+      </w:r>
+      <w:r>
+        <w:t xml:space="preserve">hiding or guessing it.</w:t>
+      </w:r>
+    </w:p>
+    <w:p>
+      <w:pPr>
+        <w:pStyle w:val="FirstParagraph"/>
+      </w:pPr>
+      <w:r>
+        <w:t xml:space="preserve">Compare the row counts and totals with the facilitator. If yours differ, stop</w:t>
+      </w:r>
+      <w:r>
+        <w:t xml:space="preserve"> </w:t>
+      </w:r>
+      <w:r>
+        <w:t xml:space="preserve">and ask Copilot to identify the first differing row or assumption.</w:t>
+      </w:r>
+    </w:p>
+    <w:bookmarkEnd w:id="33"/>
+    <w:bookmarkStart w:id="34" w:name="improve-the-handoff-minutes-37-44"/>
+    <w:p>
+      <w:pPr>
+        <w:pStyle w:val="Heading2"/>
+      </w:pPr>
+      <w:r>
+        <w:t xml:space="preserve">5. Improve the handoff (minutes 37-44)</w:t>
+      </w:r>
+    </w:p>
+    <w:p>
+      <w:pPr>
+        <w:pStyle w:val="BlockText"/>
+      </w:pPr>
+      <w:r>
+        <w:t xml:space="preserve">Review</w:t>
+      </w:r>
+      <w:r>
+        <w:t xml:space="preserve"> </w:t>
+      </w:r>
+      <w:r>
+        <w:rPr>
+          <w:rStyle w:val="VerbatimChar"/>
+        </w:rPr>
+        <w:t xml:space="preserve">analysis.md</w:t>
+      </w:r>
+      <w:r>
+        <w:t xml:space="preserve"> </w:t>
+      </w:r>
+      <w:r>
+        <w:t xml:space="preserve">and</w:t>
+      </w:r>
+      <w:r>
+        <w:t xml:space="preserve"> </w:t>
+      </w:r>
+      <w:r>
+        <w:rPr>
+          <w:rStyle w:val="VerbatimChar"/>
+        </w:rPr>
+        <w:t xml:space="preserve">data-quality-report.md</w:t>
+      </w:r>
+      <w:r>
+        <w:t xml:space="preserve"> </w:t>
+      </w:r>
+      <w:r>
+        <w:t xml:space="preserve">for a non-technical manager.</w:t>
+      </w:r>
+      <w:r>
+        <w:t xml:space="preserve"> </w:t>
+      </w:r>
+      <w:r>
+        <w:t xml:space="preserve">Add a short executive summary to</w:t>
+      </w:r>
+      <w:r>
+        <w:t xml:space="preserve"> </w:t>
+      </w:r>
+      <w:r>
+        <w:rPr>
+          <w:rStyle w:val="VerbatimChar"/>
+        </w:rPr>
+        <w:t xml:space="preserve">analysis.md</w:t>
+      </w:r>
+      <w:r>
+        <w:t xml:space="preserve"> </w:t>
+      </w:r>
+      <w:r>
+        <w:t xml:space="preserve">with three findings and one</w:t>
+      </w:r>
+      <w:r>
+        <w:t xml:space="preserve"> </w:t>
+      </w:r>
+      <w:r>
+        <w:t xml:space="preserve">limitation. Use only facts calculated from the files; do not invent figures.</w:t>
+      </w:r>
+    </w:p>
+    <w:p>
+      <w:pPr>
+        <w:pStyle w:val="FirstParagraph"/>
+      </w:pPr>
+      <w:r>
+        <w:t xml:space="preserve">Read the summary. Ask Copilot which file and calculation supports each claim.</w:t>
+      </w:r>
+    </w:p>
+    <w:bookmarkEnd w:id="34"/>
+    <w:bookmarkStart w:id="35" w:name="X4650c6ac28e93f5420f9f349bec8fb8ce430ac0"/>
+    <w:p>
+      <w:pPr>
+        <w:pStyle w:val="Heading2"/>
+      </w:pPr>
+      <w:r>
+        <w:t xml:space="preserve">6. Create and inspect the local package (minutes 44-50)</w:t>
+      </w:r>
+    </w:p>
+    <w:p>
+      <w:pPr>
+        <w:pStyle w:val="BlockText"/>
+      </w:pPr>
+      <w:r>
+        <w:t xml:space="preserve">Create a local folder named</w:t>
+      </w:r>
+      <w:r>
+        <w:t xml:space="preserve"> </w:t>
+      </w:r>
+      <w:r>
+        <w:rPr>
+          <w:rStyle w:val="VerbatimChar"/>
+        </w:rPr>
+        <w:t xml:space="preserve">handoff</w:t>
+      </w:r>
+      <w:r>
+        <w:t xml:space="preserve"> </w:t>
+      </w:r>
+      <w:r>
+        <w:t xml:space="preserve">containing copies of</w:t>
+      </w:r>
+      <w:r>
+        <w:t xml:space="preserve"> </w:t>
+      </w:r>
+      <w:r>
+        <w:rPr>
+          <w:rStyle w:val="VerbatimChar"/>
+        </w:rPr>
+        <w:t xml:space="preserve">sales_clean.csv</w:t>
+      </w:r>
+      <w:r>
+        <w:t xml:space="preserve">,</w:t>
+      </w:r>
+      <w:r>
+        <w:t xml:space="preserve"> </w:t>
+      </w:r>
+      <w:r>
+        <w:rPr>
+          <w:rStyle w:val="VerbatimChar"/>
+        </w:rPr>
+        <w:t xml:space="preserve">analysis.md</w:t>
+      </w:r>
+      <w:r>
+        <w:t xml:space="preserve">, and</w:t>
+      </w:r>
+      <w:r>
+        <w:t xml:space="preserve"> </w:t>
+      </w:r>
+      <w:r>
+        <w:rPr>
+          <w:rStyle w:val="VerbatimChar"/>
+        </w:rPr>
+        <w:t xml:space="preserve">data-quality-report.md</w:t>
+      </w:r>
+      <w:r>
+        <w:t xml:space="preserve">. Add a</w:t>
+      </w:r>
+      <w:r>
+        <w:t xml:space="preserve"> </w:t>
+      </w:r>
+      <w:r>
+        <w:rPr>
+          <w:rStyle w:val="VerbatimChar"/>
+        </w:rPr>
+        <w:t xml:space="preserve">README.md</w:t>
+      </w:r>
+      <w:r>
+        <w:t xml:space="preserve"> </w:t>
+      </w:r>
+      <w:r>
+        <w:t xml:space="preserve">that explains</w:t>
+      </w:r>
+      <w:r>
+        <w:t xml:space="preserve"> </w:t>
+      </w:r>
+      <w:r>
+        <w:t xml:space="preserve">what each file contains and how to rerun</w:t>
+      </w:r>
+      <w:r>
+        <w:t xml:space="preserve"> </w:t>
+      </w:r>
+      <w:r>
+        <w:rPr>
+          <w:rStyle w:val="VerbatimChar"/>
+        </w:rPr>
+        <w:t xml:space="preserve">clean_sales.py</w:t>
+      </w:r>
+      <w:r>
+        <w:t xml:space="preserve">. Create</w:t>
+      </w:r>
+      <w:r>
+        <w:t xml:space="preserve"> </w:t>
+      </w:r>
+      <w:r>
+        <w:rPr>
+          <w:rStyle w:val="VerbatimChar"/>
+        </w:rPr>
+        <w:t xml:space="preserve">sales-handoff.zip</w:t>
+      </w:r>
+      <w:r>
+        <w:t xml:space="preserve"> </w:t>
+      </w:r>
+      <w:r>
+        <w:t xml:space="preserve">from that folder. Do not upload or send anything.</w:t>
+      </w:r>
+    </w:p>
+    <w:p>
+      <w:pPr>
+        <w:pStyle w:val="FirstParagraph"/>
+      </w:pPr>
+      <w:r>
+        <w:t xml:space="preserve">Open the</w:t>
+      </w:r>
+      <w:r>
+        <w:t xml:space="preserve"> </w:t>
+      </w:r>
+      <w:r>
+        <w:rPr>
+          <w:rStyle w:val="VerbatimChar"/>
+        </w:rPr>
+        <w:t xml:space="preserve">handoff</w:t>
+      </w:r>
+      <w:r>
+        <w:t xml:space="preserve"> </w:t>
+      </w:r>
+      <w:r>
+        <w:t xml:space="preserve">folder and confirm it contains exactly four files. The ZIP is</w:t>
+      </w:r>
+      <w:r>
+        <w:t xml:space="preserve"> </w:t>
+      </w:r>
+      <w:r>
+        <w:t xml:space="preserve">the finished local deliverable; there is no cloud upload or teardown.</w:t>
+      </w:r>
+    </w:p>
+    <w:bookmarkEnd w:id="35"/>
+    <w:bookmarkStart w:id="36" w:name="safety-rules-1"/>
+    <w:p>
+      <w:pPr>
+        <w:pStyle w:val="Heading2"/>
+      </w:pPr>
+      <w:r>
+        <w:t xml:space="preserve">Safety rules</w:t>
+      </w:r>
+    </w:p>
+    <w:p>
+      <w:pPr>
+        <w:pStyle w:val="Compact"/>
+        <w:numPr>
+          <w:ilvl w:val="0"/>
+          <w:numId w:val="1009"/>
+        </w:numPr>
+      </w:pPr>
+      <w:r>
+        <w:t xml:space="preserve">Read every proposed action before approving it.</w:t>
+      </w:r>
+    </w:p>
+    <w:p>
+      <w:pPr>
+        <w:pStyle w:val="Compact"/>
+        <w:numPr>
+          <w:ilvl w:val="0"/>
+          <w:numId w:val="1009"/>
+        </w:numPr>
+      </w:pPr>
+      <w:r>
+        <w:t xml:space="preserve">Keep the three source CSV files unchanged.</w:t>
+      </w:r>
+    </w:p>
+    <w:p>
+      <w:pPr>
+        <w:pStyle w:val="Compact"/>
+        <w:numPr>
+          <w:ilvl w:val="0"/>
+          <w:numId w:val="1009"/>
+        </w:numPr>
+      </w:pPr>
+      <w:r>
+        <w:t xml:space="preserve">Use only the fictitious workshop data. Never paste secrets or real customer</w:t>
+      </w:r>
+      <w:r>
+        <w:t xml:space="preserve"> </w:t>
+      </w:r>
+      <w:r>
+        <w:t xml:space="preserve">information into Copilot.</w:t>
+      </w:r>
+    </w:p>
+    <w:p>
+      <w:pPr>
+        <w:pStyle w:val="Compact"/>
+        <w:numPr>
+          <w:ilvl w:val="0"/>
+          <w:numId w:val="1009"/>
+        </w:numPr>
+      </w:pPr>
+      <w:r>
+        <w:t xml:space="preserve">Require evidence for totals and claims. Copilot drafts; you decide.</w:t>
+      </w:r>
+    </w:p>
+    <w:p>
+      <w:pPr>
+        <w:pStyle w:val="Compact"/>
+        <w:numPr>
+          <w:ilvl w:val="0"/>
+          <w:numId w:val="1009"/>
+        </w:numPr>
+      </w:pPr>
+      <w:r>
+        <w:t xml:space="preserve">Keep all outputs local during the workshop.</w:t>
+      </w:r>
+    </w:p>
+    <w:bookmarkEnd w:id="36"/>
+    <w:bookmarkStart w:id="37" w:name="if-the-group-finishes-early"/>
+    <w:p>
+      <w:pPr>
+        <w:pStyle w:val="Heading2"/>
+      </w:pPr>
+      <w:r>
+        <w:t xml:space="preserve">If the group finishes early</w:t>
+      </w:r>
+    </w:p>
+    <w:p>
+      <w:pPr>
+        <w:pStyle w:val="FirstParagraph"/>
+      </w:pPr>
+      <w:r>
+        <w:t xml:space="preserve">Use one prompt together:</w:t>
+      </w:r>
+    </w:p>
+    <w:p>
+      <w:pPr>
+        <w:pStyle w:val="BlockText"/>
+      </w:pPr>
+      <w:r>
+        <w:t xml:space="preserve">Create a bar chart of monthly revenue as</w:t>
+      </w:r>
+      <w:r>
+        <w:t xml:space="preserve"> </w:t>
+      </w:r>
+      <w:r>
+        <w:rPr>
+          <w:rStyle w:val="VerbatimChar"/>
+        </w:rPr>
+        <w:t xml:space="preserve">monthly-revenue.png</w:t>
+      </w:r>
+      <w:r>
+        <w:t xml:space="preserve">, add it to the</w:t>
+      </w:r>
+      <w:r>
+        <w:t xml:space="preserve"> </w:t>
+      </w:r>
+      <w:r>
+        <w:t xml:space="preserve">handoff folder, update the handoff README, and rebuild the ZIP.</w:t>
+      </w:r>
+    </w:p>
+    <w:bookmarkEnd w:id="37"/>
+    <w:bookmarkEnd w:id="38"/>
     <w:sectPr>
       <w:footnotePr>
         <w:numRestart w:val="eachSect"/>
@@ -1852,34 +2834,7 @@
     <w:abstractNumId w:val="991"/>
   </w:num>
   <w:num w:numId="1002">
-    <w:abstractNumId w:val="99411"/>
-    <w:lvlOverride w:ilvl="0">
-      <w:startOverride w:val="1"/>
-    </w:lvlOverride>
-    <w:lvlOverride w:ilvl="1">
-      <w:startOverride w:val="1"/>
-    </w:lvlOverride>
-    <w:lvlOverride w:ilvl="2">
-      <w:startOverride w:val="1"/>
-    </w:lvlOverride>
-    <w:lvlOverride w:ilvl="3">
-      <w:startOverride w:val="1"/>
-    </w:lvlOverride>
-    <w:lvlOverride w:ilvl="4">
-      <w:startOverride w:val="1"/>
-    </w:lvlOverride>
-    <w:lvlOverride w:ilvl="5">
-      <w:startOverride w:val="1"/>
-    </w:lvlOverride>
-    <w:lvlOverride w:ilvl="6">
-      <w:startOverride w:val="1"/>
-    </w:lvlOverride>
-    <w:lvlOverride w:ilvl="7">
-      <w:startOverride w:val="1"/>
-    </w:lvlOverride>
-    <w:lvlOverride w:ilvl="8">
-      <w:startOverride w:val="1"/>
-    </w:lvlOverride>
+    <w:abstractNumId w:val="991"/>
   </w:num>
   <w:num w:numId="1003">
     <w:abstractNumId w:val="99411"/>
@@ -1942,6 +2897,99 @@
     </w:lvlOverride>
   </w:num>
   <w:num w:numId="1005">
+    <w:abstractNumId w:val="99411"/>
+    <w:lvlOverride w:ilvl="0">
+      <w:startOverride w:val="1"/>
+    </w:lvlOverride>
+    <w:lvlOverride w:ilvl="1">
+      <w:startOverride w:val="1"/>
+    </w:lvlOverride>
+    <w:lvlOverride w:ilvl="2">
+      <w:startOverride w:val="1"/>
+    </w:lvlOverride>
+    <w:lvlOverride w:ilvl="3">
+      <w:startOverride w:val="1"/>
+    </w:lvlOverride>
+    <w:lvlOverride w:ilvl="4">
+      <w:startOverride w:val="1"/>
+    </w:lvlOverride>
+    <w:lvlOverride w:ilvl="5">
+      <w:startOverride w:val="1"/>
+    </w:lvlOverride>
+    <w:lvlOverride w:ilvl="6">
+      <w:startOverride w:val="1"/>
+    </w:lvlOverride>
+    <w:lvlOverride w:ilvl="7">
+      <w:startOverride w:val="1"/>
+    </w:lvlOverride>
+    <w:lvlOverride w:ilvl="8">
+      <w:startOverride w:val="1"/>
+    </w:lvlOverride>
+  </w:num>
+  <w:num w:numId="1006">
+    <w:abstractNumId w:val="991"/>
+  </w:num>
+  <w:num w:numId="1007">
+    <w:abstractNumId w:val="99411"/>
+    <w:lvlOverride w:ilvl="0">
+      <w:startOverride w:val="1"/>
+    </w:lvlOverride>
+    <w:lvlOverride w:ilvl="1">
+      <w:startOverride w:val="1"/>
+    </w:lvlOverride>
+    <w:lvlOverride w:ilvl="2">
+      <w:startOverride w:val="1"/>
+    </w:lvlOverride>
+    <w:lvlOverride w:ilvl="3">
+      <w:startOverride w:val="1"/>
+    </w:lvlOverride>
+    <w:lvlOverride w:ilvl="4">
+      <w:startOverride w:val="1"/>
+    </w:lvlOverride>
+    <w:lvlOverride w:ilvl="5">
+      <w:startOverride w:val="1"/>
+    </w:lvlOverride>
+    <w:lvlOverride w:ilvl="6">
+      <w:startOverride w:val="1"/>
+    </w:lvlOverride>
+    <w:lvlOverride w:ilvl="7">
+      <w:startOverride w:val="1"/>
+    </w:lvlOverride>
+    <w:lvlOverride w:ilvl="8">
+      <w:startOverride w:val="1"/>
+    </w:lvlOverride>
+  </w:num>
+  <w:num w:numId="1008">
+    <w:abstractNumId w:val="99411"/>
+    <w:lvlOverride w:ilvl="0">
+      <w:startOverride w:val="1"/>
+    </w:lvlOverride>
+    <w:lvlOverride w:ilvl="1">
+      <w:startOverride w:val="1"/>
+    </w:lvlOverride>
+    <w:lvlOverride w:ilvl="2">
+      <w:startOverride w:val="1"/>
+    </w:lvlOverride>
+    <w:lvlOverride w:ilvl="3">
+      <w:startOverride w:val="1"/>
+    </w:lvlOverride>
+    <w:lvlOverride w:ilvl="4">
+      <w:startOverride w:val="1"/>
+    </w:lvlOverride>
+    <w:lvlOverride w:ilvl="5">
+      <w:startOverride w:val="1"/>
+    </w:lvlOverride>
+    <w:lvlOverride w:ilvl="6">
+      <w:startOverride w:val="1"/>
+    </w:lvlOverride>
+    <w:lvlOverride w:ilvl="7">
+      <w:startOverride w:val="1"/>
+    </w:lvlOverride>
+    <w:lvlOverride w:ilvl="8">
+      <w:startOverride w:val="1"/>
+    </w:lvlOverride>
+  </w:num>
+  <w:num w:numId="1009">
     <w:abstractNumId w:val="991"/>
   </w:num>
 </w:numbering>

</xml_diff>

<commit_message>
Limit each workshop lab to 25 minutes
</commit_message>
<xml_diff>
--- a/guides/Attendee Guide - 10 min talk 50 min handson.docx
+++ b/guides/Attendee Guide - 10 min talk 50 min handson.docx
@@ -25,7 +25,7 @@
         <w:pStyle w:val="FirstParagraph"/>
       </w:pPr>
       <w:r>
-        <w:t xml:space="preserve">The workshop has two separate role-based tracks:</w:t>
+        <w:t xml:space="preserve">The workshop has two separate role-based labs:</w:t>
       </w:r>
     </w:p>
     <w:p>
@@ -89,25 +89,19 @@
         <w:pStyle w:val="FirstParagraph"/>
       </w:pPr>
       <w:r>
-        <w:t xml:space="preserve">Before the session, the facilitator selects the track for that delivery. The</w:t>
-      </w:r>
-      <w:r>
-        <w:t xml:space="preserve"> </w:t>
-      </w:r>
-      <w:r>
-        <w:t xml:space="preserve">facilitator and attendees then use the same track instructions, enter the same</w:t>
-      </w:r>
-      <w:r>
-        <w:t xml:space="preserve"> </w:t>
-      </w:r>
-      <w:r>
-        <w:t xml:space="preserve">prompts, and pause at the same checkpoints. Do not combine or switch tracks</w:t>
-      </w:r>
-      <w:r>
-        <w:t xml:space="preserve"> </w:t>
-      </w:r>
-      <w:r>
-        <w:t xml:space="preserve">during the 50-minute lab.</w:t>
+        <w:t xml:space="preserve">During the 50-minute hands-on, the facilitator and attendees complete both labs</w:t>
+      </w:r>
+      <w:r>
+        <w:t xml:space="preserve"> </w:t>
+      </w:r>
+      <w:r>
+        <w:t xml:space="preserve">in order. Everyone uses the same instructions, enters the same prompts, and</w:t>
+      </w:r>
+      <w:r>
+        <w:t xml:space="preserve"> </w:t>
+      </w:r>
+      <w:r>
+        <w:t xml:space="preserve">pauses at the same checkpoints. Each lab has a strict 25-minute maximum.</w:t>
       </w:r>
     </w:p>
     <w:p>
@@ -193,7 +187,7 @@
         </w:numPr>
       </w:pPr>
       <w:r>
-        <w:t xml:space="preserve">Select either</w:t>
+        <w:t xml:space="preserve">Open</w:t>
       </w:r>
       <w:r>
         <w:t xml:space="preserve"> </w:t>
@@ -208,7 +202,7 @@
         <w:t xml:space="preserve"> </w:t>
       </w:r>
       <w:r>
-        <w:t xml:space="preserve">or</w:t>
+        <w:t xml:space="preserve">and</w:t>
       </w:r>
       <w:r>
         <w:t xml:space="preserve"> </w:t>
@@ -220,10 +214,7 @@
         <w:t xml:space="preserve">labs/data-engineer/LAB.md</w:t>
       </w:r>
       <w:r>
-        <w:t xml:space="preserve"> </w:t>
-      </w:r>
-      <w:r>
-        <w:t xml:space="preserve">for the delivery.</w:t>
+        <w:t xml:space="preserve">.</w:t>
       </w:r>
     </w:p>
     <w:p>
@@ -235,7 +226,7 @@
         </w:numPr>
       </w:pPr>
       <w:r>
-        <w:t xml:space="preserve">The facilitator opens the same lab in a clean workspace.</w:t>
+        <w:t xml:space="preserve">The facilitator opens both labs in the same clean workspace.</w:t>
       </w:r>
     </w:p>
     <w:p>
@@ -247,7 +238,7 @@
         </w:numPr>
       </w:pPr>
       <w:r>
-        <w:t xml:space="preserve">Use only the fictitious source data included in the selected lab.</w:t>
+        <w:t xml:space="preserve">Use only the fictitious source data included in each lab.</w:t>
       </w:r>
     </w:p>
     <w:bookmarkEnd w:id="11"/>
@@ -317,7 +308,7 @@
               <w:pStyle w:val="Compact"/>
             </w:pPr>
             <w:r>
-              <w:t xml:space="preserve">Facilitator gives the existing short introduction. Attendees open the repository and selected lab.</w:t>
+              <w:t xml:space="preserve">Facilitator gives the existing short introduction. Attendees open the repository and both labs.</w:t>
             </w:r>
           </w:p>
         </w:tc>
@@ -330,7 +321,7 @@
               <w:pStyle w:val="Compact"/>
             </w:pPr>
             <w:r>
-              <w:t xml:space="preserve">10-17</w:t>
+              <w:t xml:space="preserve">10-35</w:t>
             </w:r>
           </w:p>
         </w:tc>
@@ -341,7 +332,7 @@
               <w:pStyle w:val="Compact"/>
             </w:pPr>
             <w:r>
-              <w:t xml:space="preserve">Everyone inspects the selected track’s source files and agrees on a plan.</w:t>
+              <w:t xml:space="preserve">Everyone completes the Systems Administrator lab. Stop at its final checkpoint.</w:t>
             </w:r>
           </w:p>
         </w:tc>
@@ -354,7 +345,7 @@
               <w:pStyle w:val="Compact"/>
             </w:pPr>
             <w:r>
-              <w:t xml:space="preserve">17-28</w:t>
+              <w:t xml:space="preserve">35-60</w:t>
             </w:r>
           </w:p>
         </w:tc>
@@ -365,79 +356,7 @@
               <w:pStyle w:val="Compact"/>
             </w:pPr>
             <w:r>
-              <w:t xml:space="preserve">Everyone creates and runs the local processing or audit script.</w:t>
-            </w:r>
-          </w:p>
-        </w:tc>
-      </w:tr>
-      <w:tr>
-        <w:tc>
-          <w:tcPr/>
-          <w:p>
-            <w:pPr>
-              <w:pStyle w:val="Compact"/>
-            </w:pPr>
-            <w:r>
-              <w:t xml:space="preserve">28-38</w:t>
-            </w:r>
-          </w:p>
-        </w:tc>
-        <w:tc>
-          <w:tcPr/>
-          <w:p>
-            <w:pPr>
-              <w:pStyle w:val="Compact"/>
-            </w:pPr>
-            <w:r>
-              <w:t xml:space="preserve">Everyone produces role-specific analysis or remediation output.</w:t>
-            </w:r>
-          </w:p>
-        </w:tc>
-      </w:tr>
-      <w:tr>
-        <w:tc>
-          <w:tcPr/>
-          <w:p>
-            <w:pPr>
-              <w:pStyle w:val="Compact"/>
-            </w:pPr>
-            <w:r>
-              <w:t xml:space="preserve">38-47</w:t>
-            </w:r>
-          </w:p>
-        </w:tc>
-        <w:tc>
-          <w:tcPr/>
-          <w:p>
-            <w:pPr>
-              <w:pStyle w:val="Compact"/>
-            </w:pPr>
-            <w:r>
-              <w:t xml:space="preserve">Everyone troubleshoots or validates the output against source evidence.</w:t>
-            </w:r>
-          </w:p>
-        </w:tc>
-      </w:tr>
-      <w:tr>
-        <w:tc>
-          <w:tcPr/>
-          <w:p>
-            <w:pPr>
-              <w:pStyle w:val="Compact"/>
-            </w:pPr>
-            <w:r>
-              <w:t xml:space="preserve">47-60</w:t>
-            </w:r>
-          </w:p>
-        </w:tc>
-        <w:tc>
-          <w:tcPr/>
-          <w:p>
-            <w:pPr>
-              <w:pStyle w:val="Compact"/>
-            </w:pPr>
-            <w:r>
-              <w:t xml:space="preserve">Everyone completes validation and creates the local handoff package.</w:t>
+              <w:t xml:space="preserve">Everyone completes the Data Engineer lab. Stop at its final checkpoint.</w:t>
             </w:r>
           </w:p>
         </w:tc>
@@ -705,7 +624,37 @@
         </w:numPr>
       </w:pPr>
       <w:r>
-        <w:t xml:space="preserve">Open the selected track folder.</w:t>
+        <w:t xml:space="preserve">Open</w:t>
+      </w:r>
+      <w:r>
+        <w:t xml:space="preserve"> </w:t>
+      </w:r>
+      <w:r>
+        <w:rPr>
+          <w:rStyle w:val="VerbatimChar"/>
+        </w:rPr>
+        <w:t xml:space="preserve">labs/systems-engineer</w:t>
+      </w:r>
+      <w:r>
+        <w:t xml:space="preserve"> </w:t>
+      </w:r>
+      <w:r>
+        <w:t xml:space="preserve">first; open</w:t>
+      </w:r>
+      <w:r>
+        <w:t xml:space="preserve"> </w:t>
+      </w:r>
+      <w:r>
+        <w:rPr>
+          <w:rStyle w:val="VerbatimChar"/>
+        </w:rPr>
+        <w:t xml:space="preserve">labs/data-engineer</w:t>
+      </w:r>
+      <w:r>
+        <w:t xml:space="preserve"> </w:t>
+      </w:r>
+      <w:r>
+        <w:t xml:space="preserve">at minute 35 of the session.</w:t>
       </w:r>
     </w:p>
     <w:bookmarkEnd w:id="14"/>
@@ -766,7 +715,7 @@
         </w:numPr>
       </w:pPr>
       <w:r>
-        <w:t xml:space="preserve">Ask Copilot to show the selected track’s</w:t>
+        <w:t xml:space="preserve">Ask Copilot to show the Systems Administrator</w:t>
       </w:r>
       <w:r>
         <w:t xml:space="preserve"> </w:t>
@@ -778,7 +727,10 @@
         <w:t xml:space="preserve">LAB.md</w:t>
       </w:r>
       <w:r>
-        <w:t xml:space="preserve">.</w:t>
+        <w:t xml:space="preserve"> </w:t>
+      </w:r>
+      <w:r>
+        <w:t xml:space="preserve">first.</w:t>
       </w:r>
     </w:p>
     <w:p>
@@ -786,19 +738,19 @@
         <w:pStyle w:val="FirstParagraph"/>
       </w:pPr>
       <w:r>
-        <w:t xml:space="preserve">The following sections contain both complete tracks. Use only the track selected</w:t>
-      </w:r>
-      <w:r>
-        <w:t xml:space="preserve"> </w:t>
-      </w:r>
-      <w:r>
-        <w:t xml:space="preserve">for the delivery.</w:t>
+        <w:t xml:space="preserve">The following sections contain both complete labs. Complete Sysadmin first and</w:t>
+      </w:r>
+      <w:r>
+        <w:t xml:space="preserve"> </w:t>
+      </w:r>
+      <w:r>
+        <w:t xml:space="preserve">Data second. Stop each lab after 25 minutes even if optional refinement remains.</w:t>
       </w:r>
     </w:p>
     <w:bookmarkEnd w:id="15"/>
     <w:bookmarkEnd w:id="16"/>
     <w:bookmarkEnd w:id="17"/>
-    <w:bookmarkStart w:id="27" w:name="Xca3ae7ecb4428bf077aff55b69c8b0f0aaeaf89"/>
+    <w:bookmarkStart w:id="25" w:name="Xca3ae7ecb4428bf077aff55b69c8b0f0aaeaf89"/>
     <w:p>
       <w:pPr>
         <w:pStyle w:val="Heading1"/>
@@ -812,19 +764,19 @@
         <w:pStyle w:val="FirstParagraph"/>
       </w:pPr>
       <w:r>
-        <w:t xml:space="preserve">This is a separate role-based track. Follow the facilitator through each step if</w:t>
-      </w:r>
-      <w:r>
-        <w:t xml:space="preserve"> </w:t>
-      </w:r>
-      <w:r>
-        <w:t xml:space="preserve">the Systems Administrator track is selected. No Azure subscription, remote</w:t>
-      </w:r>
-      <w:r>
-        <w:t xml:space="preserve"> </w:t>
-      </w:r>
-      <w:r>
-        <w:t xml:space="preserve">server connection, or coding experience is required.</w:t>
+        <w:t xml:space="preserve">Everyone follows the facilitator through this lab before moving to the Data</w:t>
+      </w:r>
+      <w:r>
+        <w:t xml:space="preserve"> </w:t>
+      </w:r>
+      <w:r>
+        <w:t xml:space="preserve">Engineer lab. No Azure subscription, remote connection, or coding experience is</w:t>
+      </w:r>
+      <w:r>
+        <w:t xml:space="preserve"> </w:t>
+      </w:r>
+      <w:r>
+        <w:t xml:space="preserve">required.</w:t>
       </w:r>
     </w:p>
     <w:p>
@@ -836,22 +788,30 @@
           <w:b/>
           <w:bCs/>
         </w:rPr>
-        <w:t xml:space="preserve">Time:</w:t>
-      </w:r>
-      <w:r>
-        <w:t xml:space="preserve"> </w:t>
-      </w:r>
-      <w:r>
-        <w:t xml:space="preserve">50 minutes</w:t>
-      </w:r>
-    </w:p>
-    <w:bookmarkStart w:id="18" w:name="the-loop-1"/>
+        <w:t xml:space="preserve">Maximum time: 25 minutes. Stop after the final checkpoint.</w:t>
+      </w:r>
+    </w:p>
+    <w:p>
+      <w:pPr>
+        <w:pStyle w:val="BodyText"/>
+      </w:pPr>
+      <w:r>
+        <w:t xml:space="preserve">For every step: enter the same prompt as the facilitator, read the suggestion,</w:t>
+      </w:r>
+      <w:r>
+        <w:t xml:space="preserve"> </w:t>
+      </w:r>
+      <w:r>
+        <w:t xml:space="preserve">approve only understood actions, and verify the result. Keep source files unchanged.</w:t>
+      </w:r>
+    </w:p>
+    <w:bookmarkStart w:id="18" w:name="setup"/>
     <w:p>
       <w:pPr>
         <w:pStyle w:val="Heading2"/>
       </w:pPr>
       <w:r>
-        <w:t xml:space="preserve">The loop</w:t>
+        <w:t xml:space="preserve">Setup</w:t>
       </w:r>
     </w:p>
     <w:p>
@@ -859,46 +819,85 @@
         <w:pStyle w:val="FirstParagraph"/>
       </w:pPr>
       <w:r>
-        <w:t xml:space="preserve">For every step: prompt, read the suggestion, approve the run, refine one issue,</w:t>
-      </w:r>
-      <w:r>
-        <w:t xml:space="preserve"> </w:t>
-      </w:r>
-      <w:r>
-        <w:t xml:space="preserve">and sanity-check the result. The source files must remain unchanged.</w:t>
+        <w:t xml:space="preserve">Open</w:t>
+      </w:r>
+      <w:r>
+        <w:t xml:space="preserve"> </w:t>
+      </w:r>
+      <w:r>
+        <w:rPr>
+          <w:rStyle w:val="VerbatimChar"/>
+        </w:rPr>
+        <w:t xml:space="preserve">labs/systems-engineer</w:t>
+      </w:r>
+      <w:r>
+        <w:t xml:space="preserve">. Confirm Copilot can see</w:t>
+      </w:r>
+      <w:r>
+        <w:t xml:space="preserve"> </w:t>
+      </w:r>
+      <w:r>
+        <w:rPr>
+          <w:rStyle w:val="VerbatimChar"/>
+        </w:rPr>
+        <w:t xml:space="preserve">operations-brief.md</w:t>
+      </w:r>
+      <w:r>
+        <w:t xml:space="preserve">,</w:t>
+      </w:r>
+      <w:r>
+        <w:t xml:space="preserve"> </w:t>
+      </w:r>
+      <w:r>
+        <w:rPr>
+          <w:rStyle w:val="VerbatimChar"/>
+        </w:rPr>
+        <w:t xml:space="preserve">server-inventory.csv</w:t>
+      </w:r>
+      <w:r>
+        <w:t xml:space="preserve">,</w:t>
+      </w:r>
+      <w:r>
+        <w:t xml:space="preserve"> </w:t>
+      </w:r>
+      <w:r>
+        <w:rPr>
+          <w:rStyle w:val="VerbatimChar"/>
+        </w:rPr>
+        <w:t xml:space="preserve">service-status.csv</w:t>
+      </w:r>
+      <w:r>
+        <w:t xml:space="preserve">, and</w:t>
+      </w:r>
+      <w:r>
+        <w:t xml:space="preserve"> </w:t>
+      </w:r>
+      <w:r>
+        <w:rPr>
+          <w:rStyle w:val="VerbatimChar"/>
+        </w:rPr>
+        <w:t xml:space="preserve">sample-error.txt</w:t>
+      </w:r>
+      <w:r>
+        <w:t xml:space="preserve">.</w:t>
       </w:r>
     </w:p>
     <w:bookmarkEnd w:id="18"/>
-    <w:bookmarkStart w:id="19" w:name="before-the-timer-starts"/>
+    <w:bookmarkStart w:id="19" w:name="understand-the-audit-minutes-0-4"/>
     <w:p>
       <w:pPr>
         <w:pStyle w:val="Heading2"/>
       </w:pPr>
       <w:r>
-        <w:t xml:space="preserve">Before the timer starts</w:t>
-      </w:r>
-    </w:p>
-    <w:p>
-      <w:pPr>
-        <w:pStyle w:val="FirstParagraph"/>
-      </w:pPr>
-      <w:r>
-        <w:t xml:space="preserve">Open</w:t>
-      </w:r>
-      <w:r>
-        <w:t xml:space="preserve"> </w:t>
-      </w:r>
-      <w:r>
-        <w:rPr>
-          <w:rStyle w:val="VerbatimChar"/>
-        </w:rPr>
-        <w:t xml:space="preserve">labs/systems-engineer</w:t>
-      </w:r>
-      <w:r>
-        <w:t xml:space="preserve"> </w:t>
-      </w:r>
-      <w:r>
-        <w:t xml:space="preserve">and confirm Copilot can see</w:t>
+        <w:t xml:space="preserve">1. Understand the audit (minutes 0-4)</w:t>
+      </w:r>
+    </w:p>
+    <w:p>
+      <w:pPr>
+        <w:pStyle w:val="BlockText"/>
+      </w:pPr>
+      <w:r>
+        <w:t xml:space="preserve">Read</w:t>
       </w:r>
       <w:r>
         <w:t xml:space="preserve"> </w:t>
@@ -922,7 +921,7 @@
         <w:t xml:space="preserve">server-inventory.csv</w:t>
       </w:r>
       <w:r>
-        <w:t xml:space="preserve">,</w:t>
+        <w:t xml:space="preserve">, and</w:t>
       </w:r>
       <w:r>
         <w:t xml:space="preserve"> </w:t>
@@ -934,85 +933,19 @@
         <w:t xml:space="preserve">service-status.csv</w:t>
       </w:r>
       <w:r>
-        <w:t xml:space="preserve">, and</w:t>
-      </w:r>
-      <w:r>
-        <w:t xml:space="preserve"> </w:t>
-      </w:r>
-      <w:r>
-        <w:rPr>
-          <w:rStyle w:val="VerbatimChar"/>
-        </w:rPr>
-        <w:t xml:space="preserve">sample-error.txt</w:t>
-      </w:r>
-      <w:r>
-        <w:t xml:space="preserve">. Wait for the facilitator before continuing.</w:t>
-      </w:r>
-    </w:p>
-    <w:bookmarkEnd w:id="19"/>
-    <w:bookmarkStart w:id="20" w:name="Xb57a6f38e63681e9a96307e505cd1ac8b2d6a1d"/>
-    <w:p>
-      <w:pPr>
-        <w:pStyle w:val="Heading2"/>
-      </w:pPr>
-      <w:r>
-        <w:t xml:space="preserve">1. Understand the operational brief (minutes 0-7)</w:t>
-      </w:r>
-    </w:p>
-    <w:p>
-      <w:pPr>
-        <w:pStyle w:val="BlockText"/>
-      </w:pPr>
-      <w:r>
-        <w:t xml:space="preserve">Read</w:t>
-      </w:r>
-      <w:r>
-        <w:t xml:space="preserve"> </w:t>
-      </w:r>
-      <w:r>
-        <w:rPr>
-          <w:rStyle w:val="VerbatimChar"/>
-        </w:rPr>
-        <w:t xml:space="preserve">operations-brief.md</w:t>
-      </w:r>
-      <w:r>
-        <w:t xml:space="preserve">,</w:t>
-      </w:r>
-      <w:r>
-        <w:t xml:space="preserve"> </w:t>
-      </w:r>
-      <w:r>
-        <w:rPr>
-          <w:rStyle w:val="VerbatimChar"/>
-        </w:rPr>
-        <w:t xml:space="preserve">server-inventory.csv</w:t>
-      </w:r>
-      <w:r>
-        <w:t xml:space="preserve">, and</w:t>
-      </w:r>
-      <w:r>
-        <w:t xml:space="preserve"> </w:t>
-      </w:r>
-      <w:r>
-        <w:rPr>
-          <w:rStyle w:val="VerbatimChar"/>
-        </w:rPr>
-        <w:t xml:space="preserve">service-status.csv</w:t>
-      </w:r>
-      <w:r>
         <w:t xml:space="preserve">.</w:t>
       </w:r>
       <w:r>
         <w:t xml:space="preserve"> </w:t>
       </w:r>
       <w:r>
-        <w:t xml:space="preserve">Do not change anything yet. Explain the health rules, identify the available</w:t>
-      </w:r>
-      <w:r>
-        <w:t xml:space="preserve"> </w:t>
-      </w:r>
-      <w:r>
-        <w:t xml:space="preserve">evidence, and propose a short audit plan in plain English.</w:t>
+        <w:t xml:space="preserve">Do not change anything. Summarise the health rules and propose a four-step audit</w:t>
+      </w:r>
+      <w:r>
+        <w:t xml:space="preserve"> </w:t>
+      </w:r>
+      <w:r>
+        <w:t xml:space="preserve">plan in plain English.</w:t>
       </w:r>
     </w:p>
     <w:p>
@@ -1030,23 +963,23 @@
         <w:t xml:space="preserve"> </w:t>
       </w:r>
       <w:r>
-        <w:t xml:space="preserve">the plan covers patch age, disk space, backup, endpoint</w:t>
-      </w:r>
-      <w:r>
-        <w:t xml:space="preserve"> </w:t>
-      </w:r>
-      <w:r>
-        <w:t xml:space="preserve">protection, service status, and startup type.</w:t>
-      </w:r>
-    </w:p>
-    <w:bookmarkEnd w:id="20"/>
-    <w:bookmarkStart w:id="21" w:name="X649e85bcb7ffca1905b0950e2d23cd4db82f208"/>
+        <w:t xml:space="preserve">patch age, disk, backup, endpoint protection, service status,</w:t>
+      </w:r>
+      <w:r>
+        <w:t xml:space="preserve"> </w:t>
+      </w:r>
+      <w:r>
+        <w:t xml:space="preserve">and startup type are covered.</w:t>
+      </w:r>
+    </w:p>
+    <w:bookmarkEnd w:id="19"/>
+    <w:bookmarkStart w:id="20" w:name="run-the-local-audit-minutes-4-11"/>
     <w:p>
       <w:pPr>
         <w:pStyle w:val="Heading2"/>
       </w:pPr>
       <w:r>
-        <w:t xml:space="preserve">2. Build and run the local audit (minutes 7-18)</w:t>
+        <w:t xml:space="preserve">2. Run the local audit (minutes 4-11)</w:t>
       </w:r>
     </w:p>
     <w:p>
@@ -1081,16 +1014,13 @@
         <w:t xml:space="preserve">operations-brief.md</w:t>
       </w:r>
       <w:r>
-        <w:t xml:space="preserve"> </w:t>
-      </w:r>
-      <w:r>
-        <w:t xml:space="preserve">to the</w:t>
-      </w:r>
-      <w:r>
-        <w:t xml:space="preserve"> </w:t>
-      </w:r>
-      <w:r>
-        <w:t xml:space="preserve">two CSV exports. Write one row per server to</w:t>
+        <w:t xml:space="preserve">. Write</w:t>
+      </w:r>
+      <w:r>
+        <w:t xml:space="preserve"> </w:t>
+      </w:r>
+      <w:r>
+        <w:t xml:space="preserve">one row per server to</w:t>
       </w:r>
       <w:r>
         <w:t xml:space="preserve"> </w:t>
@@ -1102,25 +1032,22 @@
         <w:t xml:space="preserve">server-health.csv</w:t>
       </w:r>
       <w:r>
-        <w:t xml:space="preserve">, including</w:t>
-      </w:r>
-      <w:r>
-        <w:t xml:space="preserve"> </w:t>
-      </w:r>
-      <w:r>
-        <w:t xml:space="preserve">hostname, role, environment, owner, risk level, failed-check count, and</w:t>
-      </w:r>
-      <w:r>
-        <w:t xml:space="preserve"> </w:t>
-      </w:r>
-      <w:r>
-        <w:t xml:space="preserve">findings. Keep the source files unchanged. Explain the script in five bullets,</w:t>
-      </w:r>
-      <w:r>
-        <w:t xml:space="preserve"> </w:t>
-      </w:r>
-      <w:r>
-        <w:t xml:space="preserve">then run it.</w:t>
+        <w:t xml:space="preserve"> </w:t>
+      </w:r>
+      <w:r>
+        <w:t xml:space="preserve">with hostname, role, environment,</w:t>
+      </w:r>
+      <w:r>
+        <w:t xml:space="preserve"> </w:t>
+      </w:r>
+      <w:r>
+        <w:t xml:space="preserve">owner, risk level, failed-check count, and findings. Keep source files</w:t>
+      </w:r>
+      <w:r>
+        <w:t xml:space="preserve"> </w:t>
+      </w:r>
+      <w:r>
+        <w:t xml:space="preserve">unchanged. Explain the script briefly, then run it.</w:t>
       </w:r>
     </w:p>
     <w:p>
@@ -1138,82 +1065,64 @@
         <w:t xml:space="preserve"> </w:t>
       </w:r>
       <w:r>
+        <w:t xml:space="preserve">the output contains ten servers and a mix of risk levels.</w:t>
+      </w:r>
+    </w:p>
+    <w:bookmarkEnd w:id="20"/>
+    <w:bookmarkStart w:id="21" w:name="prioritise-remediation-minutes-11-16"/>
+    <w:p>
+      <w:pPr>
+        <w:pStyle w:val="Heading2"/>
+      </w:pPr>
+      <w:r>
+        <w:t xml:space="preserve">3. Prioritise remediation (minutes 11-16)</w:t>
+      </w:r>
+    </w:p>
+    <w:p>
+      <w:pPr>
+        <w:pStyle w:val="BlockText"/>
+      </w:pPr>
+      <w:r>
+        <w:t xml:space="preserve">Create</w:t>
+      </w:r>
+      <w:r>
+        <w:t xml:space="preserve"> </w:t>
+      </w:r>
+      <w:r>
+        <w:rPr>
+          <w:rStyle w:val="VerbatimChar"/>
+        </w:rPr>
+        <w:t xml:space="preserve">remediation-plan.md</w:t>
+      </w:r>
+      <w:r>
+        <w:t xml:space="preserve"> </w:t>
+      </w:r>
+      <w:r>
+        <w:t xml:space="preserve">from</w:t>
+      </w:r>
+      <w:r>
+        <w:t xml:space="preserve"> </w:t>
+      </w:r>
+      <w:r>
         <w:rPr>
           <w:rStyle w:val="VerbatimChar"/>
         </w:rPr>
         <w:t xml:space="preserve">server-health.csv</w:t>
       </w:r>
       <w:r>
-        <w:t xml:space="preserve"> </w:t>
-      </w:r>
-      <w:r>
-        <w:t xml:space="preserve">contains ten servers and includes both</w:t>
-      </w:r>
-      <w:r>
-        <w:t xml:space="preserve"> </w:t>
-      </w:r>
-      <w:r>
-        <w:t xml:space="preserve">healthy and unhealthy results.</w:t>
-      </w:r>
-    </w:p>
-    <w:bookmarkEnd w:id="21"/>
-    <w:bookmarkStart w:id="22" w:name="Xa0c587441336e290cdf7d39dd297326185c2b7f"/>
-    <w:p>
-      <w:pPr>
-        <w:pStyle w:val="Heading2"/>
-      </w:pPr>
-      <w:r>
-        <w:t xml:space="preserve">3. Create the remediation plan (minutes 18-28)</w:t>
-      </w:r>
-    </w:p>
-    <w:p>
-      <w:pPr>
-        <w:pStyle w:val="BlockText"/>
-      </w:pPr>
-      <w:r>
-        <w:t xml:space="preserve">Using</w:t>
-      </w:r>
-      <w:r>
-        <w:t xml:space="preserve"> </w:t>
-      </w:r>
-      <w:r>
-        <w:rPr>
-          <w:rStyle w:val="VerbatimChar"/>
-        </w:rPr>
-        <w:t xml:space="preserve">server-health.csv</w:t>
-      </w:r>
-      <w:r>
-        <w:t xml:space="preserve">, create</w:t>
-      </w:r>
-      <w:r>
-        <w:t xml:space="preserve"> </w:t>
-      </w:r>
-      <w:r>
-        <w:rPr>
-          <w:rStyle w:val="VerbatimChar"/>
-        </w:rPr>
-        <w:t xml:space="preserve">remediation-plan.md</w:t>
-      </w:r>
-      <w:r>
-        <w:t xml:space="preserve">. Sort servers by risk</w:t>
-      </w:r>
-      <w:r>
-        <w:t xml:space="preserve"> </w:t>
-      </w:r>
-      <w:r>
-        <w:t xml:space="preserve">and hostname, explain the evidence for each finding, recommend the next action,</w:t>
-      </w:r>
-      <w:r>
-        <w:t xml:space="preserve"> </w:t>
-      </w:r>
-      <w:r>
-        <w:t xml:space="preserve">and include the owner and maintenance window. Do not claim that any action was</w:t>
-      </w:r>
-      <w:r>
-        <w:t xml:space="preserve"> </w:t>
-      </w:r>
-      <w:r>
-        <w:t xml:space="preserve">performed.</w:t>
+        <w:t xml:space="preserve">. Sort by risk and</w:t>
+      </w:r>
+      <w:r>
+        <w:t xml:space="preserve"> </w:t>
+      </w:r>
+      <w:r>
+        <w:t xml:space="preserve">hostname, show the evidence, recommend the next action, and include owner and</w:t>
+      </w:r>
+      <w:r>
+        <w:t xml:space="preserve"> </w:t>
+      </w:r>
+      <w:r>
+        <w:t xml:space="preserve">maintenance window. Do not claim any remediation was performed.</w:t>
       </w:r>
     </w:p>
     <w:p>
@@ -1231,17 +1140,17 @@
         <w:t xml:space="preserve"> </w:t>
       </w:r>
       <w:r>
-        <w:t xml:space="preserve">critical and high-risk servers appear before healthy servers.</w:t>
-      </w:r>
-    </w:p>
-    <w:bookmarkEnd w:id="22"/>
-    <w:bookmarkStart w:id="23" w:name="practise-troubleshooting-minutes-28-36"/>
+        <w:t xml:space="preserve">critical systems appear first and every recommendation cites evidence.</w:t>
+      </w:r>
+    </w:p>
+    <w:bookmarkEnd w:id="21"/>
+    <w:bookmarkStart w:id="22" w:name="troubleshoot-and-validate-minutes-16-21"/>
     <w:p>
       <w:pPr>
         <w:pStyle w:val="Heading2"/>
       </w:pPr>
       <w:r>
-        <w:t xml:space="preserve">4. Practise troubleshooting (minutes 28-36)</w:t>
+        <w:t xml:space="preserve">4. Troubleshoot and validate (minutes 16-21)</w:t>
       </w:r>
     </w:p>
     <w:p>
@@ -1261,13 +1170,7 @@
         <w:t xml:space="preserve">sample-error.txt</w:t>
       </w:r>
       <w:r>
-        <w:t xml:space="preserve">. Explain the failure in plain English, identify the</w:t>
-      </w:r>
-      <w:r>
-        <w:t xml:space="preserve"> </w:t>
-      </w:r>
-      <w:r>
-        <w:t xml:space="preserve">exact mismatch that caused it, and make only the smallest correction needed in</w:t>
+        <w:t xml:space="preserve">, explain the field-name failure, and confirm whether</w:t>
       </w:r>
       <w:r>
         <w:t xml:space="preserve"> </w:t>
@@ -1279,7 +1182,34 @@
         <w:t xml:space="preserve">audit_servers.py</w:t>
       </w:r>
       <w:r>
-        <w:t xml:space="preserve">. Then rerun the audit.</w:t>
+        <w:t xml:space="preserve"> </w:t>
+      </w:r>
+      <w:r>
+        <w:t xml:space="preserve">uses the correct source header. Make only the smallest fix</w:t>
+      </w:r>
+      <w:r>
+        <w:t xml:space="preserve"> </w:t>
+      </w:r>
+      <w:r>
+        <w:t xml:space="preserve">if needed. Then validate that every inventory server appears exactly once and</w:t>
+      </w:r>
+      <w:r>
+        <w:t xml:space="preserve"> </w:t>
+      </w:r>
+      <w:r>
+        <w:t xml:space="preserve">risk levels match failed-check counts. Save the evidence as</w:t>
+      </w:r>
+      <w:r>
+        <w:t xml:space="preserve"> </w:t>
+      </w:r>
+      <w:r>
+        <w:rPr>
+          <w:rStyle w:val="VerbatimChar"/>
+        </w:rPr>
+        <w:t xml:space="preserve">validation-report.md</w:t>
+      </w:r>
+      <w:r>
+        <w:t xml:space="preserve">.</w:t>
       </w:r>
     </w:p>
     <w:p>
@@ -1297,23 +1227,23 @@
         <w:t xml:space="preserve"> </w:t>
       </w:r>
       <w:r>
-        <w:t xml:space="preserve">Copilot changes the incorrect field name only; it does not rename</w:t>
-      </w:r>
-      <w:r>
-        <w:t xml:space="preserve"> </w:t>
-      </w:r>
-      <w:r>
-        <w:t xml:space="preserve">the source column or replace the whole script.</w:t>
-      </w:r>
-    </w:p>
-    <w:bookmarkEnd w:id="23"/>
-    <w:bookmarkStart w:id="24" w:name="validate-the-audit-minutes-36-44"/>
+        <w:t xml:space="preserve">the report gives row counts, duplicate count, missing-server</w:t>
+      </w:r>
+      <w:r>
+        <w:t xml:space="preserve"> </w:t>
+      </w:r>
+      <w:r>
+        <w:t xml:space="preserve">count, audit date, and any discrepancy.</w:t>
+      </w:r>
+    </w:p>
+    <w:bookmarkEnd w:id="22"/>
+    <w:bookmarkStart w:id="23" w:name="package-the-handoff-minutes-21-25"/>
     <w:p>
       <w:pPr>
         <w:pStyle w:val="Heading2"/>
       </w:pPr>
       <w:r>
-        <w:t xml:space="preserve">5. Validate the audit (minutes 36-44)</w:t>
+        <w:t xml:space="preserve">5. Package the handoff (minutes 21-25)</w:t>
       </w:r>
     </w:p>
     <w:p>
@@ -1321,19 +1251,46 @@
         <w:pStyle w:val="BlockText"/>
       </w:pPr>
       <w:r>
-        <w:t xml:space="preserve">Independently validate the audit output. Confirm every inventory server appears</w:t>
-      </w:r>
-      <w:r>
-        <w:t xml:space="preserve"> </w:t>
-      </w:r>
-      <w:r>
-        <w:t xml:space="preserve">exactly once, risk levels match the failed-check counts, findings match the</w:t>
-      </w:r>
-      <w:r>
-        <w:t xml:space="preserve"> </w:t>
-      </w:r>
-      <w:r>
-        <w:t xml:space="preserve">source values, and no source file changed. Save the evidence as</w:t>
+        <w:t xml:space="preserve">Create</w:t>
+      </w:r>
+      <w:r>
+        <w:t xml:space="preserve"> </w:t>
+      </w:r>
+      <w:r>
+        <w:rPr>
+          <w:rStyle w:val="VerbatimChar"/>
+        </w:rPr>
+        <w:t xml:space="preserve">sysadmin-handoff</w:t>
+      </w:r>
+      <w:r>
+        <w:t xml:space="preserve"> </w:t>
+      </w:r>
+      <w:r>
+        <w:t xml:space="preserve">containing</w:t>
+      </w:r>
+      <w:r>
+        <w:t xml:space="preserve"> </w:t>
+      </w:r>
+      <w:r>
+        <w:rPr>
+          <w:rStyle w:val="VerbatimChar"/>
+        </w:rPr>
+        <w:t xml:space="preserve">server-health.csv</w:t>
+      </w:r>
+      <w:r>
+        <w:t xml:space="preserve">,</w:t>
+      </w:r>
+      <w:r>
+        <w:t xml:space="preserve"> </w:t>
+      </w:r>
+      <w:r>
+        <w:rPr>
+          <w:rStyle w:val="VerbatimChar"/>
+        </w:rPr>
+        <w:t xml:space="preserve">remediation-plan.md</w:t>
+      </w:r>
+      <w:r>
+        <w:t xml:space="preserve">, and</w:t>
       </w:r>
       <w:r>
         <w:t xml:space="preserve"> </w:t>
@@ -1345,7 +1302,52 @@
         <w:t xml:space="preserve">validation-report.md</w:t>
       </w:r>
       <w:r>
-        <w:t xml:space="preserve">. Flag mismatches instead of hiding them.</w:t>
+        <w:t xml:space="preserve">. Add a</w:t>
+      </w:r>
+      <w:r>
+        <w:t xml:space="preserve"> </w:t>
+      </w:r>
+      <w:r>
+        <w:rPr>
+          <w:rStyle w:val="VerbatimChar"/>
+        </w:rPr>
+        <w:t xml:space="preserve">README.md</w:t>
+      </w:r>
+      <w:r>
+        <w:t xml:space="preserve"> </w:t>
+      </w:r>
+      <w:r>
+        <w:t xml:space="preserve">explaining</w:t>
+      </w:r>
+      <w:r>
+        <w:t xml:space="preserve"> </w:t>
+      </w:r>
+      <w:r>
+        <w:t xml:space="preserve">the files and how to rerun</w:t>
+      </w:r>
+      <w:r>
+        <w:t xml:space="preserve"> </w:t>
+      </w:r>
+      <w:r>
+        <w:rPr>
+          <w:rStyle w:val="VerbatimChar"/>
+        </w:rPr>
+        <w:t xml:space="preserve">audit_servers.py</w:t>
+      </w:r>
+      <w:r>
+        <w:t xml:space="preserve">, then create</w:t>
+      </w:r>
+      <w:r>
+        <w:t xml:space="preserve"> </w:t>
+      </w:r>
+      <w:r>
+        <w:rPr>
+          <w:rStyle w:val="VerbatimChar"/>
+        </w:rPr>
+        <w:t xml:space="preserve">sysadmin-handoff.zip</w:t>
+      </w:r>
+      <w:r>
+        <w:t xml:space="preserve">. Do not connect to servers or upload anything.</w:t>
       </w:r>
     </w:p>
     <w:p>
@@ -1357,167 +1359,29 @@
           <w:b/>
           <w:bCs/>
         </w:rPr>
-        <w:t xml:space="preserve">Checkpoint:</w:t>
-      </w:r>
-      <w:r>
-        <w:t xml:space="preserve"> </w:t>
-      </w:r>
-      <w:r>
-        <w:t xml:space="preserve">the report states the audit date, source and output row counts,</w:t>
-      </w:r>
-      <w:r>
-        <w:t xml:space="preserve"> </w:t>
-      </w:r>
-      <w:r>
-        <w:t xml:space="preserve">duplicate count, missing-server count, and any discrepancies.</w:t>
-      </w:r>
-    </w:p>
-    <w:bookmarkEnd w:id="24"/>
-    <w:bookmarkStart w:id="25" w:name="package-the-local-handoff-minutes-44-50"/>
+        <w:t xml:space="preserve">Final checkpoint:</w:t>
+      </w:r>
+      <w:r>
+        <w:t xml:space="preserve"> </w:t>
+      </w:r>
+      <w:r>
+        <w:t xml:space="preserve">the handoff contains exactly four files and the ZIP exists.</w:t>
+      </w:r>
+      <w:r>
+        <w:t xml:space="preserve"> </w:t>
+      </w:r>
+      <w:r>
+        <w:t xml:space="preserve">Stop here and move to the Data Engineer lab.</w:t>
+      </w:r>
+    </w:p>
+    <w:bookmarkEnd w:id="23"/>
+    <w:bookmarkStart w:id="24" w:name="safety"/>
     <w:p>
       <w:pPr>
         <w:pStyle w:val="Heading2"/>
       </w:pPr>
       <w:r>
-        <w:t xml:space="preserve">6. Package the local handoff (minutes 44-50)</w:t>
-      </w:r>
-    </w:p>
-    <w:p>
-      <w:pPr>
-        <w:pStyle w:val="BlockText"/>
-      </w:pPr>
-      <w:r>
-        <w:t xml:space="preserve">Create</w:t>
-      </w:r>
-      <w:r>
-        <w:t xml:space="preserve"> </w:t>
-      </w:r>
-      <w:r>
-        <w:rPr>
-          <w:rStyle w:val="VerbatimChar"/>
-        </w:rPr>
-        <w:t xml:space="preserve">sysadmin-handoff</w:t>
-      </w:r>
-      <w:r>
-        <w:t xml:space="preserve"> </w:t>
-      </w:r>
-      <w:r>
-        <w:t xml:space="preserve">containing copies of</w:t>
-      </w:r>
-      <w:r>
-        <w:t xml:space="preserve"> </w:t>
-      </w:r>
-      <w:r>
-        <w:rPr>
-          <w:rStyle w:val="VerbatimChar"/>
-        </w:rPr>
-        <w:t xml:space="preserve">server-health.csv</w:t>
-      </w:r>
-      <w:r>
-        <w:t xml:space="preserve">,</w:t>
-      </w:r>
-      <w:r>
-        <w:t xml:space="preserve"> </w:t>
-      </w:r>
-      <w:r>
-        <w:rPr>
-          <w:rStyle w:val="VerbatimChar"/>
-        </w:rPr>
-        <w:t xml:space="preserve">remediation-plan.md</w:t>
-      </w:r>
-      <w:r>
-        <w:t xml:space="preserve">, and</w:t>
-      </w:r>
-      <w:r>
-        <w:t xml:space="preserve"> </w:t>
-      </w:r>
-      <w:r>
-        <w:rPr>
-          <w:rStyle w:val="VerbatimChar"/>
-        </w:rPr>
-        <w:t xml:space="preserve">validation-report.md</w:t>
-      </w:r>
-      <w:r>
-        <w:t xml:space="preserve">. Add a</w:t>
-      </w:r>
-      <w:r>
-        <w:t xml:space="preserve"> </w:t>
-      </w:r>
-      <w:r>
-        <w:rPr>
-          <w:rStyle w:val="VerbatimChar"/>
-        </w:rPr>
-        <w:t xml:space="preserve">README.md</w:t>
-      </w:r>
-      <w:r>
-        <w:t xml:space="preserve"> </w:t>
-      </w:r>
-      <w:r>
-        <w:t xml:space="preserve">explaining</w:t>
-      </w:r>
-      <w:r>
-        <w:t xml:space="preserve"> </w:t>
-      </w:r>
-      <w:r>
-        <w:t xml:space="preserve">the files, the health rules, and how to rerun</w:t>
-      </w:r>
-      <w:r>
-        <w:t xml:space="preserve"> </w:t>
-      </w:r>
-      <w:r>
-        <w:rPr>
-          <w:rStyle w:val="VerbatimChar"/>
-        </w:rPr>
-        <w:t xml:space="preserve">audit_servers.py</w:t>
-      </w:r>
-      <w:r>
-        <w:t xml:space="preserve">. Create</w:t>
-      </w:r>
-      <w:r>
-        <w:t xml:space="preserve"> </w:t>
-      </w:r>
-      <w:r>
-        <w:rPr>
-          <w:rStyle w:val="VerbatimChar"/>
-        </w:rPr>
-        <w:t xml:space="preserve">sysadmin-handoff.zip</w:t>
-      </w:r>
-      <w:r>
-        <w:t xml:space="preserve">. Do not connect to servers or upload anything.</w:t>
-      </w:r>
-    </w:p>
-    <w:p>
-      <w:pPr>
-        <w:pStyle w:val="FirstParagraph"/>
-      </w:pPr>
-      <w:r>
-        <w:rPr>
-          <w:b/>
-          <w:bCs/>
-        </w:rPr>
-        <w:t xml:space="preserve">Final checkpoint:</w:t>
-      </w:r>
-      <w:r>
-        <w:t xml:space="preserve"> </w:t>
-      </w:r>
-      <w:r>
-        <w:t xml:space="preserve">the handoff folder contains exactly four files and the ZIP</w:t>
-      </w:r>
-      <w:r>
-        <w:t xml:space="preserve"> </w:t>
-      </w:r>
-      <w:r>
-        <w:t xml:space="preserve">exists. All work remains local.</w:t>
-      </w:r>
-    </w:p>
-    <w:bookmarkEnd w:id="25"/>
-    <w:bookmarkStart w:id="26" w:name="safety-rules"/>
-    <w:p>
-      <w:pPr>
-        <w:pStyle w:val="Heading2"/>
-      </w:pPr>
-      <w:r>
-        <w:t xml:space="preserve">Safety rules</w:t>
+        <w:t xml:space="preserve">Safety</w:t>
       </w:r>
     </w:p>
     <w:p>
@@ -1529,7 +1393,7 @@
         </w:numPr>
       </w:pPr>
       <w:r>
-        <w:t xml:space="preserve">Read every proposed action before approval.</w:t>
+        <w:t xml:space="preserve">Never modify source exports or claim a remediation was performed.</w:t>
       </w:r>
     </w:p>
     <w:p>
@@ -1541,7 +1405,7 @@
         </w:numPr>
       </w:pPr>
       <w:r>
-        <w:t xml:space="preserve">Never modify source exports or claim a remediation was performed.</w:t>
+        <w:t xml:space="preserve">Never use real credentials, secrets, or customer data.</w:t>
       </w:r>
     </w:p>
     <w:p>
@@ -1553,7 +1417,7 @@
         </w:numPr>
       </w:pPr>
       <w:r>
-        <w:t xml:space="preserve">Never use real credentials, secrets, or customer data.</w:t>
+        <w:t xml:space="preserve">Require evidence for every risk and recommendation.</w:t>
       </w:r>
     </w:p>
     <w:p>
@@ -1565,30 +1429,18 @@
         </w:numPr>
       </w:pPr>
       <w:r>
-        <w:t xml:space="preserve">Require evidence for every risk and recommendation.</w:t>
-      </w:r>
-    </w:p>
-    <w:p>
-      <w:pPr>
-        <w:pStyle w:val="Compact"/>
-        <w:numPr>
-          <w:ilvl w:val="0"/>
-          <w:numId w:val="1006"/>
-        </w:numPr>
-      </w:pPr>
-      <w:r>
-        <w:t xml:space="preserve">Keep all outputs local during the workshop.</w:t>
-      </w:r>
-    </w:p>
-    <w:bookmarkEnd w:id="26"/>
-    <w:bookmarkEnd w:id="27"/>
-    <w:bookmarkStart w:id="38" w:name="X5a74dd0ea8ed42067cebf65c9af6600d4d78aa8"/>
+        <w:t xml:space="preserve">Keep all outputs local.</w:t>
+      </w:r>
+    </w:p>
+    <w:bookmarkEnd w:id="24"/>
+    <w:bookmarkEnd w:id="25"/>
+    <w:bookmarkStart w:id="33" w:name="Xaa4ae3e28427c8416ced4530ac1de8a67be51dd"/>
     <w:p>
       <w:pPr>
         <w:pStyle w:val="Heading1"/>
       </w:pPr>
       <w:r>
-        <w:t xml:space="preserve">Shared follow-along lab - clean, analyse, and package data locally</w:t>
+        <w:t xml:space="preserve">Data Engineer lab - clean, analyse, and package data locally</w:t>
       </w:r>
     </w:p>
     <w:p>
@@ -1596,19 +1448,13 @@
         <w:pStyle w:val="FirstParagraph"/>
       </w:pPr>
       <w:r>
-        <w:t xml:space="preserve">The facilitator and every attendee complete these steps together. Wait for the</w:t>
-      </w:r>
-      <w:r>
-        <w:t xml:space="preserve"> </w:t>
-      </w:r>
-      <w:r>
-        <w:t xml:space="preserve">facilitator before moving to the next step. You do not need coding experience or</w:t>
-      </w:r>
-      <w:r>
-        <w:t xml:space="preserve"> </w:t>
-      </w:r>
-      <w:r>
-        <w:t xml:space="preserve">an Azure subscription.</w:t>
+        <w:t xml:space="preserve">Everyone follows the facilitator through this lab after the Systems Administrator</w:t>
+      </w:r>
+      <w:r>
+        <w:t xml:space="preserve"> </w:t>
+      </w:r>
+      <w:r>
+        <w:t xml:space="preserve">lab. No Azure subscription or coding experience is required.</w:t>
       </w:r>
     </w:p>
     <w:p>
@@ -1620,22 +1466,30 @@
           <w:b/>
           <w:bCs/>
         </w:rPr>
-        <w:t xml:space="preserve">Time:</w:t>
-      </w:r>
-      <w:r>
-        <w:t xml:space="preserve"> </w:t>
-      </w:r>
-      <w:r>
-        <w:t xml:space="preserve">50 minutes</w:t>
-      </w:r>
-    </w:p>
-    <w:bookmarkStart w:id="28" w:name="the-loop-2"/>
+        <w:t xml:space="preserve">Maximum time: 25 minutes. Stop after the final checkpoint.</w:t>
+      </w:r>
+    </w:p>
+    <w:p>
+      <w:pPr>
+        <w:pStyle w:val="BodyText"/>
+      </w:pPr>
+      <w:r>
+        <w:t xml:space="preserve">For every step: enter the same prompt as the facilitator, read the suggestion,</w:t>
+      </w:r>
+      <w:r>
+        <w:t xml:space="preserve"> </w:t>
+      </w:r>
+      <w:r>
+        <w:t xml:space="preserve">approve only understood actions, and verify the result. Keep source files unchanged.</w:t>
+      </w:r>
+    </w:p>
+    <w:bookmarkStart w:id="26" w:name="setup-1"/>
     <w:p>
       <w:pPr>
         <w:pStyle w:val="Heading2"/>
       </w:pPr>
       <w:r>
-        <w:t xml:space="preserve">The loop</w:t>
+        <w:t xml:space="preserve">Setup</w:t>
       </w:r>
     </w:p>
     <w:p>
@@ -1643,7 +1497,485 @@
         <w:pStyle w:val="FirstParagraph"/>
       </w:pPr>
       <w:r>
-        <w:t xml:space="preserve">For every step:</w:t>
+        <w:t xml:space="preserve">Open</w:t>
+      </w:r>
+      <w:r>
+        <w:t xml:space="preserve"> </w:t>
+      </w:r>
+      <w:r>
+        <w:rPr>
+          <w:rStyle w:val="VerbatimChar"/>
+        </w:rPr>
+        <w:t xml:space="preserve">labs/data-engineer</w:t>
+      </w:r>
+      <w:r>
+        <w:t xml:space="preserve">. Confirm Copilot can see</w:t>
+      </w:r>
+      <w:r>
+        <w:t xml:space="preserve"> </w:t>
+      </w:r>
+      <w:r>
+        <w:rPr>
+          <w:rStyle w:val="VerbatimChar"/>
+        </w:rPr>
+        <w:t xml:space="preserve">sales_january.csv</w:t>
+      </w:r>
+      <w:r>
+        <w:t xml:space="preserve">,</w:t>
+      </w:r>
+      <w:r>
+        <w:t xml:space="preserve"> </w:t>
+      </w:r>
+      <w:r>
+        <w:rPr>
+          <w:rStyle w:val="VerbatimChar"/>
+        </w:rPr>
+        <w:t xml:space="preserve">sales_february.csv</w:t>
+      </w:r>
+      <w:r>
+        <w:t xml:space="preserve">, and</w:t>
+      </w:r>
+      <w:r>
+        <w:t xml:space="preserve"> </w:t>
+      </w:r>
+      <w:r>
+        <w:rPr>
+          <w:rStyle w:val="VerbatimChar"/>
+        </w:rPr>
+        <w:t xml:space="preserve">product_prices.csv</w:t>
+      </w:r>
+      <w:r>
+        <w:t xml:space="preserve">.</w:t>
+      </w:r>
+    </w:p>
+    <w:bookmarkEnd w:id="26"/>
+    <w:bookmarkStart w:id="27" w:name="inspect-the-data-minutes-0-4"/>
+    <w:p>
+      <w:pPr>
+        <w:pStyle w:val="Heading2"/>
+      </w:pPr>
+      <w:r>
+        <w:t xml:space="preserve">1. Inspect the data (minutes 0-4)</w:t>
+      </w:r>
+    </w:p>
+    <w:p>
+      <w:pPr>
+        <w:pStyle w:val="BlockText"/>
+      </w:pPr>
+      <w:r>
+        <w:t xml:space="preserve">Read the three CSV files. Do not change anything. Summarise the inconsistencies</w:t>
+      </w:r>
+      <w:r>
+        <w:t xml:space="preserve"> </w:t>
+      </w:r>
+      <w:r>
+        <w:t xml:space="preserve">in column names, dates, money values, spaces, and capitalisation, then propose</w:t>
+      </w:r>
+      <w:r>
+        <w:t xml:space="preserve"> </w:t>
+      </w:r>
+      <w:r>
+        <w:t xml:space="preserve">a four-step cleaning plan.</w:t>
+      </w:r>
+    </w:p>
+    <w:p>
+      <w:pPr>
+        <w:pStyle w:val="FirstParagraph"/>
+      </w:pPr>
+      <w:r>
+        <w:rPr>
+          <w:b/>
+          <w:bCs/>
+        </w:rPr>
+        <w:t xml:space="preserve">Checkpoint:</w:t>
+      </w:r>
+      <w:r>
+        <w:t xml:space="preserve"> </w:t>
+      </w:r>
+      <w:r>
+        <w:t xml:space="preserve">both sales files and the product lookup are included in the plan.</w:t>
+      </w:r>
+    </w:p>
+    <w:bookmarkEnd w:id="27"/>
+    <w:bookmarkStart w:id="28" w:name="clean-and-combine-minutes-4-11"/>
+    <w:p>
+      <w:pPr>
+        <w:pStyle w:val="Heading2"/>
+      </w:pPr>
+      <w:r>
+        <w:t xml:space="preserve">2. Clean and combine (minutes 4-11)</w:t>
+      </w:r>
+    </w:p>
+    <w:p>
+      <w:pPr>
+        <w:pStyle w:val="BlockText"/>
+      </w:pPr>
+      <w:r>
+        <w:t xml:space="preserve">Create</w:t>
+      </w:r>
+      <w:r>
+        <w:t xml:space="preserve"> </w:t>
+      </w:r>
+      <w:r>
+        <w:rPr>
+          <w:rStyle w:val="VerbatimChar"/>
+        </w:rPr>
+        <w:t xml:space="preserve">clean_sales.py</w:t>
+      </w:r>
+      <w:r>
+        <w:t xml:space="preserve"> </w:t>
+      </w:r>
+      <w:r>
+        <w:t xml:space="preserve">to combine the January and February files, fix the</w:t>
+      </w:r>
+      <w:r>
+        <w:t xml:space="preserve"> </w:t>
+      </w:r>
+      <w:r>
+        <w:t xml:space="preserve">identified issues, join the product list, and write</w:t>
+      </w:r>
+      <w:r>
+        <w:t xml:space="preserve"> </w:t>
+      </w:r>
+      <w:r>
+        <w:rPr>
+          <w:rStyle w:val="VerbatimChar"/>
+        </w:rPr>
+        <w:t xml:space="preserve">sales_clean.csv</w:t>
+      </w:r>
+      <w:r>
+        <w:t xml:space="preserve">. Never</w:t>
+      </w:r>
+      <w:r>
+        <w:t xml:space="preserve"> </w:t>
+      </w:r>
+      <w:r>
+        <w:t xml:space="preserve">modify the source CSV files. Explain the script briefly, then run it.</w:t>
+      </w:r>
+    </w:p>
+    <w:p>
+      <w:pPr>
+        <w:pStyle w:val="FirstParagraph"/>
+      </w:pPr>
+      <w:r>
+        <w:rPr>
+          <w:b/>
+          <w:bCs/>
+        </w:rPr>
+        <w:t xml:space="preserve">Checkpoint:</w:t>
+      </w:r>
+      <w:r>
+        <w:t xml:space="preserve"> </w:t>
+      </w:r>
+      <w:r>
+        <w:rPr>
+          <w:rStyle w:val="VerbatimChar"/>
+        </w:rPr>
+        <w:t xml:space="preserve">sales_clean.csv</w:t>
+      </w:r>
+      <w:r>
+        <w:t xml:space="preserve"> </w:t>
+      </w:r>
+      <w:r>
+        <w:t xml:space="preserve">contains rows from both months.</w:t>
+      </w:r>
+    </w:p>
+    <w:bookmarkEnd w:id="28"/>
+    <w:bookmarkStart w:id="29" w:name="answer-business-questions-minutes-11-16"/>
+    <w:p>
+      <w:pPr>
+        <w:pStyle w:val="Heading2"/>
+      </w:pPr>
+      <w:r>
+        <w:t xml:space="preserve">3. Answer business questions (minutes 11-16)</w:t>
+      </w:r>
+    </w:p>
+    <w:p>
+      <w:pPr>
+        <w:pStyle w:val="BlockText"/>
+      </w:pPr>
+      <w:r>
+        <w:t xml:space="preserve">Using</w:t>
+      </w:r>
+      <w:r>
+        <w:t xml:space="preserve"> </w:t>
+      </w:r>
+      <w:r>
+        <w:rPr>
+          <w:rStyle w:val="VerbatimChar"/>
+        </w:rPr>
+        <w:t xml:space="preserve">sales_clean.csv</w:t>
+      </w:r>
+      <w:r>
+        <w:t xml:space="preserve">, calculate revenue by region and month, the top-selling</w:t>
+      </w:r>
+      <w:r>
+        <w:t xml:space="preserve"> </w:t>
+      </w:r>
+      <w:r>
+        <w:t xml:space="preserve">product by revenue, and the five largest discounts from list price. Run the</w:t>
+      </w:r>
+      <w:r>
+        <w:t xml:space="preserve"> </w:t>
+      </w:r>
+      <w:r>
+        <w:t xml:space="preserve">analysis and save actual results as clear tables in</w:t>
+      </w:r>
+      <w:r>
+        <w:t xml:space="preserve"> </w:t>
+      </w:r>
+      <w:r>
+        <w:rPr>
+          <w:rStyle w:val="VerbatimChar"/>
+        </w:rPr>
+        <w:t xml:space="preserve">analysis.md</w:t>
+      </w:r>
+      <w:r>
+        <w:t xml:space="preserve">.</w:t>
+      </w:r>
+    </w:p>
+    <w:p>
+      <w:pPr>
+        <w:pStyle w:val="FirstParagraph"/>
+      </w:pPr>
+      <w:r>
+        <w:rPr>
+          <w:b/>
+          <w:bCs/>
+        </w:rPr>
+        <w:t xml:space="preserve">Checkpoint:</w:t>
+      </w:r>
+      <w:r>
+        <w:t xml:space="preserve"> </w:t>
+      </w:r>
+      <w:r>
+        <w:t xml:space="preserve">the document contains calculated results, not only code or instructions.</w:t>
+      </w:r>
+    </w:p>
+    <w:bookmarkEnd w:id="29"/>
+    <w:bookmarkStart w:id="30" w:name="validate-and-summarise-minutes-16-21"/>
+    <w:p>
+      <w:pPr>
+        <w:pStyle w:val="Heading2"/>
+      </w:pPr>
+      <w:r>
+        <w:t xml:space="preserve">4. Validate and summarise (minutes 16-21)</w:t>
+      </w:r>
+    </w:p>
+    <w:p>
+      <w:pPr>
+        <w:pStyle w:val="BlockText"/>
+      </w:pPr>
+      <w:r>
+        <w:t xml:space="preserve">Validate source and cleaned row counts, date range, total units, total revenue,</w:t>
+      </w:r>
+      <w:r>
+        <w:t xml:space="preserve"> </w:t>
+      </w:r>
+      <w:r>
+        <w:t xml:space="preserve">duplicates, and missing values. Save the evidence as</w:t>
+      </w:r>
+      <w:r>
+        <w:t xml:space="preserve"> </w:t>
+      </w:r>
+      <w:r>
+        <w:rPr>
+          <w:rStyle w:val="VerbatimChar"/>
+        </w:rPr>
+        <w:t xml:space="preserve">data-quality-report.md</w:t>
+      </w:r>
+      <w:r>
+        <w:t xml:space="preserve">.</w:t>
+      </w:r>
+      <w:r>
+        <w:t xml:space="preserve"> </w:t>
+      </w:r>
+      <w:r>
+        <w:t xml:space="preserve">Add three evidence-based findings and one limitation to the top of</w:t>
+      </w:r>
+      <w:r>
+        <w:t xml:space="preserve"> </w:t>
+      </w:r>
+      <w:r>
+        <w:rPr>
+          <w:rStyle w:val="VerbatimChar"/>
+        </w:rPr>
+        <w:t xml:space="preserve">analysis.md</w:t>
+      </w:r>
+      <w:r>
+        <w:t xml:space="preserve">. Flag mismatches instead of guessing.</w:t>
+      </w:r>
+    </w:p>
+    <w:p>
+      <w:pPr>
+        <w:pStyle w:val="FirstParagraph"/>
+      </w:pPr>
+      <w:r>
+        <w:rPr>
+          <w:b/>
+          <w:bCs/>
+        </w:rPr>
+        <w:t xml:space="preserve">Checkpoint:</w:t>
+      </w:r>
+      <w:r>
+        <w:t xml:space="preserve"> </w:t>
+      </w:r>
+      <w:r>
+        <w:t xml:space="preserve">every management claim is supported by a calculation in the files.</w:t>
+      </w:r>
+    </w:p>
+    <w:bookmarkEnd w:id="30"/>
+    <w:bookmarkStart w:id="31" w:name="package-the-handoff-minutes-21-25-1"/>
+    <w:p>
+      <w:pPr>
+        <w:pStyle w:val="Heading2"/>
+      </w:pPr>
+      <w:r>
+        <w:t xml:space="preserve">5. Package the handoff (minutes 21-25)</w:t>
+      </w:r>
+    </w:p>
+    <w:p>
+      <w:pPr>
+        <w:pStyle w:val="BlockText"/>
+      </w:pPr>
+      <w:r>
+        <w:t xml:space="preserve">Create</w:t>
+      </w:r>
+      <w:r>
+        <w:t xml:space="preserve"> </w:t>
+      </w:r>
+      <w:r>
+        <w:rPr>
+          <w:rStyle w:val="VerbatimChar"/>
+        </w:rPr>
+        <w:t xml:space="preserve">data-handoff</w:t>
+      </w:r>
+      <w:r>
+        <w:t xml:space="preserve"> </w:t>
+      </w:r>
+      <w:r>
+        <w:t xml:space="preserve">containing</w:t>
+      </w:r>
+      <w:r>
+        <w:t xml:space="preserve"> </w:t>
+      </w:r>
+      <w:r>
+        <w:rPr>
+          <w:rStyle w:val="VerbatimChar"/>
+        </w:rPr>
+        <w:t xml:space="preserve">sales_clean.csv</w:t>
+      </w:r>
+      <w:r>
+        <w:t xml:space="preserve">,</w:t>
+      </w:r>
+      <w:r>
+        <w:t xml:space="preserve"> </w:t>
+      </w:r>
+      <w:r>
+        <w:rPr>
+          <w:rStyle w:val="VerbatimChar"/>
+        </w:rPr>
+        <w:t xml:space="preserve">analysis.md</w:t>
+      </w:r>
+      <w:r>
+        <w:t xml:space="preserve">, and</w:t>
+      </w:r>
+      <w:r>
+        <w:t xml:space="preserve"> </w:t>
+      </w:r>
+      <w:r>
+        <w:rPr>
+          <w:rStyle w:val="VerbatimChar"/>
+        </w:rPr>
+        <w:t xml:space="preserve">data-quality-report.md</w:t>
+      </w:r>
+      <w:r>
+        <w:t xml:space="preserve">. Add a</w:t>
+      </w:r>
+      <w:r>
+        <w:t xml:space="preserve"> </w:t>
+      </w:r>
+      <w:r>
+        <w:rPr>
+          <w:rStyle w:val="VerbatimChar"/>
+        </w:rPr>
+        <w:t xml:space="preserve">README.md</w:t>
+      </w:r>
+      <w:r>
+        <w:t xml:space="preserve"> </w:t>
+      </w:r>
+      <w:r>
+        <w:t xml:space="preserve">explaining the files and how to</w:t>
+      </w:r>
+      <w:r>
+        <w:t xml:space="preserve"> </w:t>
+      </w:r>
+      <w:r>
+        <w:t xml:space="preserve">rerun</w:t>
+      </w:r>
+      <w:r>
+        <w:t xml:space="preserve"> </w:t>
+      </w:r>
+      <w:r>
+        <w:rPr>
+          <w:rStyle w:val="VerbatimChar"/>
+        </w:rPr>
+        <w:t xml:space="preserve">clean_sales.py</w:t>
+      </w:r>
+      <w:r>
+        <w:t xml:space="preserve">, then create</w:t>
+      </w:r>
+      <w:r>
+        <w:t xml:space="preserve"> </w:t>
+      </w:r>
+      <w:r>
+        <w:rPr>
+          <w:rStyle w:val="VerbatimChar"/>
+        </w:rPr>
+        <w:t xml:space="preserve">data-handoff.zip</w:t>
+      </w:r>
+      <w:r>
+        <w:t xml:space="preserve">. Do not upload or send</w:t>
+      </w:r>
+      <w:r>
+        <w:t xml:space="preserve"> </w:t>
+      </w:r>
+      <w:r>
+        <w:t xml:space="preserve">anything.</w:t>
+      </w:r>
+    </w:p>
+    <w:p>
+      <w:pPr>
+        <w:pStyle w:val="FirstParagraph"/>
+      </w:pPr>
+      <w:r>
+        <w:rPr>
+          <w:b/>
+          <w:bCs/>
+        </w:rPr>
+        <w:t xml:space="preserve">Final checkpoint:</w:t>
+      </w:r>
+      <w:r>
+        <w:t xml:space="preserve"> </w:t>
+      </w:r>
+      <w:r>
+        <w:t xml:space="preserve">the handoff contains exactly four files and the ZIP exists.</w:t>
+      </w:r>
+      <w:r>
+        <w:t xml:space="preserve"> </w:t>
+      </w:r>
+      <w:r>
+        <w:t xml:space="preserve">Stop here; the hands-on session is complete.</w:t>
+      </w:r>
+    </w:p>
+    <w:bookmarkEnd w:id="31"/>
+    <w:bookmarkStart w:id="32" w:name="safety-1"/>
+    <w:p>
+      <w:pPr>
+        <w:pStyle w:val="Heading2"/>
+      </w:pPr>
+      <w:r>
+        <w:t xml:space="preserve">Safety</w:t>
       </w:r>
     </w:p>
     <w:p>
@@ -1655,17 +1987,7 @@
         </w:numPr>
       </w:pPr>
       <w:r>
-        <w:rPr>
-          <w:b/>
-          <w:bCs/>
-        </w:rPr>
-        <w:t xml:space="preserve">Prompt:</w:t>
-      </w:r>
-      <w:r>
-        <w:t xml:space="preserve"> </w:t>
-      </w:r>
-      <w:r>
-        <w:t xml:space="preserve">enter the facilitator’s quoted prompt in Copilot.</w:t>
+        <w:t xml:space="preserve">Keep the source CSV files unchanged.</w:t>
       </w:r>
     </w:p>
     <w:p>
@@ -1677,17 +1999,7 @@
         </w:numPr>
       </w:pPr>
       <w:r>
-        <w:rPr>
-          <w:b/>
-          <w:bCs/>
-        </w:rPr>
-        <w:t xml:space="preserve">Suggestion:</w:t>
-      </w:r>
-      <w:r>
-        <w:t xml:space="preserve"> </w:t>
-      </w:r>
-      <w:r>
-        <w:t xml:space="preserve">read what Copilot proposes.</w:t>
+        <w:t xml:space="preserve">Never paste secrets, real customer data, or confidential information into Copilot.</w:t>
       </w:r>
     </w:p>
     <w:p>
@@ -1699,17 +2011,7 @@
         </w:numPr>
       </w:pPr>
       <w:r>
-        <w:rPr>
-          <w:b/>
-          <w:bCs/>
-        </w:rPr>
-        <w:t xml:space="preserve">Run:</w:t>
-      </w:r>
-      <w:r>
-        <w:t xml:space="preserve"> </w:t>
-      </w:r>
-      <w:r>
-        <w:t xml:space="preserve">approve only the actions you understand.</w:t>
+        <w:t xml:space="preserve">Require evidence for totals and claims.</w:t>
       </w:r>
     </w:p>
     <w:p>
@@ -1721,814 +2023,11 @@
         </w:numPr>
       </w:pPr>
       <w:r>
-        <w:rPr>
-          <w:b/>
-          <w:bCs/>
-        </w:rPr>
-        <w:t xml:space="preserve">Refine:</w:t>
-      </w:r>
-      <w:r>
-        <w:t xml:space="preserve"> </w:t>
-      </w:r>
-      <w:r>
-        <w:t xml:space="preserve">ask for one change at a time.</w:t>
-      </w:r>
-    </w:p>
-    <w:p>
-      <w:pPr>
-        <w:pStyle w:val="Compact"/>
-        <w:numPr>
-          <w:ilvl w:val="0"/>
-          <w:numId w:val="1007"/>
-        </w:numPr>
-      </w:pPr>
-      <w:r>
-        <w:rPr>
-          <w:b/>
-          <w:bCs/>
-        </w:rPr>
-        <w:t xml:space="preserve">Sanity-check:</w:t>
-      </w:r>
-      <w:r>
-        <w:t xml:space="preserve"> </w:t>
-      </w:r>
-      <w:r>
-        <w:t xml:space="preserve">verify the files and numbers.</w:t>
-      </w:r>
-    </w:p>
-    <w:p>
-      <w:pPr>
-        <w:pStyle w:val="FirstParagraph"/>
-      </w:pPr>
-      <w:r>
-        <w:t xml:space="preserve">All work stays in this folder. The original CSV files must remain unchanged.</w:t>
-      </w:r>
-    </w:p>
-    <w:bookmarkEnd w:id="28"/>
-    <w:bookmarkStart w:id="29" w:name="before-the-timer-starts-1"/>
-    <w:p>
-      <w:pPr>
-        <w:pStyle w:val="Heading2"/>
-      </w:pPr>
-      <w:r>
-        <w:t xml:space="preserve">Before the timer starts</w:t>
-      </w:r>
-    </w:p>
-    <w:p>
-      <w:pPr>
-        <w:pStyle w:val="Compact"/>
-        <w:numPr>
-          <w:ilvl w:val="0"/>
-          <w:numId w:val="1008"/>
-        </w:numPr>
-      </w:pPr>
-      <w:r>
-        <w:t xml:space="preserve">Open this repository in GitHub Codespaces or the GitHub Copilot app.</w:t>
-      </w:r>
-    </w:p>
-    <w:p>
-      <w:pPr>
-        <w:pStyle w:val="Compact"/>
-        <w:numPr>
-          <w:ilvl w:val="0"/>
-          <w:numId w:val="1008"/>
-        </w:numPr>
-      </w:pPr>
-      <w:r>
-        <w:t xml:space="preserve">Open</w:t>
-      </w:r>
-      <w:r>
-        <w:t xml:space="preserve"> </w:t>
-      </w:r>
-      <w:r>
-        <w:rPr>
-          <w:rStyle w:val="VerbatimChar"/>
-        </w:rPr>
-        <w:t xml:space="preserve">labs/data-engineer</w:t>
-      </w:r>
-      <w:r>
-        <w:t xml:space="preserve"> </w:t>
-      </w:r>
-      <w:r>
-        <w:t xml:space="preserve">as your working folder.</w:t>
-      </w:r>
-    </w:p>
-    <w:p>
-      <w:pPr>
-        <w:pStyle w:val="Compact"/>
-        <w:numPr>
-          <w:ilvl w:val="0"/>
-          <w:numId w:val="1008"/>
-        </w:numPr>
-      </w:pPr>
-      <w:r>
-        <w:t xml:space="preserve">Start Copilot and confirm it can see</w:t>
-      </w:r>
-      <w:r>
-        <w:t xml:space="preserve"> </w:t>
-      </w:r>
-      <w:r>
-        <w:rPr>
-          <w:rStyle w:val="VerbatimChar"/>
-        </w:rPr>
-        <w:t xml:space="preserve">sales_january.csv</w:t>
-      </w:r>
-      <w:r>
-        <w:t xml:space="preserve">,</w:t>
-      </w:r>
-      <w:r>
-        <w:t xml:space="preserve"> </w:t>
-      </w:r>
-      <w:r>
-        <w:rPr>
-          <w:rStyle w:val="VerbatimChar"/>
-        </w:rPr>
-        <w:t xml:space="preserve">sales_february.csv</w:t>
-      </w:r>
-      <w:r>
-        <w:t xml:space="preserve">, and</w:t>
-      </w:r>
-      <w:r>
-        <w:t xml:space="preserve"> </w:t>
-      </w:r>
-      <w:r>
-        <w:rPr>
-          <w:rStyle w:val="VerbatimChar"/>
-        </w:rPr>
-        <w:t xml:space="preserve">product_prices.csv</w:t>
-      </w:r>
-      <w:r>
-        <w:t xml:space="preserve">.</w:t>
-      </w:r>
-    </w:p>
-    <w:p>
-      <w:pPr>
-        <w:pStyle w:val="Compact"/>
-        <w:numPr>
-          <w:ilvl w:val="0"/>
-          <w:numId w:val="1008"/>
-        </w:numPr>
-      </w:pPr>
-      <w:r>
-        <w:t xml:space="preserve">Do not create files yet. Wait for the facilitator.</w:t>
-      </w:r>
-    </w:p>
-    <w:bookmarkEnd w:id="29"/>
-    <w:bookmarkStart w:id="30" w:name="inspect-the-source-files-minutes-0-7"/>
-    <w:p>
-      <w:pPr>
-        <w:pStyle w:val="Heading2"/>
-      </w:pPr>
-      <w:r>
-        <w:t xml:space="preserve">1. Inspect the source files (minutes 0-7)</w:t>
-      </w:r>
-    </w:p>
-    <w:p>
-      <w:pPr>
-        <w:pStyle w:val="FirstParagraph"/>
-      </w:pPr>
-      <w:r>
-        <w:t xml:space="preserve">Enter this prompt exactly as the facilitator does:</w:t>
-      </w:r>
-    </w:p>
-    <w:p>
-      <w:pPr>
-        <w:pStyle w:val="BlockText"/>
-      </w:pPr>
-      <w:r>
-        <w:t xml:space="preserve">Read the three CSV files in this folder. Do not change anything yet. In plain</w:t>
-      </w:r>
-      <w:r>
-        <w:t xml:space="preserve"> </w:t>
-      </w:r>
-      <w:r>
-        <w:t xml:space="preserve">English, list the inconsistencies that must be fixed before the sales files can</w:t>
-      </w:r>
-      <w:r>
-        <w:t xml:space="preserve"> </w:t>
-      </w:r>
-      <w:r>
-        <w:t xml:space="preserve">be combined, including column names, date formats, money values, spaces, and</w:t>
-      </w:r>
-      <w:r>
-        <w:t xml:space="preserve"> </w:t>
-      </w:r>
-      <w:r>
-        <w:t xml:space="preserve">capitalisation. Then propose a short plan.</w:t>
-      </w:r>
-    </w:p>
-    <w:p>
-      <w:pPr>
-        <w:pStyle w:val="FirstParagraph"/>
-      </w:pPr>
-      <w:r>
-        <w:t xml:space="preserve">Compare Copilot’s list with the facilitator’s. Ask about any difference before</w:t>
-      </w:r>
-      <w:r>
-        <w:t xml:space="preserve"> </w:t>
-      </w:r>
-      <w:r>
-        <w:t xml:space="preserve">continuing.</w:t>
-      </w:r>
-    </w:p>
-    <w:bookmarkEnd w:id="30"/>
-    <w:bookmarkStart w:id="31" w:name="clean-and-combine-the-data-minutes-7-17"/>
-    <w:p>
-      <w:pPr>
-        <w:pStyle w:val="Heading2"/>
-      </w:pPr>
-      <w:r>
-        <w:t xml:space="preserve">2. Clean and combine the data (minutes 7-17)</w:t>
-      </w:r>
-    </w:p>
-    <w:p>
-      <w:pPr>
-        <w:pStyle w:val="BlockText"/>
-      </w:pPr>
-      <w:r>
-        <w:t xml:space="preserve">Create a Python script named</w:t>
-      </w:r>
-      <w:r>
-        <w:t xml:space="preserve"> </w:t>
-      </w:r>
-      <w:r>
-        <w:rPr>
-          <w:rStyle w:val="VerbatimChar"/>
-        </w:rPr>
-        <w:t xml:space="preserve">clean_sales.py</w:t>
-      </w:r>
-      <w:r>
-        <w:t xml:space="preserve"> </w:t>
-      </w:r>
-      <w:r>
-        <w:t xml:space="preserve">that combines the January and</w:t>
-      </w:r>
-      <w:r>
-        <w:t xml:space="preserve"> </w:t>
-      </w:r>
-      <w:r>
-        <w:t xml:space="preserve">February sales files, fixes every issue in the plan, joins the product list,</w:t>
-      </w:r>
-      <w:r>
-        <w:t xml:space="preserve"> </w:t>
-      </w:r>
-      <w:r>
-        <w:t xml:space="preserve">and writes a new file named</w:t>
-      </w:r>
-      <w:r>
-        <w:t xml:space="preserve"> </w:t>
-      </w:r>
-      <w:r>
-        <w:rPr>
-          <w:rStyle w:val="VerbatimChar"/>
-        </w:rPr>
-        <w:t xml:space="preserve">sales_clean.csv</w:t>
-      </w:r>
-      <w:r>
-        <w:t xml:space="preserve">. Never modify the three source</w:t>
-      </w:r>
-      <w:r>
-        <w:t xml:space="preserve"> </w:t>
-      </w:r>
-      <w:r>
-        <w:t xml:space="preserve">CSV files. Explain the script in five bullets, then run it.</w:t>
-      </w:r>
-    </w:p>
-    <w:p>
-      <w:pPr>
-        <w:pStyle w:val="FirstParagraph"/>
-      </w:pPr>
-      <w:r>
-        <w:t xml:space="preserve">Read the explanation and approve the file creation and run. Open</w:t>
-      </w:r>
-      <w:r>
-        <w:t xml:space="preserve"> </w:t>
-      </w:r>
-      <w:r>
-        <w:rPr>
-          <w:rStyle w:val="VerbatimChar"/>
-        </w:rPr>
-        <w:t xml:space="preserve">sales_clean.csv</w:t>
-      </w:r>
-      <w:r>
-        <w:t xml:space="preserve"> </w:t>
-      </w:r>
-      <w:r>
-        <w:t xml:space="preserve">and confirm that it contains rows from both months.</w:t>
-      </w:r>
-    </w:p>
-    <w:p>
-      <w:pPr>
-        <w:pStyle w:val="BodyText"/>
-      </w:pPr>
-      <w:r>
-        <w:t xml:space="preserve">If the action fails, use the same recovery prompt as the facilitator:</w:t>
-      </w:r>
-    </w:p>
-    <w:p>
-      <w:pPr>
-        <w:pStyle w:val="BlockText"/>
-      </w:pPr>
-      <w:r>
-        <w:t xml:space="preserve">Explain the error in plain English. Make only the smallest necessary fix, then</w:t>
-      </w:r>
-      <w:r>
-        <w:t xml:space="preserve"> </w:t>
-      </w:r>
-      <w:r>
-        <w:t xml:space="preserve">run the script again.</w:t>
-      </w:r>
-    </w:p>
-    <w:bookmarkEnd w:id="31"/>
-    <w:bookmarkStart w:id="32" w:name="answer-business-questions-minutes-17-27"/>
-    <w:p>
-      <w:pPr>
-        <w:pStyle w:val="Heading2"/>
-      </w:pPr>
-      <w:r>
-        <w:t xml:space="preserve">3. Answer business questions (minutes 17-27)</w:t>
-      </w:r>
-    </w:p>
-    <w:p>
-      <w:pPr>
-        <w:pStyle w:val="BlockText"/>
-      </w:pPr>
-      <w:r>
-        <w:t xml:space="preserve">Using</w:t>
-      </w:r>
-      <w:r>
-        <w:t xml:space="preserve"> </w:t>
-      </w:r>
-      <w:r>
-        <w:rPr>
-          <w:rStyle w:val="VerbatimChar"/>
-        </w:rPr>
-        <w:t xml:space="preserve">sales_clean.csv</w:t>
-      </w:r>
-      <w:r>
-        <w:t xml:space="preserve">, calculate total revenue by region and by month, the</w:t>
-      </w:r>
-      <w:r>
-        <w:t xml:space="preserve"> </w:t>
-      </w:r>
-      <w:r>
-        <w:t xml:space="preserve">top-selling product by revenue, and the five largest discounts from list</w:t>
-      </w:r>
-      <w:r>
-        <w:t xml:space="preserve"> </w:t>
-      </w:r>
-      <w:r>
-        <w:t xml:space="preserve">price. Run the analysis and save the results as</w:t>
-      </w:r>
-      <w:r>
-        <w:t xml:space="preserve"> </w:t>
-      </w:r>
-      <w:r>
-        <w:rPr>
-          <w:rStyle w:val="VerbatimChar"/>
-        </w:rPr>
-        <w:t xml:space="preserve">analysis.md</w:t>
-      </w:r>
-      <w:r>
-        <w:t xml:space="preserve"> </w:t>
-      </w:r>
-      <w:r>
-        <w:t xml:space="preserve">with clear tables.</w:t>
-      </w:r>
-    </w:p>
-    <w:p>
-      <w:pPr>
-        <w:pStyle w:val="FirstParagraph"/>
-      </w:pPr>
-      <w:r>
-        <w:t xml:space="preserve">Do not accept an answer that only describes code. Copilot must run the analysis</w:t>
-      </w:r>
-      <w:r>
-        <w:t xml:space="preserve"> </w:t>
-      </w:r>
-      <w:r>
-        <w:t xml:space="preserve">and write the actual results.</w:t>
+        <w:t xml:space="preserve">Keep all outputs local.</w:t>
       </w:r>
     </w:p>
     <w:bookmarkEnd w:id="32"/>
-    <w:bookmarkStart w:id="33" w:name="validate-the-result-minutes-27-37"/>
-    <w:p>
-      <w:pPr>
-        <w:pStyle w:val="Heading2"/>
-      </w:pPr>
-      <w:r>
-        <w:t xml:space="preserve">4. Validate the result (minutes 27-37)</w:t>
-      </w:r>
-    </w:p>
-    <w:p>
-      <w:pPr>
-        <w:pStyle w:val="BlockText"/>
-      </w:pPr>
-      <w:r>
-        <w:t xml:space="preserve">Validate the cleaned data. Report the source row count, cleaned row count,</w:t>
-      </w:r>
-      <w:r>
-        <w:t xml:space="preserve"> </w:t>
-      </w:r>
-      <w:r>
-        <w:t xml:space="preserve">date range, total units, total revenue, duplicate count, missing-value count,</w:t>
-      </w:r>
-      <w:r>
-        <w:t xml:space="preserve"> </w:t>
-      </w:r>
-      <w:r>
-        <w:t xml:space="preserve">and three sample rows. Recalculate totals independently from the cleaned CSV.</w:t>
-      </w:r>
-      <w:r>
-        <w:t xml:space="preserve"> </w:t>
-      </w:r>
-      <w:r>
-        <w:t xml:space="preserve">Save the evidence as</w:t>
-      </w:r>
-      <w:r>
-        <w:t xml:space="preserve"> </w:t>
-      </w:r>
-      <w:r>
-        <w:rPr>
-          <w:rStyle w:val="VerbatimChar"/>
-        </w:rPr>
-        <w:t xml:space="preserve">data-quality-report.md</w:t>
-      </w:r>
-      <w:r>
-        <w:t xml:space="preserve">. Flag any mismatch instead of</w:t>
-      </w:r>
-      <w:r>
-        <w:t xml:space="preserve"> </w:t>
-      </w:r>
-      <w:r>
-        <w:t xml:space="preserve">hiding or guessing it.</w:t>
-      </w:r>
-    </w:p>
-    <w:p>
-      <w:pPr>
-        <w:pStyle w:val="FirstParagraph"/>
-      </w:pPr>
-      <w:r>
-        <w:t xml:space="preserve">Compare the row counts and totals with the facilitator. If yours differ, stop</w:t>
-      </w:r>
-      <w:r>
-        <w:t xml:space="preserve"> </w:t>
-      </w:r>
-      <w:r>
-        <w:t xml:space="preserve">and ask Copilot to identify the first differing row or assumption.</w:t>
-      </w:r>
-    </w:p>
     <w:bookmarkEnd w:id="33"/>
-    <w:bookmarkStart w:id="34" w:name="improve-the-handoff-minutes-37-44"/>
-    <w:p>
-      <w:pPr>
-        <w:pStyle w:val="Heading2"/>
-      </w:pPr>
-      <w:r>
-        <w:t xml:space="preserve">5. Improve the handoff (minutes 37-44)</w:t>
-      </w:r>
-    </w:p>
-    <w:p>
-      <w:pPr>
-        <w:pStyle w:val="BlockText"/>
-      </w:pPr>
-      <w:r>
-        <w:t xml:space="preserve">Review</w:t>
-      </w:r>
-      <w:r>
-        <w:t xml:space="preserve"> </w:t>
-      </w:r>
-      <w:r>
-        <w:rPr>
-          <w:rStyle w:val="VerbatimChar"/>
-        </w:rPr>
-        <w:t xml:space="preserve">analysis.md</w:t>
-      </w:r>
-      <w:r>
-        <w:t xml:space="preserve"> </w:t>
-      </w:r>
-      <w:r>
-        <w:t xml:space="preserve">and</w:t>
-      </w:r>
-      <w:r>
-        <w:t xml:space="preserve"> </w:t>
-      </w:r>
-      <w:r>
-        <w:rPr>
-          <w:rStyle w:val="VerbatimChar"/>
-        </w:rPr>
-        <w:t xml:space="preserve">data-quality-report.md</w:t>
-      </w:r>
-      <w:r>
-        <w:t xml:space="preserve"> </w:t>
-      </w:r>
-      <w:r>
-        <w:t xml:space="preserve">for a non-technical manager.</w:t>
-      </w:r>
-      <w:r>
-        <w:t xml:space="preserve"> </w:t>
-      </w:r>
-      <w:r>
-        <w:t xml:space="preserve">Add a short executive summary to</w:t>
-      </w:r>
-      <w:r>
-        <w:t xml:space="preserve"> </w:t>
-      </w:r>
-      <w:r>
-        <w:rPr>
-          <w:rStyle w:val="VerbatimChar"/>
-        </w:rPr>
-        <w:t xml:space="preserve">analysis.md</w:t>
-      </w:r>
-      <w:r>
-        <w:t xml:space="preserve"> </w:t>
-      </w:r>
-      <w:r>
-        <w:t xml:space="preserve">with three findings and one</w:t>
-      </w:r>
-      <w:r>
-        <w:t xml:space="preserve"> </w:t>
-      </w:r>
-      <w:r>
-        <w:t xml:space="preserve">limitation. Use only facts calculated from the files; do not invent figures.</w:t>
-      </w:r>
-    </w:p>
-    <w:p>
-      <w:pPr>
-        <w:pStyle w:val="FirstParagraph"/>
-      </w:pPr>
-      <w:r>
-        <w:t xml:space="preserve">Read the summary. Ask Copilot which file and calculation supports each claim.</w:t>
-      </w:r>
-    </w:p>
-    <w:bookmarkEnd w:id="34"/>
-    <w:bookmarkStart w:id="35" w:name="X4650c6ac28e93f5420f9f349bec8fb8ce430ac0"/>
-    <w:p>
-      <w:pPr>
-        <w:pStyle w:val="Heading2"/>
-      </w:pPr>
-      <w:r>
-        <w:t xml:space="preserve">6. Create and inspect the local package (minutes 44-50)</w:t>
-      </w:r>
-    </w:p>
-    <w:p>
-      <w:pPr>
-        <w:pStyle w:val="BlockText"/>
-      </w:pPr>
-      <w:r>
-        <w:t xml:space="preserve">Create a local folder named</w:t>
-      </w:r>
-      <w:r>
-        <w:t xml:space="preserve"> </w:t>
-      </w:r>
-      <w:r>
-        <w:rPr>
-          <w:rStyle w:val="VerbatimChar"/>
-        </w:rPr>
-        <w:t xml:space="preserve">handoff</w:t>
-      </w:r>
-      <w:r>
-        <w:t xml:space="preserve"> </w:t>
-      </w:r>
-      <w:r>
-        <w:t xml:space="preserve">containing copies of</w:t>
-      </w:r>
-      <w:r>
-        <w:t xml:space="preserve"> </w:t>
-      </w:r>
-      <w:r>
-        <w:rPr>
-          <w:rStyle w:val="VerbatimChar"/>
-        </w:rPr>
-        <w:t xml:space="preserve">sales_clean.csv</w:t>
-      </w:r>
-      <w:r>
-        <w:t xml:space="preserve">,</w:t>
-      </w:r>
-      <w:r>
-        <w:t xml:space="preserve"> </w:t>
-      </w:r>
-      <w:r>
-        <w:rPr>
-          <w:rStyle w:val="VerbatimChar"/>
-        </w:rPr>
-        <w:t xml:space="preserve">analysis.md</w:t>
-      </w:r>
-      <w:r>
-        <w:t xml:space="preserve">, and</w:t>
-      </w:r>
-      <w:r>
-        <w:t xml:space="preserve"> </w:t>
-      </w:r>
-      <w:r>
-        <w:rPr>
-          <w:rStyle w:val="VerbatimChar"/>
-        </w:rPr>
-        <w:t xml:space="preserve">data-quality-report.md</w:t>
-      </w:r>
-      <w:r>
-        <w:t xml:space="preserve">. Add a</w:t>
-      </w:r>
-      <w:r>
-        <w:t xml:space="preserve"> </w:t>
-      </w:r>
-      <w:r>
-        <w:rPr>
-          <w:rStyle w:val="VerbatimChar"/>
-        </w:rPr>
-        <w:t xml:space="preserve">README.md</w:t>
-      </w:r>
-      <w:r>
-        <w:t xml:space="preserve"> </w:t>
-      </w:r>
-      <w:r>
-        <w:t xml:space="preserve">that explains</w:t>
-      </w:r>
-      <w:r>
-        <w:t xml:space="preserve"> </w:t>
-      </w:r>
-      <w:r>
-        <w:t xml:space="preserve">what each file contains and how to rerun</w:t>
-      </w:r>
-      <w:r>
-        <w:t xml:space="preserve"> </w:t>
-      </w:r>
-      <w:r>
-        <w:rPr>
-          <w:rStyle w:val="VerbatimChar"/>
-        </w:rPr>
-        <w:t xml:space="preserve">clean_sales.py</w:t>
-      </w:r>
-      <w:r>
-        <w:t xml:space="preserve">. Create</w:t>
-      </w:r>
-      <w:r>
-        <w:t xml:space="preserve"> </w:t>
-      </w:r>
-      <w:r>
-        <w:rPr>
-          <w:rStyle w:val="VerbatimChar"/>
-        </w:rPr>
-        <w:t xml:space="preserve">sales-handoff.zip</w:t>
-      </w:r>
-      <w:r>
-        <w:t xml:space="preserve"> </w:t>
-      </w:r>
-      <w:r>
-        <w:t xml:space="preserve">from that folder. Do not upload or send anything.</w:t>
-      </w:r>
-    </w:p>
-    <w:p>
-      <w:pPr>
-        <w:pStyle w:val="FirstParagraph"/>
-      </w:pPr>
-      <w:r>
-        <w:t xml:space="preserve">Open the</w:t>
-      </w:r>
-      <w:r>
-        <w:t xml:space="preserve"> </w:t>
-      </w:r>
-      <w:r>
-        <w:rPr>
-          <w:rStyle w:val="VerbatimChar"/>
-        </w:rPr>
-        <w:t xml:space="preserve">handoff</w:t>
-      </w:r>
-      <w:r>
-        <w:t xml:space="preserve"> </w:t>
-      </w:r>
-      <w:r>
-        <w:t xml:space="preserve">folder and confirm it contains exactly four files. The ZIP is</w:t>
-      </w:r>
-      <w:r>
-        <w:t xml:space="preserve"> </w:t>
-      </w:r>
-      <w:r>
-        <w:t xml:space="preserve">the finished local deliverable; there is no cloud upload or teardown.</w:t>
-      </w:r>
-    </w:p>
-    <w:bookmarkEnd w:id="35"/>
-    <w:bookmarkStart w:id="36" w:name="safety-rules-1"/>
-    <w:p>
-      <w:pPr>
-        <w:pStyle w:val="Heading2"/>
-      </w:pPr>
-      <w:r>
-        <w:t xml:space="preserve">Safety rules</w:t>
-      </w:r>
-    </w:p>
-    <w:p>
-      <w:pPr>
-        <w:pStyle w:val="Compact"/>
-        <w:numPr>
-          <w:ilvl w:val="0"/>
-          <w:numId w:val="1009"/>
-        </w:numPr>
-      </w:pPr>
-      <w:r>
-        <w:t xml:space="preserve">Read every proposed action before approving it.</w:t>
-      </w:r>
-    </w:p>
-    <w:p>
-      <w:pPr>
-        <w:pStyle w:val="Compact"/>
-        <w:numPr>
-          <w:ilvl w:val="0"/>
-          <w:numId w:val="1009"/>
-        </w:numPr>
-      </w:pPr>
-      <w:r>
-        <w:t xml:space="preserve">Keep the three source CSV files unchanged.</w:t>
-      </w:r>
-    </w:p>
-    <w:p>
-      <w:pPr>
-        <w:pStyle w:val="Compact"/>
-        <w:numPr>
-          <w:ilvl w:val="0"/>
-          <w:numId w:val="1009"/>
-        </w:numPr>
-      </w:pPr>
-      <w:r>
-        <w:t xml:space="preserve">Use only the fictitious workshop data. Never paste secrets or real customer</w:t>
-      </w:r>
-      <w:r>
-        <w:t xml:space="preserve"> </w:t>
-      </w:r>
-      <w:r>
-        <w:t xml:space="preserve">information into Copilot.</w:t>
-      </w:r>
-    </w:p>
-    <w:p>
-      <w:pPr>
-        <w:pStyle w:val="Compact"/>
-        <w:numPr>
-          <w:ilvl w:val="0"/>
-          <w:numId w:val="1009"/>
-        </w:numPr>
-      </w:pPr>
-      <w:r>
-        <w:t xml:space="preserve">Require evidence for totals and claims. Copilot drafts; you decide.</w:t>
-      </w:r>
-    </w:p>
-    <w:p>
-      <w:pPr>
-        <w:pStyle w:val="Compact"/>
-        <w:numPr>
-          <w:ilvl w:val="0"/>
-          <w:numId w:val="1009"/>
-        </w:numPr>
-      </w:pPr>
-      <w:r>
-        <w:t xml:space="preserve">Keep all outputs local during the workshop.</w:t>
-      </w:r>
-    </w:p>
-    <w:bookmarkEnd w:id="36"/>
-    <w:bookmarkStart w:id="37" w:name="if-the-group-finishes-early"/>
-    <w:p>
-      <w:pPr>
-        <w:pStyle w:val="Heading2"/>
-      </w:pPr>
-      <w:r>
-        <w:t xml:space="preserve">If the group finishes early</w:t>
-      </w:r>
-    </w:p>
-    <w:p>
-      <w:pPr>
-        <w:pStyle w:val="FirstParagraph"/>
-      </w:pPr>
-      <w:r>
-        <w:t xml:space="preserve">Use one prompt together:</w:t>
-      </w:r>
-    </w:p>
-    <w:p>
-      <w:pPr>
-        <w:pStyle w:val="BlockText"/>
-      </w:pPr>
-      <w:r>
-        <w:t xml:space="preserve">Create a bar chart of monthly revenue as</w:t>
-      </w:r>
-      <w:r>
-        <w:t xml:space="preserve"> </w:t>
-      </w:r>
-      <w:r>
-        <w:rPr>
-          <w:rStyle w:val="VerbatimChar"/>
-        </w:rPr>
-        <w:t xml:space="preserve">monthly-revenue.png</w:t>
-      </w:r>
-      <w:r>
-        <w:t xml:space="preserve">, add it to the</w:t>
-      </w:r>
-      <w:r>
-        <w:t xml:space="preserve"> </w:t>
-      </w:r>
-      <w:r>
-        <w:t xml:space="preserve">handoff folder, update the handoff README, and rebuild the ZIP.</w:t>
-      </w:r>
-    </w:p>
-    <w:bookmarkEnd w:id="37"/>
-    <w:bookmarkEnd w:id="38"/>
     <w:sectPr>
       <w:footnotePr>
         <w:numRestart w:val="eachSect"/>
@@ -2930,66 +2429,6 @@
     <w:abstractNumId w:val="991"/>
   </w:num>
   <w:num w:numId="1007">
-    <w:abstractNumId w:val="99411"/>
-    <w:lvlOverride w:ilvl="0">
-      <w:startOverride w:val="1"/>
-    </w:lvlOverride>
-    <w:lvlOverride w:ilvl="1">
-      <w:startOverride w:val="1"/>
-    </w:lvlOverride>
-    <w:lvlOverride w:ilvl="2">
-      <w:startOverride w:val="1"/>
-    </w:lvlOverride>
-    <w:lvlOverride w:ilvl="3">
-      <w:startOverride w:val="1"/>
-    </w:lvlOverride>
-    <w:lvlOverride w:ilvl="4">
-      <w:startOverride w:val="1"/>
-    </w:lvlOverride>
-    <w:lvlOverride w:ilvl="5">
-      <w:startOverride w:val="1"/>
-    </w:lvlOverride>
-    <w:lvlOverride w:ilvl="6">
-      <w:startOverride w:val="1"/>
-    </w:lvlOverride>
-    <w:lvlOverride w:ilvl="7">
-      <w:startOverride w:val="1"/>
-    </w:lvlOverride>
-    <w:lvlOverride w:ilvl="8">
-      <w:startOverride w:val="1"/>
-    </w:lvlOverride>
-  </w:num>
-  <w:num w:numId="1008">
-    <w:abstractNumId w:val="99411"/>
-    <w:lvlOverride w:ilvl="0">
-      <w:startOverride w:val="1"/>
-    </w:lvlOverride>
-    <w:lvlOverride w:ilvl="1">
-      <w:startOverride w:val="1"/>
-    </w:lvlOverride>
-    <w:lvlOverride w:ilvl="2">
-      <w:startOverride w:val="1"/>
-    </w:lvlOverride>
-    <w:lvlOverride w:ilvl="3">
-      <w:startOverride w:val="1"/>
-    </w:lvlOverride>
-    <w:lvlOverride w:ilvl="4">
-      <w:startOverride w:val="1"/>
-    </w:lvlOverride>
-    <w:lvlOverride w:ilvl="5">
-      <w:startOverride w:val="1"/>
-    </w:lvlOverride>
-    <w:lvlOverride w:ilvl="6">
-      <w:startOverride w:val="1"/>
-    </w:lvlOverride>
-    <w:lvlOverride w:ilvl="7">
-      <w:startOverride w:val="1"/>
-    </w:lvlOverride>
-    <w:lvlOverride w:ilvl="8">
-      <w:startOverride w:val="1"/>
-    </w:lvlOverride>
-  </w:num>
-  <w:num w:numId="1009">
     <w:abstractNumId w:val="991"/>
   </w:num>
 </w:numbering>

</xml_diff>